<commit_message>
Completar segundo avance del backend y evidencias
</commit_message>
<xml_diff>
--- a/evidencias/Evidencias.docx
+++ b/evidencias/Evidencias.docx
@@ -429,23 +429,7 @@
             <w:b/>
             <w:bCs/>
           </w:rPr>
-          <w:t>https://github.com/Jose-e-garci</w:t>
-        </w:r>
-        <w:r>
-          <w:rPr>
-            <w:rStyle w:val="Hipervnculo"/>
-            <w:b/>
-            <w:bCs/>
-          </w:rPr>
-          <w:t>a</w:t>
-        </w:r>
-        <w:r>
-          <w:rPr>
-            <w:rStyle w:val="Hipervnculo"/>
-            <w:b/>
-            <w:bCs/>
-          </w:rPr>
-          <w:t>/control-estacionamiento</w:t>
+          <w:t>https://github.com/Jose-e-garcia/control-estacionamiento</w:t>
         </w:r>
       </w:hyperlink>
     </w:p>
@@ -964,6 +948,654 @@
           <w:bCs/>
           <w:sz w:val="24"/>
           <w:szCs w:val="24"/>
+          <w:lang w:val="en-US"/>
+        </w:rPr>
+      </w:pPr>
+    </w:p>
+    <w:p>
+      <w:pPr>
+        <w:jc w:val="both"/>
+        <w:rPr>
+          <w:rFonts w:ascii="Arial" w:hAnsi="Arial" w:cs="Arial"/>
+          <w:b/>
+          <w:bCs/>
+          <w:sz w:val="24"/>
+          <w:szCs w:val="24"/>
+          <w:lang w:val="en-US"/>
+        </w:rPr>
+      </w:pPr>
+    </w:p>
+    <w:p>
+      <w:pPr>
+        <w:jc w:val="both"/>
+        <w:rPr>
+          <w:rFonts w:ascii="Arial" w:hAnsi="Arial" w:cs="Arial"/>
+          <w:b/>
+          <w:bCs/>
+          <w:sz w:val="24"/>
+          <w:szCs w:val="24"/>
+          <w:lang w:val="en-US"/>
+        </w:rPr>
+      </w:pPr>
+    </w:p>
+    <w:p>
+      <w:pPr>
+        <w:jc w:val="both"/>
+        <w:rPr>
+          <w:rFonts w:ascii="Arial" w:hAnsi="Arial" w:cs="Arial"/>
+          <w:b/>
+          <w:bCs/>
+          <w:sz w:val="24"/>
+          <w:szCs w:val="24"/>
+          <w:lang w:val="en-US"/>
+        </w:rPr>
+      </w:pPr>
+    </w:p>
+    <w:p>
+      <w:pPr>
+        <w:jc w:val="both"/>
+        <w:rPr>
+          <w:rFonts w:ascii="Arial" w:hAnsi="Arial" w:cs="Arial"/>
+          <w:b/>
+          <w:bCs/>
+          <w:sz w:val="24"/>
+          <w:szCs w:val="24"/>
+          <w:lang w:val="en-US"/>
+        </w:rPr>
+      </w:pPr>
+    </w:p>
+    <w:p>
+      <w:pPr>
+        <w:jc w:val="both"/>
+        <w:rPr>
+          <w:rFonts w:ascii="Arial" w:hAnsi="Arial" w:cs="Arial"/>
+          <w:b/>
+          <w:bCs/>
+          <w:sz w:val="24"/>
+          <w:szCs w:val="24"/>
+          <w:lang w:val="en-US"/>
+        </w:rPr>
+      </w:pPr>
+    </w:p>
+    <w:p>
+      <w:pPr>
+        <w:jc w:val="both"/>
+        <w:rPr>
+          <w:rFonts w:ascii="Arial" w:hAnsi="Arial" w:cs="Arial"/>
+          <w:b/>
+          <w:bCs/>
+          <w:sz w:val="24"/>
+          <w:szCs w:val="24"/>
+          <w:lang w:val="en-US"/>
+        </w:rPr>
+      </w:pPr>
+    </w:p>
+    <w:p>
+      <w:pPr>
+        <w:jc w:val="both"/>
+        <w:rPr>
+          <w:rFonts w:ascii="Arial" w:hAnsi="Arial" w:cs="Arial"/>
+          <w:b/>
+          <w:bCs/>
+          <w:sz w:val="24"/>
+          <w:szCs w:val="24"/>
+          <w:lang w:val="en-US"/>
+        </w:rPr>
+      </w:pPr>
+    </w:p>
+    <w:p>
+      <w:pPr>
+        <w:jc w:val="both"/>
+        <w:rPr>
+          <w:rFonts w:ascii="Arial" w:hAnsi="Arial" w:cs="Arial"/>
+          <w:b/>
+          <w:bCs/>
+          <w:sz w:val="24"/>
+          <w:szCs w:val="24"/>
+          <w:lang w:val="en-US"/>
+        </w:rPr>
+      </w:pPr>
+      <w:r>
+        <w:rPr>
+          <w:rFonts w:ascii="Arial" w:hAnsi="Arial" w:cs="Arial"/>
+          <w:b/>
+          <w:bCs/>
+          <w:sz w:val="24"/>
+          <w:szCs w:val="24"/>
+          <w:lang w:val="en-US"/>
+        </w:rPr>
+        <w:lastRenderedPageBreak/>
+        <w:t xml:space="preserve">Segundo avance </w:t>
+      </w:r>
+      <w:r>
+        <w:rPr>
+          <w:rFonts w:ascii="Arial" w:hAnsi="Arial" w:cs="Arial"/>
+          <w:b/>
+          <w:bCs/>
+          <w:sz w:val="24"/>
+          <w:szCs w:val="24"/>
+          <w:lang w:val="en-US"/>
+        </w:rPr>
+        <w:t xml:space="preserve">25 a </w:t>
+      </w:r>
+      <w:r>
+        <w:rPr>
+          <w:rFonts w:ascii="Arial" w:hAnsi="Arial" w:cs="Arial"/>
+          <w:b/>
+          <w:bCs/>
+          <w:sz w:val="24"/>
+          <w:szCs w:val="24"/>
+          <w:lang w:val="en-US"/>
+        </w:rPr>
+        <w:t>3</w:t>
+      </w:r>
+      <w:r>
+        <w:rPr>
+          <w:rFonts w:ascii="Arial" w:hAnsi="Arial" w:cs="Arial"/>
+          <w:b/>
+          <w:bCs/>
+          <w:sz w:val="24"/>
+          <w:szCs w:val="24"/>
+          <w:lang w:val="en-US"/>
+        </w:rPr>
+        <w:t>1</w:t>
+      </w:r>
+      <w:r>
+        <w:rPr>
+          <w:rFonts w:ascii="Arial" w:hAnsi="Arial" w:cs="Arial"/>
+          <w:b/>
+          <w:bCs/>
+          <w:sz w:val="24"/>
+          <w:szCs w:val="24"/>
+          <w:lang w:val="en-US"/>
+        </w:rPr>
+        <w:t>-10-2026</w:t>
+      </w:r>
+    </w:p>
+    <w:p>
+      <w:pPr>
+        <w:spacing w:after="0" w:line="240" w:lineRule="auto"/>
+        <w:jc w:val="both"/>
+        <w:rPr>
+          <w:rFonts w:ascii="Arial" w:hAnsi="Arial" w:cs="Arial"/>
+          <w:b/>
+          <w:bCs/>
+          <w:sz w:val="24"/>
+          <w:szCs w:val="24"/>
+        </w:rPr>
+      </w:pPr>
+      <w:r>
+        <w:rPr>
+          <w:rFonts w:ascii="Arial" w:hAnsi="Arial" w:cs="Arial"/>
+          <w:b/>
+          <w:bCs/>
+          <w:sz w:val="24"/>
+          <w:szCs w:val="24"/>
+        </w:rPr>
+        <w:t>Organización del backend por capas</w:t>
+      </w:r>
+    </w:p>
+    <w:p>
+      <w:pPr>
+        <w:spacing w:after="0" w:line="240" w:lineRule="auto"/>
+        <w:jc w:val="both"/>
+        <w:rPr>
+          <w:rFonts w:ascii="Arial" w:hAnsi="Arial" w:cs="Arial"/>
+          <w:sz w:val="24"/>
+          <w:szCs w:val="24"/>
+        </w:rPr>
+      </w:pPr>
+    </w:p>
+    <w:p>
+      <w:pPr>
+        <w:spacing w:after="0" w:line="240" w:lineRule="auto"/>
+        <w:jc w:val="both"/>
+        <w:rPr>
+          <w:rFonts w:ascii="Arial" w:hAnsi="Arial" w:cs="Arial"/>
+          <w:sz w:val="24"/>
+          <w:szCs w:val="24"/>
+        </w:rPr>
+      </w:pPr>
+      <w:r>
+        <w:rPr>
+          <w:rFonts w:ascii="Arial" w:hAnsi="Arial" w:cs="Arial"/>
+          <w:sz w:val="24"/>
+          <w:szCs w:val="24"/>
+        </w:rPr>
+        <w:t>Durante el segundo avance se organizó el backend del sistema de control de estacionamiento mediante una arquitectura por capas, con el propósito de separar las responsabilidades y facilitar el mantenimiento del proyecto.</w:t>
+      </w:r>
+    </w:p>
+    <w:p>
+      <w:pPr>
+        <w:spacing w:after="0" w:line="240" w:lineRule="auto"/>
+        <w:jc w:val="both"/>
+        <w:rPr>
+          <w:rFonts w:ascii="Arial" w:hAnsi="Arial" w:cs="Arial"/>
+          <w:sz w:val="24"/>
+          <w:szCs w:val="24"/>
+        </w:rPr>
+      </w:pPr>
+    </w:p>
+    <w:p>
+      <w:pPr>
+        <w:spacing w:after="0" w:line="240" w:lineRule="auto"/>
+        <w:jc w:val="both"/>
+        <w:rPr>
+          <w:rFonts w:ascii="Arial" w:hAnsi="Arial" w:cs="Arial"/>
+          <w:sz w:val="24"/>
+          <w:szCs w:val="24"/>
+        </w:rPr>
+      </w:pPr>
+      <w:r>
+        <w:rPr>
+          <w:rFonts w:ascii="Arial" w:hAnsi="Arial" w:cs="Arial"/>
+          <w:sz w:val="24"/>
+          <w:szCs w:val="24"/>
+        </w:rPr>
+        <w:t>La estructura está compuesta por los siguientes paquetes:</w:t>
+      </w:r>
+    </w:p>
+    <w:p>
+      <w:pPr>
+        <w:spacing w:after="0" w:line="240" w:lineRule="auto"/>
+        <w:jc w:val="both"/>
+        <w:rPr>
+          <w:rFonts w:ascii="Arial" w:hAnsi="Arial" w:cs="Arial"/>
+          <w:sz w:val="24"/>
+          <w:szCs w:val="24"/>
+        </w:rPr>
+      </w:pPr>
+    </w:p>
+    <w:p>
+      <w:pPr>
+        <w:pStyle w:val="Prrafodelista"/>
+        <w:numPr>
+          <w:ilvl w:val="0"/>
+          <w:numId w:val="2"/>
+        </w:numPr>
+        <w:spacing w:after="0" w:line="240" w:lineRule="auto"/>
+        <w:jc w:val="both"/>
+        <w:rPr>
+          <w:rFonts w:ascii="Arial" w:hAnsi="Arial" w:cs="Arial"/>
+          <w:sz w:val="24"/>
+          <w:szCs w:val="24"/>
+        </w:rPr>
+      </w:pPr>
+      <w:r>
+        <w:rPr>
+          <w:rFonts w:ascii="Arial" w:hAnsi="Arial" w:cs="Arial"/>
+          <w:b/>
+          <w:bCs/>
+          <w:sz w:val="24"/>
+          <w:szCs w:val="24"/>
+        </w:rPr>
+        <w:t>controller</w:t>
+      </w:r>
+      <w:r>
+        <w:rPr>
+          <w:rFonts w:ascii="Arial" w:hAnsi="Arial" w:cs="Arial"/>
+          <w:sz w:val="24"/>
+          <w:szCs w:val="24"/>
+        </w:rPr>
+        <w:t>: recibe y procesa las solicitudes HTTP realizadas al sistema.</w:t>
+      </w:r>
+    </w:p>
+    <w:p>
+      <w:pPr>
+        <w:spacing w:after="0" w:line="240" w:lineRule="auto"/>
+        <w:jc w:val="both"/>
+        <w:rPr>
+          <w:rFonts w:ascii="Arial" w:hAnsi="Arial" w:cs="Arial"/>
+          <w:sz w:val="24"/>
+          <w:szCs w:val="24"/>
+        </w:rPr>
+      </w:pPr>
+    </w:p>
+    <w:p>
+      <w:pPr>
+        <w:pStyle w:val="Prrafodelista"/>
+        <w:numPr>
+          <w:ilvl w:val="0"/>
+          <w:numId w:val="2"/>
+        </w:numPr>
+        <w:spacing w:after="0" w:line="240" w:lineRule="auto"/>
+        <w:jc w:val="both"/>
+        <w:rPr>
+          <w:rFonts w:ascii="Arial" w:hAnsi="Arial" w:cs="Arial"/>
+          <w:sz w:val="24"/>
+          <w:szCs w:val="24"/>
+        </w:rPr>
+      </w:pPr>
+      <w:r>
+        <w:rPr>
+          <w:rFonts w:ascii="Arial" w:hAnsi="Arial" w:cs="Arial"/>
+          <w:b/>
+          <w:bCs/>
+          <w:sz w:val="24"/>
+          <w:szCs w:val="24"/>
+        </w:rPr>
+        <w:t>service</w:t>
+      </w:r>
+      <w:r>
+        <w:rPr>
+          <w:rFonts w:ascii="Arial" w:hAnsi="Arial" w:cs="Arial"/>
+          <w:sz w:val="24"/>
+          <w:szCs w:val="24"/>
+        </w:rPr>
+        <w:t>: contiene la lógica de negocio y las operaciones principales.</w:t>
+      </w:r>
+    </w:p>
+    <w:p>
+      <w:pPr>
+        <w:spacing w:after="0" w:line="240" w:lineRule="auto"/>
+        <w:jc w:val="both"/>
+        <w:rPr>
+          <w:rFonts w:ascii="Arial" w:hAnsi="Arial" w:cs="Arial"/>
+          <w:sz w:val="24"/>
+          <w:szCs w:val="24"/>
+        </w:rPr>
+      </w:pPr>
+    </w:p>
+    <w:p>
+      <w:pPr>
+        <w:pStyle w:val="Prrafodelista"/>
+        <w:numPr>
+          <w:ilvl w:val="0"/>
+          <w:numId w:val="2"/>
+        </w:numPr>
+        <w:spacing w:after="0" w:line="240" w:lineRule="auto"/>
+        <w:jc w:val="both"/>
+        <w:rPr>
+          <w:rFonts w:ascii="Arial" w:hAnsi="Arial" w:cs="Arial"/>
+          <w:sz w:val="24"/>
+          <w:szCs w:val="24"/>
+        </w:rPr>
+      </w:pPr>
+      <w:r>
+        <w:rPr>
+          <w:rFonts w:ascii="Arial" w:hAnsi="Arial" w:cs="Arial"/>
+          <w:b/>
+          <w:bCs/>
+          <w:sz w:val="24"/>
+          <w:szCs w:val="24"/>
+        </w:rPr>
+        <w:t>repository</w:t>
+      </w:r>
+      <w:r>
+        <w:rPr>
+          <w:rFonts w:ascii="Arial" w:hAnsi="Arial" w:cs="Arial"/>
+          <w:sz w:val="24"/>
+          <w:szCs w:val="24"/>
+        </w:rPr>
+        <w:t>: permite realizar las operaciones de acceso a la base de datos PostgreSQL mediante Spring Data JPA.</w:t>
+      </w:r>
+    </w:p>
+    <w:p>
+      <w:pPr>
+        <w:spacing w:after="0" w:line="240" w:lineRule="auto"/>
+        <w:jc w:val="both"/>
+        <w:rPr>
+          <w:rFonts w:ascii="Arial" w:hAnsi="Arial" w:cs="Arial"/>
+          <w:sz w:val="24"/>
+          <w:szCs w:val="24"/>
+        </w:rPr>
+      </w:pPr>
+    </w:p>
+    <w:p>
+      <w:pPr>
+        <w:pStyle w:val="Prrafodelista"/>
+        <w:numPr>
+          <w:ilvl w:val="0"/>
+          <w:numId w:val="2"/>
+        </w:numPr>
+        <w:spacing w:after="0" w:line="240" w:lineRule="auto"/>
+        <w:jc w:val="both"/>
+        <w:rPr>
+          <w:rFonts w:ascii="Arial" w:hAnsi="Arial" w:cs="Arial"/>
+          <w:sz w:val="24"/>
+          <w:szCs w:val="24"/>
+        </w:rPr>
+      </w:pPr>
+      <w:r>
+        <w:rPr>
+          <w:rFonts w:ascii="Arial" w:hAnsi="Arial" w:cs="Arial"/>
+          <w:b/>
+          <w:bCs/>
+          <w:sz w:val="24"/>
+          <w:szCs w:val="24"/>
+        </w:rPr>
+        <w:t>entity</w:t>
+      </w:r>
+      <w:r>
+        <w:rPr>
+          <w:rFonts w:ascii="Arial" w:hAnsi="Arial" w:cs="Arial"/>
+          <w:sz w:val="24"/>
+          <w:szCs w:val="24"/>
+        </w:rPr>
+        <w:t>: contiene las entidades Espacio y Ticket, que representan las tablas de la base de datos.</w:t>
+      </w:r>
+    </w:p>
+    <w:p>
+      <w:pPr>
+        <w:spacing w:after="0" w:line="240" w:lineRule="auto"/>
+        <w:jc w:val="both"/>
+        <w:rPr>
+          <w:rFonts w:ascii="Arial" w:hAnsi="Arial" w:cs="Arial"/>
+          <w:sz w:val="24"/>
+          <w:szCs w:val="24"/>
+        </w:rPr>
+      </w:pPr>
+    </w:p>
+    <w:p>
+      <w:pPr>
+        <w:pStyle w:val="Prrafodelista"/>
+        <w:numPr>
+          <w:ilvl w:val="0"/>
+          <w:numId w:val="2"/>
+        </w:numPr>
+        <w:spacing w:after="0" w:line="240" w:lineRule="auto"/>
+        <w:jc w:val="both"/>
+        <w:rPr>
+          <w:rFonts w:ascii="Arial" w:hAnsi="Arial" w:cs="Arial"/>
+          <w:sz w:val="24"/>
+          <w:szCs w:val="24"/>
+        </w:rPr>
+      </w:pPr>
+      <w:r>
+        <w:rPr>
+          <w:rFonts w:ascii="Arial" w:hAnsi="Arial" w:cs="Arial"/>
+          <w:b/>
+          <w:bCs/>
+          <w:sz w:val="24"/>
+          <w:szCs w:val="24"/>
+        </w:rPr>
+        <w:t>dto</w:t>
+      </w:r>
+      <w:r>
+        <w:rPr>
+          <w:rFonts w:ascii="Arial" w:hAnsi="Arial" w:cs="Arial"/>
+          <w:sz w:val="24"/>
+          <w:szCs w:val="24"/>
+        </w:rPr>
+        <w:t>: contiene los objetos utilizados para recibir y validar los datos enviados en las solicitudes.</w:t>
+      </w:r>
+    </w:p>
+    <w:p>
+      <w:pPr>
+        <w:spacing w:after="0" w:line="240" w:lineRule="auto"/>
+        <w:jc w:val="both"/>
+        <w:rPr>
+          <w:rFonts w:ascii="Arial" w:hAnsi="Arial" w:cs="Arial"/>
+          <w:sz w:val="24"/>
+          <w:szCs w:val="24"/>
+        </w:rPr>
+      </w:pPr>
+    </w:p>
+    <w:p>
+      <w:pPr>
+        <w:pStyle w:val="Prrafodelista"/>
+        <w:numPr>
+          <w:ilvl w:val="0"/>
+          <w:numId w:val="2"/>
+        </w:numPr>
+        <w:spacing w:after="0" w:line="240" w:lineRule="auto"/>
+        <w:jc w:val="both"/>
+        <w:rPr>
+          <w:rFonts w:ascii="Arial" w:hAnsi="Arial" w:cs="Arial"/>
+          <w:sz w:val="24"/>
+          <w:szCs w:val="24"/>
+        </w:rPr>
+      </w:pPr>
+      <w:r>
+        <w:rPr>
+          <w:rFonts w:ascii="Arial" w:hAnsi="Arial" w:cs="Arial"/>
+          <w:b/>
+          <w:bCs/>
+          <w:sz w:val="24"/>
+          <w:szCs w:val="24"/>
+        </w:rPr>
+        <w:t>exception</w:t>
+      </w:r>
+      <w:r>
+        <w:rPr>
+          <w:rFonts w:ascii="Arial" w:hAnsi="Arial" w:cs="Arial"/>
+          <w:sz w:val="24"/>
+          <w:szCs w:val="24"/>
+        </w:rPr>
+        <w:t>: contiene las excepciones personalizadas y el manejo global de errores.</w:t>
+      </w:r>
+    </w:p>
+    <w:p>
+      <w:pPr>
+        <w:spacing w:after="0" w:line="240" w:lineRule="auto"/>
+        <w:jc w:val="both"/>
+        <w:rPr>
+          <w:rFonts w:ascii="Arial" w:hAnsi="Arial" w:cs="Arial"/>
+          <w:sz w:val="24"/>
+          <w:szCs w:val="24"/>
+        </w:rPr>
+      </w:pPr>
+    </w:p>
+    <w:p>
+      <w:pPr>
+        <w:spacing w:after="0" w:line="240" w:lineRule="auto"/>
+        <w:jc w:val="both"/>
+        <w:rPr>
+          <w:rFonts w:ascii="Arial" w:hAnsi="Arial" w:cs="Arial"/>
+          <w:sz w:val="24"/>
+          <w:szCs w:val="24"/>
+        </w:rPr>
+      </w:pPr>
+      <w:r>
+        <w:rPr>
+          <w:rFonts w:ascii="Arial" w:hAnsi="Arial" w:cs="Arial"/>
+          <w:sz w:val="24"/>
+          <w:szCs w:val="24"/>
+        </w:rPr>
+        <w:t>Además, el proyecto cuenta con la clase principal</w:t>
+      </w:r>
+      <w:r>
+        <w:rPr>
+          <w:rFonts w:ascii="Arial" w:hAnsi="Arial" w:cs="Arial"/>
+          <w:sz w:val="24"/>
+          <w:szCs w:val="24"/>
+        </w:rPr>
+        <w:t xml:space="preserve"> </w:t>
+      </w:r>
+      <w:r>
+        <w:rPr>
+          <w:rFonts w:ascii="Arial" w:hAnsi="Arial" w:cs="Arial"/>
+          <w:sz w:val="24"/>
+          <w:szCs w:val="24"/>
+        </w:rPr>
+        <w:t>ControlEstacionamientoApplication, encargada de iniciar la aplicación Spring Boot.</w:t>
+      </w:r>
+    </w:p>
+    <w:p>
+      <w:pPr>
+        <w:spacing w:after="0" w:line="240" w:lineRule="auto"/>
+        <w:jc w:val="both"/>
+        <w:rPr>
+          <w:rFonts w:ascii="Arial" w:hAnsi="Arial" w:cs="Arial"/>
+          <w:sz w:val="24"/>
+          <w:szCs w:val="24"/>
+        </w:rPr>
+      </w:pPr>
+    </w:p>
+    <w:p>
+      <w:pPr>
+        <w:spacing w:after="0" w:line="240" w:lineRule="auto"/>
+        <w:jc w:val="both"/>
+        <w:rPr>
+          <w:rFonts w:ascii="Arial" w:hAnsi="Arial" w:cs="Arial"/>
+          <w:sz w:val="24"/>
+          <w:szCs w:val="24"/>
+        </w:rPr>
+      </w:pPr>
+      <w:r>
+        <w:rPr>
+          <w:rFonts w:ascii="Arial" w:hAnsi="Arial" w:cs="Arial"/>
+          <w:sz w:val="24"/>
+          <w:szCs w:val="24"/>
+        </w:rPr>
+        <w:t>Esta organización permite mantener el código separado por responsabilidades y facilita el desarrollo de nuevas funcionalidades.</w:t>
+      </w:r>
+    </w:p>
+    <w:p>
+      <w:pPr>
+        <w:jc w:val="both"/>
+        <w:rPr>
+          <w:rFonts w:ascii="Arial" w:hAnsi="Arial" w:cs="Arial"/>
+          <w:sz w:val="24"/>
+          <w:szCs w:val="24"/>
+        </w:rPr>
+      </w:pPr>
+    </w:p>
+    <w:p>
+      <w:pPr>
+        <w:jc w:val="both"/>
+        <w:rPr>
+          <w:rFonts w:ascii="Arial" w:hAnsi="Arial" w:cs="Arial"/>
+          <w:b/>
+          <w:bCs/>
+          <w:sz w:val="24"/>
+          <w:szCs w:val="24"/>
+        </w:rPr>
+      </w:pPr>
+    </w:p>
+    <w:p>
+      <w:pPr>
+        <w:jc w:val="both"/>
+        <w:rPr>
+          <w:rFonts w:ascii="Arial" w:hAnsi="Arial" w:cs="Arial"/>
+          <w:b/>
+          <w:bCs/>
+          <w:sz w:val="24"/>
+          <w:szCs w:val="24"/>
+        </w:rPr>
+      </w:pPr>
+    </w:p>
+    <w:p>
+      <w:pPr>
+        <w:jc w:val="both"/>
+        <w:rPr>
+          <w:rFonts w:ascii="Arial" w:hAnsi="Arial" w:cs="Arial"/>
+          <w:b/>
+          <w:bCs/>
+          <w:sz w:val="24"/>
+          <w:szCs w:val="24"/>
+        </w:rPr>
+      </w:pPr>
+    </w:p>
+    <w:p>
+      <w:pPr>
+        <w:jc w:val="both"/>
+        <w:rPr>
+          <w:rFonts w:ascii="Arial" w:hAnsi="Arial" w:cs="Arial"/>
+          <w:b/>
+          <w:bCs/>
+          <w:sz w:val="24"/>
+          <w:szCs w:val="24"/>
         </w:rPr>
       </w:pPr>
     </w:p>
@@ -1141,6 +1773,16 @@
         </w:rPr>
         <w:t>PostgreSQL</w:t>
       </w:r>
+      <w:r>
+        <w:rPr>
+          <w:rFonts w:ascii="Arial" w:hAnsi="Arial" w:cs="Arial"/>
+          <w:b/>
+          <w:bCs/>
+          <w:sz w:val="24"/>
+          <w:szCs w:val="24"/>
+        </w:rPr>
+        <w:t xml:space="preserve"> Primer Avance</w:t>
+      </w:r>
     </w:p>
     <w:p>
       <w:pPr>
@@ -1162,6 +1804,7 @@
           <w:rFonts w:ascii="Arial" w:hAnsi="Arial" w:cs="Arial"/>
           <w:b/>
           <w:bCs/>
+          <w:noProof/>
           <w:sz w:val="24"/>
           <w:szCs w:val="24"/>
         </w:rPr>
@@ -1269,6 +1912,7 @@
           <w:rFonts w:ascii="Arial" w:hAnsi="Arial" w:cs="Arial"/>
           <w:b/>
           <w:bCs/>
+          <w:noProof/>
           <w:sz w:val="24"/>
           <w:szCs w:val="24"/>
         </w:rPr>
@@ -1391,6 +2035,9 @@
         <w:t xml:space="preserve"> Postman</w:t>
       </w:r>
       <w:r>
+        <w:rPr>
+          <w:noProof/>
+        </w:rPr>
         <w:drawing>
           <wp:inline distT="0" distB="0" distL="0" distR="0" wp14:anchorId="550BA51D" wp14:editId="77E84BC6">
             <wp:extent cx="4571856" cy="2565264"/>
@@ -1428,6 +2075,9 @@
         </w:drawing>
       </w:r>
       <w:r>
+        <w:rPr>
+          <w:noProof/>
+        </w:rPr>
         <w:drawing>
           <wp:inline distT="0" distB="0" distL="0" distR="0" wp14:anchorId="231308C8" wp14:editId="277E4721">
             <wp:extent cx="4536298" cy="2370288"/>
@@ -1465,6 +2115,9 @@
         </w:drawing>
       </w:r>
       <w:r>
+        <w:rPr>
+          <w:noProof/>
+        </w:rPr>
         <w:drawing>
           <wp:inline distT="0" distB="0" distL="0" distR="0" wp14:anchorId="1C3C4298" wp14:editId="3CD094F4">
             <wp:extent cx="4495164" cy="2507994"/>
@@ -1559,6 +2212,9 @@
     </w:p>
     <w:p>
       <w:r>
+        <w:rPr>
+          <w:noProof/>
+        </w:rPr>
         <w:drawing>
           <wp:inline distT="0" distB="0" distL="0" distR="0" wp14:anchorId="19645F91" wp14:editId="4C70E7C3">
             <wp:extent cx="5612130" cy="2773680"/>
@@ -1596,6 +2252,3284 @@
         </w:drawing>
       </w:r>
     </w:p>
+    <w:p>
+      <w:r>
+        <w:rPr>
+          <w:rFonts w:ascii="Arial" w:hAnsi="Arial" w:cs="Arial"/>
+          <w:b/>
+          <w:bCs/>
+          <w:sz w:val="24"/>
+          <w:szCs w:val="24"/>
+        </w:rPr>
+        <w:t>Diagrama de entidades</w:t>
+      </w:r>
+    </w:p>
+    <w:p>
+      <w:pPr>
+        <w:jc w:val="center"/>
+      </w:pPr>
+      <w:r>
+        <w:rPr>
+          <w:noProof/>
+        </w:rPr>
+        <w:drawing>
+          <wp:inline distT="0" distB="0" distL="0" distR="0" wp14:anchorId="64D82410" wp14:editId="3A293775">
+            <wp:extent cx="1958980" cy="4960098"/>
+            <wp:effectExtent l="0" t="0" r="3175" b="0"/>
+            <wp:docPr id="1339402256" name="Imagen 1"/>
+            <wp:cNvGraphicFramePr>
+              <a:graphicFrameLocks xmlns:a="http://schemas.openxmlformats.org/drawingml/2006/main" noChangeAspect="1"/>
+            </wp:cNvGraphicFramePr>
+            <a:graphic xmlns:a="http://schemas.openxmlformats.org/drawingml/2006/main">
+              <a:graphicData uri="http://schemas.openxmlformats.org/drawingml/2006/picture">
+                <pic:pic xmlns:pic="http://schemas.openxmlformats.org/drawingml/2006/picture">
+                  <pic:nvPicPr>
+                    <pic:cNvPr id="0" name="Picture 1"/>
+                    <pic:cNvPicPr>
+                      <a:picLocks noChangeAspect="1" noChangeArrowheads="1"/>
+                    </pic:cNvPicPr>
+                  </pic:nvPicPr>
+                  <pic:blipFill>
+                    <a:blip r:embed="rId13" cstate="print">
+                      <a:extLst>
+                        <a:ext uri="{28A0092B-C50C-407E-A947-70E740481C1C}">
+                          <a14:useLocalDpi xmlns:a14="http://schemas.microsoft.com/office/drawing/2010/main" val="0"/>
+                        </a:ext>
+                      </a:extLst>
+                    </a:blip>
+                    <a:srcRect/>
+                    <a:stretch>
+                      <a:fillRect/>
+                    </a:stretch>
+                  </pic:blipFill>
+                  <pic:spPr bwMode="auto">
+                    <a:xfrm>
+                      <a:off x="0" y="0"/>
+                      <a:ext cx="1959898" cy="4962422"/>
+                    </a:xfrm>
+                    <a:prstGeom prst="rect">
+                      <a:avLst/>
+                    </a:prstGeom>
+                    <a:noFill/>
+                    <a:ln>
+                      <a:noFill/>
+                    </a:ln>
+                  </pic:spPr>
+                </pic:pic>
+              </a:graphicData>
+            </a:graphic>
+          </wp:inline>
+        </w:drawing>
+      </w:r>
+    </w:p>
+    <w:p>
+      <w:pPr>
+        <w:jc w:val="center"/>
+      </w:pPr>
+    </w:p>
+    <w:p>
+      <w:pPr>
+        <w:rPr>
+          <w:rFonts w:ascii="Arial" w:hAnsi="Arial" w:cs="Arial"/>
+          <w:b/>
+          <w:bCs/>
+          <w:sz w:val="24"/>
+          <w:szCs w:val="24"/>
+        </w:rPr>
+      </w:pPr>
+      <w:r>
+        <w:rPr>
+          <w:rFonts w:ascii="Arial" w:hAnsi="Arial" w:cs="Arial"/>
+          <w:b/>
+          <w:bCs/>
+          <w:sz w:val="24"/>
+          <w:szCs w:val="24"/>
+        </w:rPr>
+        <w:lastRenderedPageBreak/>
+        <w:t>Evidencia de conexión con PostgreSQL</w:t>
+      </w:r>
+    </w:p>
+    <w:p>
+      <w:pPr>
+        <w:jc w:val="both"/>
+        <w:rPr>
+          <w:rFonts w:ascii="Arial" w:hAnsi="Arial" w:cs="Arial"/>
+          <w:b/>
+          <w:bCs/>
+          <w:sz w:val="24"/>
+          <w:szCs w:val="24"/>
+        </w:rPr>
+      </w:pPr>
+      <w:r>
+        <w:rPr>
+          <w:rFonts w:ascii="Arial" w:hAnsi="Arial" w:cs="Arial"/>
+          <w:sz w:val="24"/>
+          <w:szCs w:val="24"/>
+        </w:rPr>
+        <w:t>Se comprobó el inicio correcto de la aplicación Spring Boot y su conexión con PostgreSQL mediante la configuración de la fuente de datos. La aplicación inició sin errores y quedó disponible en el puerto 8080.</w:t>
+      </w:r>
+    </w:p>
+    <w:p>
+      <w:pPr>
+        <w:rPr>
+          <w:rFonts w:ascii="Arial" w:hAnsi="Arial" w:cs="Arial"/>
+          <w:b/>
+          <w:bCs/>
+          <w:sz w:val="24"/>
+          <w:szCs w:val="24"/>
+        </w:rPr>
+      </w:pPr>
+      <w:r>
+        <w:rPr>
+          <w:rFonts w:ascii="Arial" w:hAnsi="Arial" w:cs="Arial"/>
+          <w:b/>
+          <w:bCs/>
+          <w:sz w:val="24"/>
+          <w:szCs w:val="24"/>
+        </w:rPr>
+        <w:drawing>
+          <wp:inline distT="0" distB="0" distL="0" distR="0" wp14:anchorId="04BA6D17" wp14:editId="64BEF734">
+            <wp:extent cx="5383530" cy="2923236"/>
+            <wp:effectExtent l="0" t="0" r="7620" b="0"/>
+            <wp:docPr id="1167380222" name="Imagen 1"/>
+            <wp:cNvGraphicFramePr>
+              <a:graphicFrameLocks xmlns:a="http://schemas.openxmlformats.org/drawingml/2006/main" noChangeAspect="1"/>
+            </wp:cNvGraphicFramePr>
+            <a:graphic xmlns:a="http://schemas.openxmlformats.org/drawingml/2006/main">
+              <a:graphicData uri="http://schemas.openxmlformats.org/drawingml/2006/picture">
+                <pic:pic xmlns:pic="http://schemas.openxmlformats.org/drawingml/2006/picture">
+                  <pic:nvPicPr>
+                    <pic:cNvPr id="1167380222" name=""/>
+                    <pic:cNvPicPr/>
+                  </pic:nvPicPr>
+                  <pic:blipFill>
+                    <a:blip r:embed="rId14"/>
+                    <a:stretch>
+                      <a:fillRect/>
+                    </a:stretch>
+                  </pic:blipFill>
+                  <pic:spPr>
+                    <a:xfrm>
+                      <a:off x="0" y="0"/>
+                      <a:ext cx="5385808" cy="2924473"/>
+                    </a:xfrm>
+                    <a:prstGeom prst="rect">
+                      <a:avLst/>
+                    </a:prstGeom>
+                  </pic:spPr>
+                </pic:pic>
+              </a:graphicData>
+            </a:graphic>
+          </wp:inline>
+        </w:drawing>
+      </w:r>
+    </w:p>
+    <w:p>
+      <w:pPr>
+        <w:rPr>
+          <w:rFonts w:ascii="Arial" w:hAnsi="Arial" w:cs="Arial"/>
+          <w:b/>
+          <w:bCs/>
+          <w:sz w:val="24"/>
+          <w:szCs w:val="24"/>
+        </w:rPr>
+      </w:pPr>
+    </w:p>
+    <w:p>
+      <w:pPr>
+        <w:jc w:val="center"/>
+        <w:rPr>
+          <w:rFonts w:ascii="Arial" w:hAnsi="Arial" w:cs="Arial"/>
+          <w:b/>
+          <w:bCs/>
+          <w:sz w:val="24"/>
+          <w:szCs w:val="24"/>
+        </w:rPr>
+      </w:pPr>
+      <w:r>
+        <w:rPr>
+          <w:rFonts w:ascii="Arial" w:hAnsi="Arial" w:cs="Arial"/>
+          <w:b/>
+          <w:bCs/>
+          <w:sz w:val="24"/>
+          <w:szCs w:val="24"/>
+        </w:rPr>
+        <w:t>Evidencia de</w:t>
+      </w:r>
+      <w:r>
+        <w:rPr>
+          <w:rFonts w:ascii="Arial" w:hAnsi="Arial" w:cs="Arial"/>
+          <w:b/>
+          <w:bCs/>
+          <w:sz w:val="24"/>
+          <w:szCs w:val="24"/>
+        </w:rPr>
+        <w:t xml:space="preserve"> pruebas en</w:t>
+      </w:r>
+      <w:r>
+        <w:rPr>
+          <w:rFonts w:ascii="Arial" w:hAnsi="Arial" w:cs="Arial"/>
+          <w:b/>
+          <w:bCs/>
+          <w:sz w:val="24"/>
+          <w:szCs w:val="24"/>
+        </w:rPr>
+        <w:t xml:space="preserve"> </w:t>
+      </w:r>
+      <w:r>
+        <w:rPr>
+          <w:rFonts w:ascii="Arial" w:hAnsi="Arial" w:cs="Arial"/>
+          <w:b/>
+          <w:bCs/>
+          <w:sz w:val="24"/>
+          <w:szCs w:val="24"/>
+        </w:rPr>
+        <w:t>Postman</w:t>
+      </w:r>
+      <w:r>
+        <w:rPr>
+          <w:rFonts w:ascii="Arial" w:hAnsi="Arial" w:cs="Arial"/>
+          <w:b/>
+          <w:bCs/>
+          <w:sz w:val="24"/>
+          <w:szCs w:val="24"/>
+        </w:rPr>
+        <w:t xml:space="preserve"> Segundo Avance</w:t>
+      </w:r>
+    </w:p>
+    <w:p>
+      <w:pPr>
+        <w:rPr>
+          <w:rFonts w:ascii="Arial" w:hAnsi="Arial" w:cs="Arial"/>
+          <w:b/>
+          <w:bCs/>
+          <w:sz w:val="24"/>
+          <w:szCs w:val="24"/>
+        </w:rPr>
+      </w:pPr>
+      <w:r>
+        <w:rPr>
+          <w:rFonts w:ascii="Arial" w:hAnsi="Arial" w:cs="Arial"/>
+          <w:b/>
+          <w:bCs/>
+          <w:sz w:val="24"/>
+          <w:szCs w:val="24"/>
+        </w:rPr>
+        <w:t>Consulta de espacios disponibles</w:t>
+      </w:r>
+    </w:p>
+    <w:p>
+      <w:pPr>
+        <w:jc w:val="both"/>
+        <w:rPr>
+          <w:rFonts w:ascii="Arial" w:hAnsi="Arial" w:cs="Arial"/>
+          <w:b/>
+          <w:bCs/>
+          <w:sz w:val="24"/>
+          <w:szCs w:val="24"/>
+        </w:rPr>
+      </w:pPr>
+      <w:r>
+        <w:rPr>
+          <w:rFonts w:ascii="Arial" w:hAnsi="Arial" w:cs="Arial"/>
+          <w:sz w:val="24"/>
+          <w:szCs w:val="24"/>
+        </w:rPr>
+        <w:t>Se realizó una petición GET al endpoint /api/espacios/disponibles. La API respondió con el código HTTP 200 OK y devolvió los 10 espacios que se encuentran disponibles, excluyendo aquellos que están ocupados.</w:t>
+      </w:r>
+    </w:p>
+    <w:p>
+      <w:pPr>
+        <w:rPr>
+          <w:rFonts w:ascii="Arial" w:hAnsi="Arial" w:cs="Arial"/>
+          <w:b/>
+          <w:bCs/>
+          <w:sz w:val="24"/>
+          <w:szCs w:val="24"/>
+        </w:rPr>
+      </w:pPr>
+      <w:r>
+        <w:rPr>
+          <w:rFonts w:ascii="Arial" w:hAnsi="Arial" w:cs="Arial"/>
+          <w:b/>
+          <w:bCs/>
+          <w:sz w:val="24"/>
+          <w:szCs w:val="24"/>
+        </w:rPr>
+        <w:drawing>
+          <wp:inline distT="0" distB="0" distL="0" distR="0" wp14:anchorId="41E347F0" wp14:editId="23885C21">
+            <wp:extent cx="4069218" cy="3199010"/>
+            <wp:effectExtent l="0" t="0" r="7620" b="1905"/>
+            <wp:docPr id="199853775" name="Imagen 1"/>
+            <wp:cNvGraphicFramePr>
+              <a:graphicFrameLocks xmlns:a="http://schemas.openxmlformats.org/drawingml/2006/main" noChangeAspect="1"/>
+            </wp:cNvGraphicFramePr>
+            <a:graphic xmlns:a="http://schemas.openxmlformats.org/drawingml/2006/main">
+              <a:graphicData uri="http://schemas.openxmlformats.org/drawingml/2006/picture">
+                <pic:pic xmlns:pic="http://schemas.openxmlformats.org/drawingml/2006/picture">
+                  <pic:nvPicPr>
+                    <pic:cNvPr id="199853775" name=""/>
+                    <pic:cNvPicPr/>
+                  </pic:nvPicPr>
+                  <pic:blipFill>
+                    <a:blip r:embed="rId15"/>
+                    <a:stretch>
+                      <a:fillRect/>
+                    </a:stretch>
+                  </pic:blipFill>
+                  <pic:spPr>
+                    <a:xfrm>
+                      <a:off x="0" y="0"/>
+                      <a:ext cx="4091422" cy="3216466"/>
+                    </a:xfrm>
+                    <a:prstGeom prst="rect">
+                      <a:avLst/>
+                    </a:prstGeom>
+                  </pic:spPr>
+                </pic:pic>
+              </a:graphicData>
+            </a:graphic>
+          </wp:inline>
+        </w:drawing>
+      </w:r>
+    </w:p>
+    <w:p>
+      <w:pPr>
+        <w:rPr>
+          <w:rFonts w:ascii="Arial" w:hAnsi="Arial" w:cs="Arial"/>
+          <w:b/>
+          <w:bCs/>
+          <w:sz w:val="24"/>
+          <w:szCs w:val="24"/>
+        </w:rPr>
+      </w:pPr>
+      <w:r>
+        <w:rPr>
+          <w:rFonts w:ascii="Arial" w:hAnsi="Arial" w:cs="Arial"/>
+          <w:b/>
+          <w:bCs/>
+          <w:sz w:val="24"/>
+          <w:szCs w:val="24"/>
+        </w:rPr>
+        <w:lastRenderedPageBreak/>
+        <w:t>Conteo de espacios disponibles</w:t>
+      </w:r>
+    </w:p>
+    <w:p>
+      <w:pPr>
+        <w:jc w:val="both"/>
+        <w:rPr>
+          <w:rFonts w:ascii="Arial" w:hAnsi="Arial" w:cs="Arial"/>
+          <w:sz w:val="24"/>
+          <w:szCs w:val="24"/>
+        </w:rPr>
+      </w:pPr>
+      <w:r>
+        <w:rPr>
+          <w:rFonts w:ascii="Arial" w:hAnsi="Arial" w:cs="Arial"/>
+          <w:sz w:val="24"/>
+          <w:szCs w:val="24"/>
+        </w:rPr>
+        <w:t>Se realizó una petición GET al endpoint /api/espacios/disponibles/total. La API respondió con el código HTTP 200 OK y devolvió el valor 10, que representa la cantidad de espacios disponibles en el estacionamiento.</w:t>
+      </w:r>
+    </w:p>
+    <w:p>
+      <w:pPr>
+        <w:jc w:val="both"/>
+        <w:rPr>
+          <w:rFonts w:ascii="Arial" w:hAnsi="Arial" w:cs="Arial"/>
+          <w:sz w:val="24"/>
+          <w:szCs w:val="24"/>
+        </w:rPr>
+      </w:pPr>
+      <w:r>
+        <w:rPr>
+          <w:rFonts w:ascii="Arial" w:hAnsi="Arial" w:cs="Arial"/>
+          <w:sz w:val="24"/>
+          <w:szCs w:val="24"/>
+        </w:rPr>
+        <w:drawing>
+          <wp:inline distT="0" distB="0" distL="0" distR="0" wp14:anchorId="12E5AE77" wp14:editId="52AD7AF7">
+            <wp:extent cx="5612130" cy="2537460"/>
+            <wp:effectExtent l="0" t="0" r="7620" b="0"/>
+            <wp:docPr id="265798284" name="Imagen 1"/>
+            <wp:cNvGraphicFramePr>
+              <a:graphicFrameLocks xmlns:a="http://schemas.openxmlformats.org/drawingml/2006/main" noChangeAspect="1"/>
+            </wp:cNvGraphicFramePr>
+            <a:graphic xmlns:a="http://schemas.openxmlformats.org/drawingml/2006/main">
+              <a:graphicData uri="http://schemas.openxmlformats.org/drawingml/2006/picture">
+                <pic:pic xmlns:pic="http://schemas.openxmlformats.org/drawingml/2006/picture">
+                  <pic:nvPicPr>
+                    <pic:cNvPr id="265798284" name=""/>
+                    <pic:cNvPicPr/>
+                  </pic:nvPicPr>
+                  <pic:blipFill>
+                    <a:blip r:embed="rId16"/>
+                    <a:stretch>
+                      <a:fillRect/>
+                    </a:stretch>
+                  </pic:blipFill>
+                  <pic:spPr>
+                    <a:xfrm>
+                      <a:off x="0" y="0"/>
+                      <a:ext cx="5612130" cy="2537460"/>
+                    </a:xfrm>
+                    <a:prstGeom prst="rect">
+                      <a:avLst/>
+                    </a:prstGeom>
+                  </pic:spPr>
+                </pic:pic>
+              </a:graphicData>
+            </a:graphic>
+          </wp:inline>
+        </w:drawing>
+      </w:r>
+    </w:p>
+    <w:p>
+      <w:pPr>
+        <w:rPr>
+          <w:rFonts w:ascii="Arial" w:hAnsi="Arial" w:cs="Arial"/>
+          <w:b/>
+          <w:bCs/>
+          <w:sz w:val="24"/>
+          <w:szCs w:val="24"/>
+        </w:rPr>
+      </w:pPr>
+      <w:r>
+        <w:rPr>
+          <w:rFonts w:ascii="Arial" w:hAnsi="Arial" w:cs="Arial"/>
+          <w:b/>
+          <w:bCs/>
+          <w:sz w:val="24"/>
+          <w:szCs w:val="24"/>
+        </w:rPr>
+        <w:t>Consulta de todos los espacios</w:t>
+      </w:r>
+    </w:p>
+    <w:p>
+      <w:pPr>
+        <w:jc w:val="both"/>
+        <w:rPr>
+          <w:rFonts w:ascii="Arial" w:hAnsi="Arial" w:cs="Arial"/>
+          <w:sz w:val="24"/>
+          <w:szCs w:val="24"/>
+        </w:rPr>
+      </w:pPr>
+      <w:r>
+        <w:rPr>
+          <w:rFonts w:ascii="Arial" w:hAnsi="Arial" w:cs="Arial"/>
+          <w:sz w:val="24"/>
+          <w:szCs w:val="24"/>
+        </w:rPr>
+        <w:t>Se realizó una petición GET al endpoint /api/espacios. La API respondió con el código HTTP 200 OK y devolvió los 11 espacios registrados en la base de datos, mostrando su código, identificador, estado de ocupación y tipo de vehículo.</w:t>
+      </w:r>
+    </w:p>
+    <w:p>
+      <w:pPr>
+        <w:jc w:val="both"/>
+        <w:rPr>
+          <w:rFonts w:ascii="Arial" w:hAnsi="Arial" w:cs="Arial"/>
+          <w:sz w:val="24"/>
+          <w:szCs w:val="24"/>
+        </w:rPr>
+      </w:pPr>
+      <w:r>
+        <w:rPr>
+          <w:rFonts w:ascii="Arial" w:hAnsi="Arial" w:cs="Arial"/>
+          <w:sz w:val="24"/>
+          <w:szCs w:val="24"/>
+        </w:rPr>
+        <w:drawing>
+          <wp:inline distT="0" distB="0" distL="0" distR="0" wp14:anchorId="090138C4" wp14:editId="619DCAEF">
+            <wp:extent cx="5177856" cy="4154352"/>
+            <wp:effectExtent l="0" t="0" r="3810" b="0"/>
+            <wp:docPr id="363663997" name="Imagen 1"/>
+            <wp:cNvGraphicFramePr>
+              <a:graphicFrameLocks xmlns:a="http://schemas.openxmlformats.org/drawingml/2006/main" noChangeAspect="1"/>
+            </wp:cNvGraphicFramePr>
+            <a:graphic xmlns:a="http://schemas.openxmlformats.org/drawingml/2006/main">
+              <a:graphicData uri="http://schemas.openxmlformats.org/drawingml/2006/picture">
+                <pic:pic xmlns:pic="http://schemas.openxmlformats.org/drawingml/2006/picture">
+                  <pic:nvPicPr>
+                    <pic:cNvPr id="363663997" name=""/>
+                    <pic:cNvPicPr/>
+                  </pic:nvPicPr>
+                  <pic:blipFill>
+                    <a:blip r:embed="rId17"/>
+                    <a:stretch>
+                      <a:fillRect/>
+                    </a:stretch>
+                  </pic:blipFill>
+                  <pic:spPr>
+                    <a:xfrm>
+                      <a:off x="0" y="0"/>
+                      <a:ext cx="5191284" cy="4165125"/>
+                    </a:xfrm>
+                    <a:prstGeom prst="rect">
+                      <a:avLst/>
+                    </a:prstGeom>
+                  </pic:spPr>
+                </pic:pic>
+              </a:graphicData>
+            </a:graphic>
+          </wp:inline>
+        </w:drawing>
+      </w:r>
+    </w:p>
+    <w:p>
+      <w:pPr>
+        <w:rPr>
+          <w:rFonts w:ascii="Arial" w:hAnsi="Arial" w:cs="Arial"/>
+          <w:b/>
+          <w:bCs/>
+          <w:sz w:val="24"/>
+          <w:szCs w:val="24"/>
+        </w:rPr>
+      </w:pPr>
+      <w:r>
+        <w:rPr>
+          <w:rFonts w:ascii="Arial" w:hAnsi="Arial" w:cs="Arial"/>
+          <w:b/>
+          <w:bCs/>
+          <w:sz w:val="24"/>
+          <w:szCs w:val="24"/>
+        </w:rPr>
+        <w:lastRenderedPageBreak/>
+        <w:t>Validación de tipo de espacio incorrecto</w:t>
+      </w:r>
+    </w:p>
+    <w:p>
+      <w:pPr>
+        <w:jc w:val="both"/>
+        <w:rPr>
+          <w:rFonts w:ascii="Arial" w:hAnsi="Arial" w:cs="Arial"/>
+          <w:sz w:val="24"/>
+          <w:szCs w:val="24"/>
+        </w:rPr>
+      </w:pPr>
+      <w:r>
+        <w:rPr>
+          <w:rFonts w:ascii="Arial" w:hAnsi="Arial" w:cs="Arial"/>
+          <w:sz w:val="24"/>
+          <w:szCs w:val="24"/>
+        </w:rPr>
+        <w:t>Se realizó una petición POST al endpoint /api/espacios enviando un tipo de espacio no permitido (CAMION). La API respondió con el código HTTP 400 Bad Request y mostró un mensaje indicando los tipos de vehículos válidos. Esto demuestra que la validación del DTO impide registrar tipos de espacios no autorizados</w:t>
+      </w:r>
+      <w:r>
+        <w:rPr>
+          <w:rFonts w:ascii="Arial" w:hAnsi="Arial" w:cs="Arial"/>
+          <w:sz w:val="24"/>
+          <w:szCs w:val="24"/>
+        </w:rPr>
+        <w:t>.</w:t>
+      </w:r>
+    </w:p>
+    <w:p>
+      <w:pPr>
+        <w:jc w:val="both"/>
+        <w:rPr>
+          <w:rFonts w:ascii="Arial" w:hAnsi="Arial" w:cs="Arial"/>
+          <w:sz w:val="24"/>
+          <w:szCs w:val="24"/>
+        </w:rPr>
+      </w:pPr>
+      <w:r>
+        <w:rPr>
+          <w:rFonts w:ascii="Arial" w:hAnsi="Arial" w:cs="Arial"/>
+          <w:sz w:val="24"/>
+          <w:szCs w:val="24"/>
+        </w:rPr>
+        <w:drawing>
+          <wp:inline distT="0" distB="0" distL="0" distR="0" wp14:anchorId="6F517F80" wp14:editId="5D411BD6">
+            <wp:extent cx="5612130" cy="2886710"/>
+            <wp:effectExtent l="0" t="0" r="7620" b="8890"/>
+            <wp:docPr id="392968803" name="Imagen 1"/>
+            <wp:cNvGraphicFramePr>
+              <a:graphicFrameLocks xmlns:a="http://schemas.openxmlformats.org/drawingml/2006/main" noChangeAspect="1"/>
+            </wp:cNvGraphicFramePr>
+            <a:graphic xmlns:a="http://schemas.openxmlformats.org/drawingml/2006/main">
+              <a:graphicData uri="http://schemas.openxmlformats.org/drawingml/2006/picture">
+                <pic:pic xmlns:pic="http://schemas.openxmlformats.org/drawingml/2006/picture">
+                  <pic:nvPicPr>
+                    <pic:cNvPr id="392968803" name=""/>
+                    <pic:cNvPicPr/>
+                  </pic:nvPicPr>
+                  <pic:blipFill>
+                    <a:blip r:embed="rId18"/>
+                    <a:stretch>
+                      <a:fillRect/>
+                    </a:stretch>
+                  </pic:blipFill>
+                  <pic:spPr>
+                    <a:xfrm>
+                      <a:off x="0" y="0"/>
+                      <a:ext cx="5612130" cy="2886710"/>
+                    </a:xfrm>
+                    <a:prstGeom prst="rect">
+                      <a:avLst/>
+                    </a:prstGeom>
+                  </pic:spPr>
+                </pic:pic>
+              </a:graphicData>
+            </a:graphic>
+          </wp:inline>
+        </w:drawing>
+      </w:r>
+    </w:p>
+    <w:p>
+      <w:pPr>
+        <w:rPr>
+          <w:rFonts w:ascii="Arial" w:hAnsi="Arial" w:cs="Arial"/>
+          <w:b/>
+          <w:bCs/>
+          <w:sz w:val="24"/>
+          <w:szCs w:val="24"/>
+        </w:rPr>
+      </w:pPr>
+      <w:r>
+        <w:rPr>
+          <w:rFonts w:ascii="Arial" w:hAnsi="Arial" w:cs="Arial"/>
+          <w:b/>
+          <w:bCs/>
+          <w:sz w:val="24"/>
+          <w:szCs w:val="24"/>
+        </w:rPr>
+        <w:t>Validación de código de espacio duplicado</w:t>
+      </w:r>
+    </w:p>
+    <w:p>
+      <w:pPr>
+        <w:jc w:val="both"/>
+        <w:rPr>
+          <w:rFonts w:ascii="Arial" w:hAnsi="Arial" w:cs="Arial"/>
+          <w:sz w:val="24"/>
+          <w:szCs w:val="24"/>
+        </w:rPr>
+      </w:pPr>
+      <w:r>
+        <w:rPr>
+          <w:rFonts w:ascii="Arial" w:hAnsi="Arial" w:cs="Arial"/>
+          <w:sz w:val="24"/>
+          <w:szCs w:val="24"/>
+        </w:rPr>
+        <w:t xml:space="preserve">Se realizó una petición POST al endpoint /api/espacios intentando registrar un espacio con el código C-01, el cual ya existe en la base de datos. La API respondió con el código HTTP 409 Conflict y el mensaje </w:t>
+      </w:r>
+      <w:r>
+        <w:rPr>
+          <w:rFonts w:ascii="Arial" w:hAnsi="Arial" w:cs="Arial"/>
+          <w:sz w:val="24"/>
+          <w:szCs w:val="24"/>
+        </w:rPr>
+        <w:t>“</w:t>
+      </w:r>
+      <w:r>
+        <w:rPr>
+          <w:rFonts w:ascii="Arial" w:hAnsi="Arial" w:cs="Arial"/>
+          <w:sz w:val="24"/>
+          <w:szCs w:val="24"/>
+        </w:rPr>
+        <w:t>Ya existe un espacio con ese código</w:t>
+      </w:r>
+      <w:r>
+        <w:rPr>
+          <w:rFonts w:ascii="Arial" w:hAnsi="Arial" w:cs="Arial"/>
+          <w:sz w:val="24"/>
+          <w:szCs w:val="24"/>
+        </w:rPr>
+        <w:t>”</w:t>
+      </w:r>
+      <w:r>
+        <w:rPr>
+          <w:rFonts w:ascii="Arial" w:hAnsi="Arial" w:cs="Arial"/>
+          <w:sz w:val="24"/>
+          <w:szCs w:val="24"/>
+        </w:rPr>
+        <w:t>. Esto demuestra que el sistema evita el registro de códigos duplicados.</w:t>
+      </w:r>
+    </w:p>
+    <w:p>
+      <w:pPr>
+        <w:jc w:val="both"/>
+        <w:rPr>
+          <w:rFonts w:ascii="Arial" w:hAnsi="Arial" w:cs="Arial"/>
+          <w:sz w:val="24"/>
+          <w:szCs w:val="24"/>
+        </w:rPr>
+      </w:pPr>
+      <w:r>
+        <w:rPr>
+          <w:rFonts w:ascii="Arial" w:hAnsi="Arial" w:cs="Arial"/>
+          <w:sz w:val="24"/>
+          <w:szCs w:val="24"/>
+        </w:rPr>
+        <w:drawing>
+          <wp:inline distT="0" distB="0" distL="0" distR="0" wp14:anchorId="2B09D7A8" wp14:editId="0CF3CAAF">
+            <wp:extent cx="5612130" cy="2755900"/>
+            <wp:effectExtent l="0" t="0" r="7620" b="6350"/>
+            <wp:docPr id="2048458461" name="Imagen 1"/>
+            <wp:cNvGraphicFramePr>
+              <a:graphicFrameLocks xmlns:a="http://schemas.openxmlformats.org/drawingml/2006/main" noChangeAspect="1"/>
+            </wp:cNvGraphicFramePr>
+            <a:graphic xmlns:a="http://schemas.openxmlformats.org/drawingml/2006/main">
+              <a:graphicData uri="http://schemas.openxmlformats.org/drawingml/2006/picture">
+                <pic:pic xmlns:pic="http://schemas.openxmlformats.org/drawingml/2006/picture">
+                  <pic:nvPicPr>
+                    <pic:cNvPr id="2048458461" name=""/>
+                    <pic:cNvPicPr/>
+                  </pic:nvPicPr>
+                  <pic:blipFill>
+                    <a:blip r:embed="rId19"/>
+                    <a:stretch>
+                      <a:fillRect/>
+                    </a:stretch>
+                  </pic:blipFill>
+                  <pic:spPr>
+                    <a:xfrm>
+                      <a:off x="0" y="0"/>
+                      <a:ext cx="5612130" cy="2755900"/>
+                    </a:xfrm>
+                    <a:prstGeom prst="rect">
+                      <a:avLst/>
+                    </a:prstGeom>
+                  </pic:spPr>
+                </pic:pic>
+              </a:graphicData>
+            </a:graphic>
+          </wp:inline>
+        </w:drawing>
+      </w:r>
+    </w:p>
+    <w:p>
+      <w:pPr>
+        <w:jc w:val="both"/>
+        <w:rPr>
+          <w:rFonts w:ascii="Arial" w:hAnsi="Arial" w:cs="Arial"/>
+          <w:sz w:val="24"/>
+          <w:szCs w:val="24"/>
+        </w:rPr>
+      </w:pPr>
+    </w:p>
+    <w:p>
+      <w:pPr>
+        <w:jc w:val="both"/>
+        <w:rPr>
+          <w:rFonts w:ascii="Arial" w:hAnsi="Arial" w:cs="Arial"/>
+          <w:sz w:val="24"/>
+          <w:szCs w:val="24"/>
+        </w:rPr>
+      </w:pPr>
+    </w:p>
+    <w:p>
+      <w:pPr>
+        <w:rPr>
+          <w:rFonts w:ascii="Arial" w:hAnsi="Arial" w:cs="Arial"/>
+          <w:b/>
+          <w:bCs/>
+          <w:sz w:val="24"/>
+          <w:szCs w:val="24"/>
+        </w:rPr>
+      </w:pPr>
+      <w:r>
+        <w:rPr>
+          <w:rFonts w:ascii="Arial" w:hAnsi="Arial" w:cs="Arial"/>
+          <w:b/>
+          <w:bCs/>
+          <w:sz w:val="24"/>
+          <w:szCs w:val="24"/>
+        </w:rPr>
+        <w:lastRenderedPageBreak/>
+        <w:t>Consulta de todos los tickets</w:t>
+      </w:r>
+    </w:p>
+    <w:p>
+      <w:pPr>
+        <w:jc w:val="both"/>
+        <w:rPr>
+          <w:rFonts w:ascii="Arial" w:hAnsi="Arial" w:cs="Arial"/>
+          <w:sz w:val="24"/>
+          <w:szCs w:val="24"/>
+        </w:rPr>
+      </w:pPr>
+      <w:r>
+        <w:rPr>
+          <w:rFonts w:ascii="Arial" w:hAnsi="Arial" w:cs="Arial"/>
+          <w:sz w:val="24"/>
+          <w:szCs w:val="24"/>
+        </w:rPr>
+        <w:t>Se realizó una petición GET al endpoint /api/tickets. La API respondió con el código HTTP 200 OK y devolvió los 3 tickets visibles registrados en el sistema: dos con estado ACTIVO y uno con estado FINALIZADO. La información incluye placa, fechas de entrada y salida, espacio asignado, estado y total.</w:t>
+      </w:r>
+    </w:p>
+    <w:p>
+      <w:pPr>
+        <w:jc w:val="both"/>
+        <w:rPr>
+          <w:rFonts w:ascii="Arial" w:hAnsi="Arial" w:cs="Arial"/>
+          <w:sz w:val="24"/>
+          <w:szCs w:val="24"/>
+        </w:rPr>
+      </w:pPr>
+      <w:r>
+        <w:rPr>
+          <w:rFonts w:ascii="Arial" w:hAnsi="Arial" w:cs="Arial"/>
+          <w:sz w:val="24"/>
+          <w:szCs w:val="24"/>
+        </w:rPr>
+        <w:drawing>
+          <wp:inline distT="0" distB="0" distL="0" distR="0" wp14:anchorId="7C1A3D08" wp14:editId="093892A9">
+            <wp:extent cx="5612130" cy="4629150"/>
+            <wp:effectExtent l="0" t="0" r="7620" b="0"/>
+            <wp:docPr id="318619906" name="Imagen 1"/>
+            <wp:cNvGraphicFramePr>
+              <a:graphicFrameLocks xmlns:a="http://schemas.openxmlformats.org/drawingml/2006/main" noChangeAspect="1"/>
+            </wp:cNvGraphicFramePr>
+            <a:graphic xmlns:a="http://schemas.openxmlformats.org/drawingml/2006/main">
+              <a:graphicData uri="http://schemas.openxmlformats.org/drawingml/2006/picture">
+                <pic:pic xmlns:pic="http://schemas.openxmlformats.org/drawingml/2006/picture">
+                  <pic:nvPicPr>
+                    <pic:cNvPr id="318619906" name=""/>
+                    <pic:cNvPicPr/>
+                  </pic:nvPicPr>
+                  <pic:blipFill>
+                    <a:blip r:embed="rId20"/>
+                    <a:stretch>
+                      <a:fillRect/>
+                    </a:stretch>
+                  </pic:blipFill>
+                  <pic:spPr>
+                    <a:xfrm>
+                      <a:off x="0" y="0"/>
+                      <a:ext cx="5612130" cy="4629150"/>
+                    </a:xfrm>
+                    <a:prstGeom prst="rect">
+                      <a:avLst/>
+                    </a:prstGeom>
+                  </pic:spPr>
+                </pic:pic>
+              </a:graphicData>
+            </a:graphic>
+          </wp:inline>
+        </w:drawing>
+      </w:r>
+    </w:p>
+    <w:p>
+      <w:pPr>
+        <w:jc w:val="both"/>
+        <w:rPr>
+          <w:rFonts w:ascii="Arial" w:hAnsi="Arial" w:cs="Arial"/>
+          <w:sz w:val="24"/>
+          <w:szCs w:val="24"/>
+        </w:rPr>
+      </w:pPr>
+    </w:p>
+    <w:p>
+      <w:pPr>
+        <w:jc w:val="both"/>
+        <w:rPr>
+          <w:rFonts w:ascii="Arial" w:hAnsi="Arial" w:cs="Arial"/>
+          <w:sz w:val="24"/>
+          <w:szCs w:val="24"/>
+        </w:rPr>
+      </w:pPr>
+    </w:p>
+    <w:p>
+      <w:pPr>
+        <w:jc w:val="both"/>
+        <w:rPr>
+          <w:rFonts w:ascii="Arial" w:hAnsi="Arial" w:cs="Arial"/>
+          <w:sz w:val="24"/>
+          <w:szCs w:val="24"/>
+        </w:rPr>
+      </w:pPr>
+    </w:p>
+    <w:p>
+      <w:pPr>
+        <w:jc w:val="both"/>
+        <w:rPr>
+          <w:rFonts w:ascii="Arial" w:hAnsi="Arial" w:cs="Arial"/>
+          <w:sz w:val="24"/>
+          <w:szCs w:val="24"/>
+        </w:rPr>
+      </w:pPr>
+    </w:p>
+    <w:p>
+      <w:pPr>
+        <w:jc w:val="both"/>
+        <w:rPr>
+          <w:rFonts w:ascii="Arial" w:hAnsi="Arial" w:cs="Arial"/>
+          <w:sz w:val="24"/>
+          <w:szCs w:val="24"/>
+        </w:rPr>
+      </w:pPr>
+    </w:p>
+    <w:p>
+      <w:pPr>
+        <w:jc w:val="both"/>
+        <w:rPr>
+          <w:rFonts w:ascii="Arial" w:hAnsi="Arial" w:cs="Arial"/>
+          <w:sz w:val="24"/>
+          <w:szCs w:val="24"/>
+        </w:rPr>
+      </w:pPr>
+    </w:p>
+    <w:p>
+      <w:pPr>
+        <w:jc w:val="both"/>
+        <w:rPr>
+          <w:rFonts w:ascii="Arial" w:hAnsi="Arial" w:cs="Arial"/>
+          <w:sz w:val="24"/>
+          <w:szCs w:val="24"/>
+        </w:rPr>
+      </w:pPr>
+    </w:p>
+    <w:p>
+      <w:pPr>
+        <w:jc w:val="both"/>
+        <w:rPr>
+          <w:rFonts w:ascii="Arial" w:hAnsi="Arial" w:cs="Arial"/>
+          <w:sz w:val="24"/>
+          <w:szCs w:val="24"/>
+        </w:rPr>
+      </w:pPr>
+    </w:p>
+    <w:p>
+      <w:pPr>
+        <w:jc w:val="both"/>
+        <w:rPr>
+          <w:rFonts w:ascii="Arial" w:hAnsi="Arial" w:cs="Arial"/>
+          <w:sz w:val="24"/>
+          <w:szCs w:val="24"/>
+        </w:rPr>
+      </w:pPr>
+    </w:p>
+    <w:p>
+      <w:pPr>
+        <w:jc w:val="both"/>
+        <w:rPr>
+          <w:rFonts w:ascii="Arial" w:hAnsi="Arial" w:cs="Arial"/>
+          <w:sz w:val="24"/>
+          <w:szCs w:val="24"/>
+        </w:rPr>
+      </w:pPr>
+    </w:p>
+    <w:p>
+      <w:pPr>
+        <w:jc w:val="both"/>
+        <w:rPr>
+          <w:rFonts w:ascii="Arial" w:hAnsi="Arial" w:cs="Arial"/>
+          <w:b/>
+          <w:bCs/>
+          <w:sz w:val="24"/>
+          <w:szCs w:val="24"/>
+        </w:rPr>
+      </w:pPr>
+      <w:r>
+        <w:rPr>
+          <w:rFonts w:ascii="Arial" w:hAnsi="Arial" w:cs="Arial"/>
+          <w:b/>
+          <w:bCs/>
+          <w:sz w:val="24"/>
+          <w:szCs w:val="24"/>
+        </w:rPr>
+        <w:lastRenderedPageBreak/>
+        <w:t>Consulta de tickets activos</w:t>
+      </w:r>
+    </w:p>
+    <w:p>
+      <w:pPr>
+        <w:jc w:val="both"/>
+        <w:rPr>
+          <w:rFonts w:ascii="Arial" w:hAnsi="Arial" w:cs="Arial"/>
+          <w:sz w:val="24"/>
+          <w:szCs w:val="24"/>
+        </w:rPr>
+      </w:pPr>
+      <w:r>
+        <w:rPr>
+          <w:rFonts w:ascii="Arial" w:hAnsi="Arial" w:cs="Arial"/>
+          <w:sz w:val="24"/>
+          <w:szCs w:val="24"/>
+        </w:rPr>
+        <w:t>Se realizó una petición GET al endpoint /api/tickets/estado/ACTIVO.</w:t>
+      </w:r>
+      <w:r>
+        <w:rPr>
+          <w:rFonts w:ascii="Arial" w:hAnsi="Arial" w:cs="Arial"/>
+          <w:sz w:val="24"/>
+          <w:szCs w:val="24"/>
+        </w:rPr>
+        <w:t xml:space="preserve"> </w:t>
+      </w:r>
+      <w:r>
+        <w:rPr>
+          <w:rFonts w:ascii="Arial" w:hAnsi="Arial" w:cs="Arial"/>
+          <w:sz w:val="24"/>
+          <w:szCs w:val="24"/>
+        </w:rPr>
+        <w:t>La API respondió con el código HTTP 200 OK y devolvió únicamente los 2 tickets que tienen estado ACTIVO, excluyendo los tickets finalizados y eliminados.</w:t>
+      </w:r>
+    </w:p>
+    <w:p>
+      <w:pPr>
+        <w:jc w:val="both"/>
+        <w:rPr>
+          <w:rFonts w:ascii="Arial" w:hAnsi="Arial" w:cs="Arial"/>
+          <w:sz w:val="24"/>
+          <w:szCs w:val="24"/>
+        </w:rPr>
+      </w:pPr>
+      <w:r>
+        <w:rPr>
+          <w:rFonts w:ascii="Arial" w:hAnsi="Arial" w:cs="Arial"/>
+          <w:sz w:val="24"/>
+          <w:szCs w:val="24"/>
+        </w:rPr>
+        <w:drawing>
+          <wp:inline distT="0" distB="0" distL="0" distR="0" wp14:anchorId="17F97563" wp14:editId="277854AC">
+            <wp:extent cx="5612130" cy="3985260"/>
+            <wp:effectExtent l="0" t="0" r="7620" b="0"/>
+            <wp:docPr id="1913434867" name="Imagen 1"/>
+            <wp:cNvGraphicFramePr>
+              <a:graphicFrameLocks xmlns:a="http://schemas.openxmlformats.org/drawingml/2006/main" noChangeAspect="1"/>
+            </wp:cNvGraphicFramePr>
+            <a:graphic xmlns:a="http://schemas.openxmlformats.org/drawingml/2006/main">
+              <a:graphicData uri="http://schemas.openxmlformats.org/drawingml/2006/picture">
+                <pic:pic xmlns:pic="http://schemas.openxmlformats.org/drawingml/2006/picture">
+                  <pic:nvPicPr>
+                    <pic:cNvPr id="1913434867" name=""/>
+                    <pic:cNvPicPr/>
+                  </pic:nvPicPr>
+                  <pic:blipFill>
+                    <a:blip r:embed="rId21"/>
+                    <a:stretch>
+                      <a:fillRect/>
+                    </a:stretch>
+                  </pic:blipFill>
+                  <pic:spPr>
+                    <a:xfrm>
+                      <a:off x="0" y="0"/>
+                      <a:ext cx="5612130" cy="3985260"/>
+                    </a:xfrm>
+                    <a:prstGeom prst="rect">
+                      <a:avLst/>
+                    </a:prstGeom>
+                  </pic:spPr>
+                </pic:pic>
+              </a:graphicData>
+            </a:graphic>
+          </wp:inline>
+        </w:drawing>
+      </w:r>
+    </w:p>
+    <w:p>
+      <w:pPr>
+        <w:jc w:val="both"/>
+        <w:rPr>
+          <w:rFonts w:ascii="Arial" w:hAnsi="Arial" w:cs="Arial"/>
+          <w:b/>
+          <w:bCs/>
+          <w:sz w:val="24"/>
+          <w:szCs w:val="24"/>
+        </w:rPr>
+      </w:pPr>
+      <w:r>
+        <w:rPr>
+          <w:rFonts w:ascii="Arial" w:hAnsi="Arial" w:cs="Arial"/>
+          <w:b/>
+          <w:bCs/>
+          <w:sz w:val="24"/>
+          <w:szCs w:val="24"/>
+        </w:rPr>
+        <w:t>Conteo de tickets activos</w:t>
+      </w:r>
+    </w:p>
+    <w:p>
+      <w:pPr>
+        <w:jc w:val="both"/>
+        <w:rPr>
+          <w:rFonts w:ascii="Arial" w:hAnsi="Arial" w:cs="Arial"/>
+          <w:sz w:val="24"/>
+          <w:szCs w:val="24"/>
+        </w:rPr>
+      </w:pPr>
+      <w:r>
+        <w:rPr>
+          <w:rFonts w:ascii="Arial" w:hAnsi="Arial" w:cs="Arial"/>
+          <w:sz w:val="24"/>
+          <w:szCs w:val="24"/>
+        </w:rPr>
+        <w:t>Se realizó una petición GET al endpoint /api/tickets/estado/ACTIVO/total. La API respondió con el código HTTP 200 OK y devolvió el valor 2, que representa la cantidad de tickets que se encuentran activos en el sistema.</w:t>
+      </w:r>
+    </w:p>
+    <w:p>
+      <w:pPr>
+        <w:jc w:val="both"/>
+        <w:rPr>
+          <w:rFonts w:ascii="Arial" w:hAnsi="Arial" w:cs="Arial"/>
+          <w:sz w:val="24"/>
+          <w:szCs w:val="24"/>
+        </w:rPr>
+      </w:pPr>
+      <w:r>
+        <w:rPr>
+          <w:rFonts w:ascii="Arial" w:hAnsi="Arial" w:cs="Arial"/>
+          <w:sz w:val="24"/>
+          <w:szCs w:val="24"/>
+        </w:rPr>
+        <w:drawing>
+          <wp:inline distT="0" distB="0" distL="0" distR="0" wp14:anchorId="45BE3D00" wp14:editId="709FCAFC">
+            <wp:extent cx="5612130" cy="2506980"/>
+            <wp:effectExtent l="0" t="0" r="7620" b="7620"/>
+            <wp:docPr id="1423771942" name="Imagen 1"/>
+            <wp:cNvGraphicFramePr>
+              <a:graphicFrameLocks xmlns:a="http://schemas.openxmlformats.org/drawingml/2006/main" noChangeAspect="1"/>
+            </wp:cNvGraphicFramePr>
+            <a:graphic xmlns:a="http://schemas.openxmlformats.org/drawingml/2006/main">
+              <a:graphicData uri="http://schemas.openxmlformats.org/drawingml/2006/picture">
+                <pic:pic xmlns:pic="http://schemas.openxmlformats.org/drawingml/2006/picture">
+                  <pic:nvPicPr>
+                    <pic:cNvPr id="1423771942" name=""/>
+                    <pic:cNvPicPr/>
+                  </pic:nvPicPr>
+                  <pic:blipFill>
+                    <a:blip r:embed="rId22"/>
+                    <a:stretch>
+                      <a:fillRect/>
+                    </a:stretch>
+                  </pic:blipFill>
+                  <pic:spPr>
+                    <a:xfrm>
+                      <a:off x="0" y="0"/>
+                      <a:ext cx="5612130" cy="2506980"/>
+                    </a:xfrm>
+                    <a:prstGeom prst="rect">
+                      <a:avLst/>
+                    </a:prstGeom>
+                  </pic:spPr>
+                </pic:pic>
+              </a:graphicData>
+            </a:graphic>
+          </wp:inline>
+        </w:drawing>
+      </w:r>
+    </w:p>
+    <w:p>
+      <w:pPr>
+        <w:jc w:val="both"/>
+        <w:rPr>
+          <w:rFonts w:ascii="Arial" w:hAnsi="Arial" w:cs="Arial"/>
+          <w:b/>
+          <w:bCs/>
+          <w:sz w:val="24"/>
+          <w:szCs w:val="24"/>
+        </w:rPr>
+      </w:pPr>
+      <w:r>
+        <w:rPr>
+          <w:rFonts w:ascii="Arial" w:hAnsi="Arial" w:cs="Arial"/>
+          <w:b/>
+          <w:bCs/>
+          <w:sz w:val="24"/>
+          <w:szCs w:val="24"/>
+        </w:rPr>
+        <w:lastRenderedPageBreak/>
+        <w:t>Consulta de tickets finalizados</w:t>
+      </w:r>
+    </w:p>
+    <w:p>
+      <w:pPr>
+        <w:jc w:val="both"/>
+        <w:rPr>
+          <w:rFonts w:ascii="Arial" w:hAnsi="Arial" w:cs="Arial"/>
+          <w:sz w:val="24"/>
+          <w:szCs w:val="24"/>
+        </w:rPr>
+      </w:pPr>
+      <w:r>
+        <w:rPr>
+          <w:rFonts w:ascii="Arial" w:hAnsi="Arial" w:cs="Arial"/>
+          <w:sz w:val="24"/>
+          <w:szCs w:val="24"/>
+        </w:rPr>
+        <w:t>Se realizó una petición GET al endpoint /api/tickets/estado/FINALIZADO. La API respondió con el código HTTP 200 OK y devolvió el ticket que tiene estado FINALIZADO, mostrando su placa, fechas de entrada y salida, espacio asignado y total cobrado.</w:t>
+      </w:r>
+    </w:p>
+    <w:p>
+      <w:pPr>
+        <w:jc w:val="both"/>
+        <w:rPr>
+          <w:rFonts w:ascii="Arial" w:hAnsi="Arial" w:cs="Arial"/>
+          <w:sz w:val="24"/>
+          <w:szCs w:val="24"/>
+        </w:rPr>
+      </w:pPr>
+      <w:r>
+        <w:rPr>
+          <w:rFonts w:ascii="Arial" w:hAnsi="Arial" w:cs="Arial"/>
+          <w:sz w:val="24"/>
+          <w:szCs w:val="24"/>
+        </w:rPr>
+        <w:drawing>
+          <wp:inline distT="0" distB="0" distL="0" distR="0" wp14:anchorId="06435E6B" wp14:editId="1E2DCC01">
+            <wp:extent cx="5612130" cy="3345180"/>
+            <wp:effectExtent l="0" t="0" r="7620" b="7620"/>
+            <wp:docPr id="1497237223" name="Imagen 1"/>
+            <wp:cNvGraphicFramePr>
+              <a:graphicFrameLocks xmlns:a="http://schemas.openxmlformats.org/drawingml/2006/main" noChangeAspect="1"/>
+            </wp:cNvGraphicFramePr>
+            <a:graphic xmlns:a="http://schemas.openxmlformats.org/drawingml/2006/main">
+              <a:graphicData uri="http://schemas.openxmlformats.org/drawingml/2006/picture">
+                <pic:pic xmlns:pic="http://schemas.openxmlformats.org/drawingml/2006/picture">
+                  <pic:nvPicPr>
+                    <pic:cNvPr id="1497237223" name=""/>
+                    <pic:cNvPicPr/>
+                  </pic:nvPicPr>
+                  <pic:blipFill>
+                    <a:blip r:embed="rId23"/>
+                    <a:stretch>
+                      <a:fillRect/>
+                    </a:stretch>
+                  </pic:blipFill>
+                  <pic:spPr>
+                    <a:xfrm>
+                      <a:off x="0" y="0"/>
+                      <a:ext cx="5612130" cy="3345180"/>
+                    </a:xfrm>
+                    <a:prstGeom prst="rect">
+                      <a:avLst/>
+                    </a:prstGeom>
+                  </pic:spPr>
+                </pic:pic>
+              </a:graphicData>
+            </a:graphic>
+          </wp:inline>
+        </w:drawing>
+      </w:r>
+    </w:p>
+    <w:p>
+      <w:pPr>
+        <w:jc w:val="both"/>
+        <w:rPr>
+          <w:rFonts w:ascii="Arial" w:hAnsi="Arial" w:cs="Arial"/>
+          <w:b/>
+          <w:bCs/>
+          <w:sz w:val="24"/>
+          <w:szCs w:val="24"/>
+        </w:rPr>
+      </w:pPr>
+      <w:r>
+        <w:rPr>
+          <w:rFonts w:ascii="Arial" w:hAnsi="Arial" w:cs="Arial"/>
+          <w:b/>
+          <w:bCs/>
+          <w:sz w:val="24"/>
+          <w:szCs w:val="24"/>
+        </w:rPr>
+        <w:t>Conteo de tickets finalizados</w:t>
+      </w:r>
+    </w:p>
+    <w:p>
+      <w:pPr>
+        <w:jc w:val="both"/>
+        <w:rPr>
+          <w:rFonts w:ascii="Arial" w:hAnsi="Arial" w:cs="Arial"/>
+          <w:sz w:val="24"/>
+          <w:szCs w:val="24"/>
+        </w:rPr>
+      </w:pPr>
+      <w:r>
+        <w:rPr>
+          <w:rFonts w:ascii="Arial" w:hAnsi="Arial" w:cs="Arial"/>
+          <w:sz w:val="24"/>
+          <w:szCs w:val="24"/>
+        </w:rPr>
+        <w:t>Se realizó una petición GET al endpoint /api/tickets/estado/FINALIZADO/total. La API respondió con el código HTTP 200 OK y devolvió el valor 1, que representa la cantidad de tickets finalizados que permanecen registrados y no han sido eliminados.</w:t>
+      </w:r>
+    </w:p>
+    <w:p>
+      <w:pPr>
+        <w:jc w:val="both"/>
+        <w:rPr>
+          <w:rFonts w:ascii="Arial" w:hAnsi="Arial" w:cs="Arial"/>
+          <w:sz w:val="24"/>
+          <w:szCs w:val="24"/>
+        </w:rPr>
+      </w:pPr>
+      <w:r>
+        <w:rPr>
+          <w:rFonts w:ascii="Arial" w:hAnsi="Arial" w:cs="Arial"/>
+          <w:sz w:val="24"/>
+          <w:szCs w:val="24"/>
+        </w:rPr>
+        <w:drawing>
+          <wp:inline distT="0" distB="0" distL="0" distR="0" wp14:anchorId="2A3D0721" wp14:editId="19DA6CFD">
+            <wp:extent cx="5612130" cy="2473960"/>
+            <wp:effectExtent l="0" t="0" r="7620" b="2540"/>
+            <wp:docPr id="814020230" name="Imagen 1"/>
+            <wp:cNvGraphicFramePr>
+              <a:graphicFrameLocks xmlns:a="http://schemas.openxmlformats.org/drawingml/2006/main" noChangeAspect="1"/>
+            </wp:cNvGraphicFramePr>
+            <a:graphic xmlns:a="http://schemas.openxmlformats.org/drawingml/2006/main">
+              <a:graphicData uri="http://schemas.openxmlformats.org/drawingml/2006/picture">
+                <pic:pic xmlns:pic="http://schemas.openxmlformats.org/drawingml/2006/picture">
+                  <pic:nvPicPr>
+                    <pic:cNvPr id="814020230" name=""/>
+                    <pic:cNvPicPr/>
+                  </pic:nvPicPr>
+                  <pic:blipFill>
+                    <a:blip r:embed="rId24"/>
+                    <a:stretch>
+                      <a:fillRect/>
+                    </a:stretch>
+                  </pic:blipFill>
+                  <pic:spPr>
+                    <a:xfrm>
+                      <a:off x="0" y="0"/>
+                      <a:ext cx="5612130" cy="2473960"/>
+                    </a:xfrm>
+                    <a:prstGeom prst="rect">
+                      <a:avLst/>
+                    </a:prstGeom>
+                  </pic:spPr>
+                </pic:pic>
+              </a:graphicData>
+            </a:graphic>
+          </wp:inline>
+        </w:drawing>
+      </w:r>
+    </w:p>
+    <w:p>
+      <w:pPr>
+        <w:jc w:val="both"/>
+        <w:rPr>
+          <w:rFonts w:ascii="Arial" w:hAnsi="Arial" w:cs="Arial"/>
+          <w:sz w:val="24"/>
+          <w:szCs w:val="24"/>
+        </w:rPr>
+      </w:pPr>
+    </w:p>
+    <w:p>
+      <w:pPr>
+        <w:jc w:val="both"/>
+        <w:rPr>
+          <w:rFonts w:ascii="Arial" w:hAnsi="Arial" w:cs="Arial"/>
+          <w:b/>
+          <w:bCs/>
+          <w:sz w:val="24"/>
+          <w:szCs w:val="24"/>
+        </w:rPr>
+      </w:pPr>
+      <w:r>
+        <w:rPr>
+          <w:rFonts w:ascii="Arial" w:hAnsi="Arial" w:cs="Arial"/>
+          <w:b/>
+          <w:bCs/>
+          <w:sz w:val="24"/>
+          <w:szCs w:val="24"/>
+        </w:rPr>
+        <w:lastRenderedPageBreak/>
+        <w:t>Consulta de recaudación del día</w:t>
+      </w:r>
+    </w:p>
+    <w:p>
+      <w:pPr>
+        <w:jc w:val="both"/>
+        <w:rPr>
+          <w:rFonts w:ascii="Arial" w:hAnsi="Arial" w:cs="Arial"/>
+          <w:sz w:val="24"/>
+          <w:szCs w:val="24"/>
+        </w:rPr>
+      </w:pPr>
+      <w:r>
+        <w:rPr>
+          <w:rFonts w:ascii="Arial" w:hAnsi="Arial" w:cs="Arial"/>
+          <w:sz w:val="24"/>
+          <w:szCs w:val="24"/>
+        </w:rPr>
+        <w:t>Se realizó una petición GET al endpoint /api/tickets/recaudacion/hoy. La API respondió con el código HTTP 200 OK y devolvió una recaudación de Q0.00. Esto indica que no existen tickets finalizados con cobros registrados durante el día consultado.</w:t>
+      </w:r>
+    </w:p>
+    <w:p>
+      <w:pPr>
+        <w:jc w:val="both"/>
+        <w:rPr>
+          <w:rFonts w:ascii="Arial" w:hAnsi="Arial" w:cs="Arial"/>
+          <w:sz w:val="24"/>
+          <w:szCs w:val="24"/>
+        </w:rPr>
+      </w:pPr>
+      <w:r>
+        <w:rPr>
+          <w:rFonts w:ascii="Arial" w:hAnsi="Arial" w:cs="Arial"/>
+          <w:sz w:val="24"/>
+          <w:szCs w:val="24"/>
+        </w:rPr>
+        <w:drawing>
+          <wp:inline distT="0" distB="0" distL="0" distR="0" wp14:anchorId="6239EB88" wp14:editId="33AF2CA5">
+            <wp:extent cx="5612130" cy="2506345"/>
+            <wp:effectExtent l="0" t="0" r="7620" b="8255"/>
+            <wp:docPr id="1992787083" name="Imagen 1"/>
+            <wp:cNvGraphicFramePr>
+              <a:graphicFrameLocks xmlns:a="http://schemas.openxmlformats.org/drawingml/2006/main" noChangeAspect="1"/>
+            </wp:cNvGraphicFramePr>
+            <a:graphic xmlns:a="http://schemas.openxmlformats.org/drawingml/2006/main">
+              <a:graphicData uri="http://schemas.openxmlformats.org/drawingml/2006/picture">
+                <pic:pic xmlns:pic="http://schemas.openxmlformats.org/drawingml/2006/picture">
+                  <pic:nvPicPr>
+                    <pic:cNvPr id="1992787083" name=""/>
+                    <pic:cNvPicPr/>
+                  </pic:nvPicPr>
+                  <pic:blipFill>
+                    <a:blip r:embed="rId25"/>
+                    <a:stretch>
+                      <a:fillRect/>
+                    </a:stretch>
+                  </pic:blipFill>
+                  <pic:spPr>
+                    <a:xfrm>
+                      <a:off x="0" y="0"/>
+                      <a:ext cx="5612130" cy="2506345"/>
+                    </a:xfrm>
+                    <a:prstGeom prst="rect">
+                      <a:avLst/>
+                    </a:prstGeom>
+                  </pic:spPr>
+                </pic:pic>
+              </a:graphicData>
+            </a:graphic>
+          </wp:inline>
+        </w:drawing>
+      </w:r>
+    </w:p>
+    <w:p>
+      <w:pPr>
+        <w:jc w:val="both"/>
+        <w:rPr>
+          <w:rFonts w:ascii="Arial" w:hAnsi="Arial" w:cs="Arial"/>
+          <w:b/>
+          <w:bCs/>
+          <w:sz w:val="24"/>
+          <w:szCs w:val="24"/>
+        </w:rPr>
+      </w:pPr>
+      <w:r>
+        <w:rPr>
+          <w:rFonts w:ascii="Arial" w:hAnsi="Arial" w:cs="Arial"/>
+          <w:b/>
+          <w:bCs/>
+          <w:sz w:val="24"/>
+          <w:szCs w:val="24"/>
+        </w:rPr>
+        <w:t>Validación de asignación de espacio ocupado</w:t>
+      </w:r>
+    </w:p>
+    <w:p>
+      <w:pPr>
+        <w:jc w:val="both"/>
+        <w:rPr>
+          <w:rFonts w:ascii="Arial" w:hAnsi="Arial" w:cs="Arial"/>
+          <w:sz w:val="24"/>
+          <w:szCs w:val="24"/>
+        </w:rPr>
+      </w:pPr>
+      <w:r>
+        <w:rPr>
+          <w:rFonts w:ascii="Arial" w:hAnsi="Arial" w:cs="Arial"/>
+          <w:sz w:val="24"/>
+          <w:szCs w:val="24"/>
+        </w:rPr>
+        <w:t xml:space="preserve">Se realizó una petición POST al endpoint /api/tickets intentando registrar un ticket en un espacio que se encontraba ocupado. La API respondió con el código HTTP 409 Conflict y el mensaje </w:t>
+      </w:r>
+      <w:r>
+        <w:rPr>
+          <w:rFonts w:ascii="Arial" w:hAnsi="Arial" w:cs="Arial"/>
+          <w:sz w:val="24"/>
+          <w:szCs w:val="24"/>
+        </w:rPr>
+        <w:t>“</w:t>
+      </w:r>
+      <w:r>
+        <w:rPr>
+          <w:rFonts w:ascii="Arial" w:hAnsi="Arial" w:cs="Arial"/>
+          <w:sz w:val="24"/>
+          <w:szCs w:val="24"/>
+        </w:rPr>
+        <w:t>El espacio ya está ocupado</w:t>
+      </w:r>
+      <w:r>
+        <w:rPr>
+          <w:rFonts w:ascii="Arial" w:hAnsi="Arial" w:cs="Arial"/>
+          <w:sz w:val="24"/>
+          <w:szCs w:val="24"/>
+        </w:rPr>
+        <w:t>”</w:t>
+      </w:r>
+      <w:r>
+        <w:rPr>
+          <w:rFonts w:ascii="Arial" w:hAnsi="Arial" w:cs="Arial"/>
+          <w:sz w:val="24"/>
+          <w:szCs w:val="24"/>
+        </w:rPr>
+        <w:t>. Esto demuestra que el Service verifica la disponibilidad del espacio antes de registrar un nuevo ticket y evita asignaciones duplicadas.</w:t>
+      </w:r>
+    </w:p>
+    <w:p>
+      <w:pPr>
+        <w:jc w:val="both"/>
+        <w:rPr>
+          <w:rFonts w:ascii="Arial" w:hAnsi="Arial" w:cs="Arial"/>
+          <w:sz w:val="24"/>
+          <w:szCs w:val="24"/>
+        </w:rPr>
+      </w:pPr>
+      <w:r>
+        <w:rPr>
+          <w:rFonts w:ascii="Arial" w:hAnsi="Arial" w:cs="Arial"/>
+          <w:sz w:val="24"/>
+          <w:szCs w:val="24"/>
+        </w:rPr>
+        <w:drawing>
+          <wp:inline distT="0" distB="0" distL="0" distR="0" wp14:anchorId="01EEF7F4" wp14:editId="784712CB">
+            <wp:extent cx="5612130" cy="2875915"/>
+            <wp:effectExtent l="0" t="0" r="7620" b="635"/>
+            <wp:docPr id="1344181920" name="Imagen 1"/>
+            <wp:cNvGraphicFramePr>
+              <a:graphicFrameLocks xmlns:a="http://schemas.openxmlformats.org/drawingml/2006/main" noChangeAspect="1"/>
+            </wp:cNvGraphicFramePr>
+            <a:graphic xmlns:a="http://schemas.openxmlformats.org/drawingml/2006/main">
+              <a:graphicData uri="http://schemas.openxmlformats.org/drawingml/2006/picture">
+                <pic:pic xmlns:pic="http://schemas.openxmlformats.org/drawingml/2006/picture">
+                  <pic:nvPicPr>
+                    <pic:cNvPr id="1344181920" name=""/>
+                    <pic:cNvPicPr/>
+                  </pic:nvPicPr>
+                  <pic:blipFill>
+                    <a:blip r:embed="rId26"/>
+                    <a:stretch>
+                      <a:fillRect/>
+                    </a:stretch>
+                  </pic:blipFill>
+                  <pic:spPr>
+                    <a:xfrm>
+                      <a:off x="0" y="0"/>
+                      <a:ext cx="5612130" cy="2875915"/>
+                    </a:xfrm>
+                    <a:prstGeom prst="rect">
+                      <a:avLst/>
+                    </a:prstGeom>
+                  </pic:spPr>
+                </pic:pic>
+              </a:graphicData>
+            </a:graphic>
+          </wp:inline>
+        </w:drawing>
+      </w:r>
+    </w:p>
+    <w:p>
+      <w:pPr>
+        <w:jc w:val="both"/>
+        <w:rPr>
+          <w:rFonts w:ascii="Arial" w:hAnsi="Arial" w:cs="Arial"/>
+          <w:sz w:val="24"/>
+          <w:szCs w:val="24"/>
+        </w:rPr>
+      </w:pPr>
+    </w:p>
+    <w:p>
+      <w:pPr>
+        <w:jc w:val="both"/>
+        <w:rPr>
+          <w:rFonts w:ascii="Arial" w:hAnsi="Arial" w:cs="Arial"/>
+          <w:sz w:val="24"/>
+          <w:szCs w:val="24"/>
+        </w:rPr>
+      </w:pPr>
+    </w:p>
+    <w:p>
+      <w:pPr>
+        <w:jc w:val="both"/>
+        <w:rPr>
+          <w:rFonts w:ascii="Arial" w:hAnsi="Arial" w:cs="Arial"/>
+          <w:b/>
+          <w:bCs/>
+          <w:sz w:val="24"/>
+          <w:szCs w:val="24"/>
+        </w:rPr>
+      </w:pPr>
+      <w:r>
+        <w:rPr>
+          <w:rFonts w:ascii="Arial" w:hAnsi="Arial" w:cs="Arial"/>
+          <w:b/>
+          <w:bCs/>
+          <w:sz w:val="24"/>
+          <w:szCs w:val="24"/>
+        </w:rPr>
+        <w:lastRenderedPageBreak/>
+        <w:t>Validación de compatibilidad entre vehículo y espacio</w:t>
+      </w:r>
+    </w:p>
+    <w:p>
+      <w:pPr>
+        <w:jc w:val="both"/>
+        <w:rPr>
+          <w:rFonts w:ascii="Arial" w:hAnsi="Arial" w:cs="Arial"/>
+          <w:sz w:val="24"/>
+          <w:szCs w:val="24"/>
+        </w:rPr>
+      </w:pPr>
+      <w:r>
+        <w:rPr>
+          <w:rFonts w:ascii="Arial" w:hAnsi="Arial" w:cs="Arial"/>
+          <w:sz w:val="24"/>
+          <w:szCs w:val="24"/>
+        </w:rPr>
+        <w:t xml:space="preserve">Se realizó una petición POST al endpoint /api/tickets intentando registrar una motocicleta en un espacio destinado para automóviles. La API respondió con el código HTTP 409 Conflict y el mensaje </w:t>
+      </w:r>
+      <w:r>
+        <w:rPr>
+          <w:rFonts w:ascii="Arial" w:hAnsi="Arial" w:cs="Arial"/>
+          <w:sz w:val="24"/>
+          <w:szCs w:val="24"/>
+        </w:rPr>
+        <w:t>“</w:t>
+      </w:r>
+      <w:r>
+        <w:rPr>
+          <w:rFonts w:ascii="Arial" w:hAnsi="Arial" w:cs="Arial"/>
+          <w:sz w:val="24"/>
+          <w:szCs w:val="24"/>
+        </w:rPr>
+        <w:t>El tipo de vehículo no coincide con el tipo de espacio</w:t>
+      </w:r>
+      <w:r>
+        <w:rPr>
+          <w:rFonts w:ascii="Arial" w:hAnsi="Arial" w:cs="Arial"/>
+          <w:sz w:val="24"/>
+          <w:szCs w:val="24"/>
+        </w:rPr>
+        <w:t>”</w:t>
+      </w:r>
+      <w:r>
+        <w:rPr>
+          <w:rFonts w:ascii="Arial" w:hAnsi="Arial" w:cs="Arial"/>
+          <w:sz w:val="24"/>
+          <w:szCs w:val="24"/>
+        </w:rPr>
+        <w:t>. Esto demuestra que el Service verifica la compatibilidad entre el tipo de vehículo y el espacio seleccionado antes de registrar el ticket.</w:t>
+      </w:r>
+    </w:p>
+    <w:p>
+      <w:pPr>
+        <w:jc w:val="both"/>
+        <w:rPr>
+          <w:rFonts w:ascii="Arial" w:hAnsi="Arial" w:cs="Arial"/>
+          <w:sz w:val="24"/>
+          <w:szCs w:val="24"/>
+        </w:rPr>
+      </w:pPr>
+      <w:r>
+        <w:rPr>
+          <w:rFonts w:ascii="Arial" w:hAnsi="Arial" w:cs="Arial"/>
+          <w:sz w:val="24"/>
+          <w:szCs w:val="24"/>
+        </w:rPr>
+        <w:drawing>
+          <wp:inline distT="0" distB="0" distL="0" distR="0" wp14:anchorId="136A6472" wp14:editId="6644C9AB">
+            <wp:extent cx="5612130" cy="2654935"/>
+            <wp:effectExtent l="0" t="0" r="7620" b="0"/>
+            <wp:docPr id="356146885" name="Imagen 1"/>
+            <wp:cNvGraphicFramePr>
+              <a:graphicFrameLocks xmlns:a="http://schemas.openxmlformats.org/drawingml/2006/main" noChangeAspect="1"/>
+            </wp:cNvGraphicFramePr>
+            <a:graphic xmlns:a="http://schemas.openxmlformats.org/drawingml/2006/main">
+              <a:graphicData uri="http://schemas.openxmlformats.org/drawingml/2006/picture">
+                <pic:pic xmlns:pic="http://schemas.openxmlformats.org/drawingml/2006/picture">
+                  <pic:nvPicPr>
+                    <pic:cNvPr id="356146885" name=""/>
+                    <pic:cNvPicPr/>
+                  </pic:nvPicPr>
+                  <pic:blipFill>
+                    <a:blip r:embed="rId27"/>
+                    <a:stretch>
+                      <a:fillRect/>
+                    </a:stretch>
+                  </pic:blipFill>
+                  <pic:spPr>
+                    <a:xfrm>
+                      <a:off x="0" y="0"/>
+                      <a:ext cx="5612130" cy="2654935"/>
+                    </a:xfrm>
+                    <a:prstGeom prst="rect">
+                      <a:avLst/>
+                    </a:prstGeom>
+                  </pic:spPr>
+                </pic:pic>
+              </a:graphicData>
+            </a:graphic>
+          </wp:inline>
+        </w:drawing>
+      </w:r>
+    </w:p>
+    <w:p>
+      <w:pPr>
+        <w:jc w:val="both"/>
+        <w:rPr>
+          <w:rFonts w:ascii="Arial" w:hAnsi="Arial" w:cs="Arial"/>
+          <w:b/>
+          <w:bCs/>
+          <w:sz w:val="24"/>
+          <w:szCs w:val="24"/>
+        </w:rPr>
+      </w:pPr>
+      <w:r>
+        <w:rPr>
+          <w:rFonts w:ascii="Arial" w:hAnsi="Arial" w:cs="Arial"/>
+          <w:b/>
+          <w:bCs/>
+          <w:sz w:val="24"/>
+          <w:szCs w:val="24"/>
+        </w:rPr>
+        <w:t>Validación de compatibilidad al actualizar un ticket</w:t>
+      </w:r>
+    </w:p>
+    <w:p>
+      <w:pPr>
+        <w:jc w:val="both"/>
+        <w:rPr>
+          <w:rFonts w:ascii="Arial" w:hAnsi="Arial" w:cs="Arial"/>
+          <w:sz w:val="24"/>
+          <w:szCs w:val="24"/>
+        </w:rPr>
+      </w:pPr>
+      <w:r>
+        <w:rPr>
+          <w:rFonts w:ascii="Arial" w:hAnsi="Arial" w:cs="Arial"/>
+          <w:sz w:val="24"/>
+          <w:szCs w:val="24"/>
+        </w:rPr>
+        <w:t xml:space="preserve">Se realizó una petición PUT al endpoint /api/tickets/1 intentando actualizar un ticket con un tipo de vehículo incompatible con el espacio asignado. La API respondió con el código HTTP 409 Conflict y el mensaje </w:t>
+      </w:r>
+      <w:r>
+        <w:rPr>
+          <w:rFonts w:ascii="Arial" w:hAnsi="Arial" w:cs="Arial"/>
+          <w:sz w:val="24"/>
+          <w:szCs w:val="24"/>
+        </w:rPr>
+        <w:t>“</w:t>
+      </w:r>
+      <w:r>
+        <w:rPr>
+          <w:rFonts w:ascii="Arial" w:hAnsi="Arial" w:cs="Arial"/>
+          <w:sz w:val="24"/>
+          <w:szCs w:val="24"/>
+        </w:rPr>
+        <w:t>El tipo de vehículo no coincide con el tipo de espacio</w:t>
+      </w:r>
+      <w:r>
+        <w:rPr>
+          <w:rFonts w:ascii="Arial" w:hAnsi="Arial" w:cs="Arial"/>
+          <w:sz w:val="24"/>
+          <w:szCs w:val="24"/>
+        </w:rPr>
+        <w:t>”</w:t>
+      </w:r>
+      <w:r>
+        <w:rPr>
+          <w:rFonts w:ascii="Arial" w:hAnsi="Arial" w:cs="Arial"/>
+          <w:sz w:val="24"/>
+          <w:szCs w:val="24"/>
+        </w:rPr>
+        <w:t>. Esto demuestra que el sistema también aplica las reglas de compatibilidad durante la actualización de tickets.</w:t>
+      </w:r>
+    </w:p>
+    <w:p>
+      <w:pPr>
+        <w:jc w:val="both"/>
+        <w:rPr>
+          <w:rFonts w:ascii="Arial" w:hAnsi="Arial" w:cs="Arial"/>
+          <w:sz w:val="24"/>
+          <w:szCs w:val="24"/>
+        </w:rPr>
+      </w:pPr>
+      <w:r>
+        <w:rPr>
+          <w:rFonts w:ascii="Arial" w:hAnsi="Arial" w:cs="Arial"/>
+          <w:sz w:val="24"/>
+          <w:szCs w:val="24"/>
+        </w:rPr>
+        <w:drawing>
+          <wp:inline distT="0" distB="0" distL="0" distR="0" wp14:anchorId="1E86E2F1" wp14:editId="6BB6C768">
+            <wp:extent cx="5612130" cy="2774315"/>
+            <wp:effectExtent l="0" t="0" r="7620" b="6985"/>
+            <wp:docPr id="160066634" name="Imagen 1"/>
+            <wp:cNvGraphicFramePr>
+              <a:graphicFrameLocks xmlns:a="http://schemas.openxmlformats.org/drawingml/2006/main" noChangeAspect="1"/>
+            </wp:cNvGraphicFramePr>
+            <a:graphic xmlns:a="http://schemas.openxmlformats.org/drawingml/2006/main">
+              <a:graphicData uri="http://schemas.openxmlformats.org/drawingml/2006/picture">
+                <pic:pic xmlns:pic="http://schemas.openxmlformats.org/drawingml/2006/picture">
+                  <pic:nvPicPr>
+                    <pic:cNvPr id="160066634" name=""/>
+                    <pic:cNvPicPr/>
+                  </pic:nvPicPr>
+                  <pic:blipFill>
+                    <a:blip r:embed="rId28"/>
+                    <a:stretch>
+                      <a:fillRect/>
+                    </a:stretch>
+                  </pic:blipFill>
+                  <pic:spPr>
+                    <a:xfrm>
+                      <a:off x="0" y="0"/>
+                      <a:ext cx="5612130" cy="2774315"/>
+                    </a:xfrm>
+                    <a:prstGeom prst="rect">
+                      <a:avLst/>
+                    </a:prstGeom>
+                  </pic:spPr>
+                </pic:pic>
+              </a:graphicData>
+            </a:graphic>
+          </wp:inline>
+        </w:drawing>
+      </w:r>
+    </w:p>
+    <w:p>
+      <w:pPr>
+        <w:jc w:val="both"/>
+        <w:rPr>
+          <w:rFonts w:ascii="Arial" w:hAnsi="Arial" w:cs="Arial"/>
+          <w:sz w:val="24"/>
+          <w:szCs w:val="24"/>
+        </w:rPr>
+      </w:pPr>
+    </w:p>
+    <w:p>
+      <w:pPr>
+        <w:jc w:val="both"/>
+        <w:rPr>
+          <w:rFonts w:ascii="Arial" w:hAnsi="Arial" w:cs="Arial"/>
+          <w:b/>
+          <w:bCs/>
+          <w:sz w:val="24"/>
+          <w:szCs w:val="24"/>
+        </w:rPr>
+      </w:pPr>
+      <w:r>
+        <w:rPr>
+          <w:rFonts w:ascii="Arial" w:hAnsi="Arial" w:cs="Arial"/>
+          <w:b/>
+          <w:bCs/>
+          <w:sz w:val="24"/>
+          <w:szCs w:val="24"/>
+        </w:rPr>
+        <w:lastRenderedPageBreak/>
+        <w:t>Registro exitoso de un ticket</w:t>
+      </w:r>
+    </w:p>
+    <w:p>
+      <w:pPr>
+        <w:jc w:val="both"/>
+        <w:rPr>
+          <w:rFonts w:ascii="Arial" w:hAnsi="Arial" w:cs="Arial"/>
+          <w:sz w:val="24"/>
+          <w:szCs w:val="24"/>
+        </w:rPr>
+      </w:pPr>
+      <w:r>
+        <w:rPr>
+          <w:rFonts w:ascii="Arial" w:hAnsi="Arial" w:cs="Arial"/>
+          <w:sz w:val="24"/>
+          <w:szCs w:val="24"/>
+        </w:rPr>
+        <w:t>Se realizó una petición POST al endpoint /api/tickets para registrar un vehículo con placa P456JKL en el espacio A-03. La API respondió con el código HTTP 201 Created, confirmando la creación del ticket con estado ACTIVO. También se comprobó que el sistema registró automáticamente la hora de entrada y actualizó el estado del espacio a ocupado.</w:t>
+      </w:r>
+    </w:p>
+    <w:p>
+      <w:pPr>
+        <w:jc w:val="both"/>
+        <w:rPr>
+          <w:rFonts w:ascii="Arial" w:hAnsi="Arial" w:cs="Arial"/>
+          <w:sz w:val="24"/>
+          <w:szCs w:val="24"/>
+        </w:rPr>
+      </w:pPr>
+      <w:r>
+        <w:rPr>
+          <w:rFonts w:ascii="Arial" w:hAnsi="Arial" w:cs="Arial"/>
+          <w:sz w:val="24"/>
+          <w:szCs w:val="24"/>
+        </w:rPr>
+        <w:drawing>
+          <wp:inline distT="0" distB="0" distL="0" distR="0" wp14:anchorId="54E0AECD" wp14:editId="052913BC">
+            <wp:extent cx="5612130" cy="4665345"/>
+            <wp:effectExtent l="0" t="0" r="7620" b="1905"/>
+            <wp:docPr id="1099401318" name="Imagen 1"/>
+            <wp:cNvGraphicFramePr>
+              <a:graphicFrameLocks xmlns:a="http://schemas.openxmlformats.org/drawingml/2006/main" noChangeAspect="1"/>
+            </wp:cNvGraphicFramePr>
+            <a:graphic xmlns:a="http://schemas.openxmlformats.org/drawingml/2006/main">
+              <a:graphicData uri="http://schemas.openxmlformats.org/drawingml/2006/picture">
+                <pic:pic xmlns:pic="http://schemas.openxmlformats.org/drawingml/2006/picture">
+                  <pic:nvPicPr>
+                    <pic:cNvPr id="1099401318" name=""/>
+                    <pic:cNvPicPr/>
+                  </pic:nvPicPr>
+                  <pic:blipFill>
+                    <a:blip r:embed="rId29"/>
+                    <a:stretch>
+                      <a:fillRect/>
+                    </a:stretch>
+                  </pic:blipFill>
+                  <pic:spPr>
+                    <a:xfrm>
+                      <a:off x="0" y="0"/>
+                      <a:ext cx="5612130" cy="4665345"/>
+                    </a:xfrm>
+                    <a:prstGeom prst="rect">
+                      <a:avLst/>
+                    </a:prstGeom>
+                  </pic:spPr>
+                </pic:pic>
+              </a:graphicData>
+            </a:graphic>
+          </wp:inline>
+        </w:drawing>
+      </w:r>
+    </w:p>
+    <w:p>
+      <w:pPr>
+        <w:jc w:val="both"/>
+        <w:rPr>
+          <w:rFonts w:ascii="Arial" w:hAnsi="Arial" w:cs="Arial"/>
+          <w:sz w:val="24"/>
+          <w:szCs w:val="24"/>
+        </w:rPr>
+      </w:pPr>
+    </w:p>
+    <w:p>
+      <w:pPr>
+        <w:jc w:val="both"/>
+        <w:rPr>
+          <w:rFonts w:ascii="Arial" w:hAnsi="Arial" w:cs="Arial"/>
+          <w:sz w:val="24"/>
+          <w:szCs w:val="24"/>
+        </w:rPr>
+      </w:pPr>
+    </w:p>
+    <w:p>
+      <w:pPr>
+        <w:jc w:val="both"/>
+        <w:rPr>
+          <w:rFonts w:ascii="Arial" w:hAnsi="Arial" w:cs="Arial"/>
+          <w:sz w:val="24"/>
+          <w:szCs w:val="24"/>
+        </w:rPr>
+      </w:pPr>
+    </w:p>
+    <w:p>
+      <w:pPr>
+        <w:jc w:val="both"/>
+        <w:rPr>
+          <w:rFonts w:ascii="Arial" w:hAnsi="Arial" w:cs="Arial"/>
+          <w:sz w:val="24"/>
+          <w:szCs w:val="24"/>
+        </w:rPr>
+      </w:pPr>
+    </w:p>
+    <w:p>
+      <w:pPr>
+        <w:jc w:val="both"/>
+        <w:rPr>
+          <w:rFonts w:ascii="Arial" w:hAnsi="Arial" w:cs="Arial"/>
+          <w:sz w:val="24"/>
+          <w:szCs w:val="24"/>
+        </w:rPr>
+      </w:pPr>
+    </w:p>
+    <w:p>
+      <w:pPr>
+        <w:jc w:val="both"/>
+        <w:rPr>
+          <w:rFonts w:ascii="Arial" w:hAnsi="Arial" w:cs="Arial"/>
+          <w:sz w:val="24"/>
+          <w:szCs w:val="24"/>
+        </w:rPr>
+      </w:pPr>
+    </w:p>
+    <w:p>
+      <w:pPr>
+        <w:jc w:val="both"/>
+        <w:rPr>
+          <w:rFonts w:ascii="Arial" w:hAnsi="Arial" w:cs="Arial"/>
+          <w:sz w:val="24"/>
+          <w:szCs w:val="24"/>
+        </w:rPr>
+      </w:pPr>
+    </w:p>
+    <w:p>
+      <w:pPr>
+        <w:jc w:val="both"/>
+        <w:rPr>
+          <w:rFonts w:ascii="Arial" w:hAnsi="Arial" w:cs="Arial"/>
+          <w:sz w:val="24"/>
+          <w:szCs w:val="24"/>
+        </w:rPr>
+      </w:pPr>
+    </w:p>
+    <w:p>
+      <w:pPr>
+        <w:jc w:val="both"/>
+        <w:rPr>
+          <w:rFonts w:ascii="Arial" w:hAnsi="Arial" w:cs="Arial"/>
+          <w:sz w:val="24"/>
+          <w:szCs w:val="24"/>
+        </w:rPr>
+      </w:pPr>
+    </w:p>
+    <w:p>
+      <w:pPr>
+        <w:jc w:val="both"/>
+        <w:rPr>
+          <w:rFonts w:ascii="Arial" w:hAnsi="Arial" w:cs="Arial"/>
+          <w:b/>
+          <w:bCs/>
+          <w:sz w:val="24"/>
+          <w:szCs w:val="24"/>
+        </w:rPr>
+      </w:pPr>
+      <w:r>
+        <w:rPr>
+          <w:rFonts w:ascii="Arial" w:hAnsi="Arial" w:cs="Arial"/>
+          <w:b/>
+          <w:bCs/>
+          <w:sz w:val="24"/>
+          <w:szCs w:val="24"/>
+        </w:rPr>
+        <w:lastRenderedPageBreak/>
+        <w:t>Finalización de ticket y cálculo del cobro</w:t>
+      </w:r>
+    </w:p>
+    <w:p>
+      <w:pPr>
+        <w:jc w:val="both"/>
+        <w:rPr>
+          <w:rFonts w:ascii="Arial" w:hAnsi="Arial" w:cs="Arial"/>
+          <w:sz w:val="24"/>
+          <w:szCs w:val="24"/>
+        </w:rPr>
+      </w:pPr>
+      <w:r>
+        <w:rPr>
+          <w:rFonts w:ascii="Arial" w:hAnsi="Arial" w:cs="Arial"/>
+          <w:sz w:val="24"/>
+          <w:szCs w:val="24"/>
+        </w:rPr>
+        <w:t>Se realizó una petición PUT al endpoint /api/tickets/5/finalizar para finalizar el registro de un vehículo. La API respondió con el código HTTP 200 OK. El sistema registró automáticamente la hora de salida, cambió el estado del ticket a FINALIZADO y calculó un total de Q8.00 correspondiente a la tarifa de automóvil. Además, actualizó el espacio A-03, dejándolo disponible nuevamente.</w:t>
+      </w:r>
+    </w:p>
+    <w:p>
+      <w:pPr>
+        <w:jc w:val="both"/>
+        <w:rPr>
+          <w:rFonts w:ascii="Arial" w:hAnsi="Arial" w:cs="Arial"/>
+          <w:sz w:val="24"/>
+          <w:szCs w:val="24"/>
+        </w:rPr>
+      </w:pPr>
+      <w:r>
+        <w:rPr>
+          <w:rFonts w:ascii="Arial" w:hAnsi="Arial" w:cs="Arial"/>
+          <w:sz w:val="24"/>
+          <w:szCs w:val="24"/>
+        </w:rPr>
+        <w:drawing>
+          <wp:inline distT="0" distB="0" distL="0" distR="0" wp14:anchorId="15B7A022" wp14:editId="7C908C37">
+            <wp:extent cx="5612130" cy="4646295"/>
+            <wp:effectExtent l="0" t="0" r="7620" b="1905"/>
+            <wp:docPr id="174991978" name="Imagen 1"/>
+            <wp:cNvGraphicFramePr>
+              <a:graphicFrameLocks xmlns:a="http://schemas.openxmlformats.org/drawingml/2006/main" noChangeAspect="1"/>
+            </wp:cNvGraphicFramePr>
+            <a:graphic xmlns:a="http://schemas.openxmlformats.org/drawingml/2006/main">
+              <a:graphicData uri="http://schemas.openxmlformats.org/drawingml/2006/picture">
+                <pic:pic xmlns:pic="http://schemas.openxmlformats.org/drawingml/2006/picture">
+                  <pic:nvPicPr>
+                    <pic:cNvPr id="174991978" name=""/>
+                    <pic:cNvPicPr/>
+                  </pic:nvPicPr>
+                  <pic:blipFill>
+                    <a:blip r:embed="rId30"/>
+                    <a:stretch>
+                      <a:fillRect/>
+                    </a:stretch>
+                  </pic:blipFill>
+                  <pic:spPr>
+                    <a:xfrm>
+                      <a:off x="0" y="0"/>
+                      <a:ext cx="5612130" cy="4646295"/>
+                    </a:xfrm>
+                    <a:prstGeom prst="rect">
+                      <a:avLst/>
+                    </a:prstGeom>
+                  </pic:spPr>
+                </pic:pic>
+              </a:graphicData>
+            </a:graphic>
+          </wp:inline>
+        </w:drawing>
+      </w:r>
+    </w:p>
+    <w:p>
+      <w:pPr>
+        <w:jc w:val="both"/>
+        <w:rPr>
+          <w:rFonts w:ascii="Arial" w:hAnsi="Arial" w:cs="Arial"/>
+          <w:sz w:val="24"/>
+          <w:szCs w:val="24"/>
+        </w:rPr>
+      </w:pPr>
+    </w:p>
+    <w:p>
+      <w:pPr>
+        <w:jc w:val="both"/>
+        <w:rPr>
+          <w:rFonts w:ascii="Arial" w:hAnsi="Arial" w:cs="Arial"/>
+          <w:sz w:val="24"/>
+          <w:szCs w:val="24"/>
+        </w:rPr>
+      </w:pPr>
+    </w:p>
+    <w:p>
+      <w:pPr>
+        <w:jc w:val="both"/>
+        <w:rPr>
+          <w:rFonts w:ascii="Arial" w:hAnsi="Arial" w:cs="Arial"/>
+          <w:sz w:val="24"/>
+          <w:szCs w:val="24"/>
+        </w:rPr>
+      </w:pPr>
+    </w:p>
+    <w:p>
+      <w:pPr>
+        <w:jc w:val="both"/>
+        <w:rPr>
+          <w:rFonts w:ascii="Arial" w:hAnsi="Arial" w:cs="Arial"/>
+          <w:sz w:val="24"/>
+          <w:szCs w:val="24"/>
+        </w:rPr>
+      </w:pPr>
+    </w:p>
+    <w:p>
+      <w:pPr>
+        <w:jc w:val="both"/>
+        <w:rPr>
+          <w:rFonts w:ascii="Arial" w:hAnsi="Arial" w:cs="Arial"/>
+          <w:sz w:val="24"/>
+          <w:szCs w:val="24"/>
+        </w:rPr>
+      </w:pPr>
+    </w:p>
+    <w:p>
+      <w:pPr>
+        <w:jc w:val="both"/>
+        <w:rPr>
+          <w:rFonts w:ascii="Arial" w:hAnsi="Arial" w:cs="Arial"/>
+          <w:sz w:val="24"/>
+          <w:szCs w:val="24"/>
+        </w:rPr>
+      </w:pPr>
+    </w:p>
+    <w:p>
+      <w:pPr>
+        <w:jc w:val="both"/>
+        <w:rPr>
+          <w:rFonts w:ascii="Arial" w:hAnsi="Arial" w:cs="Arial"/>
+          <w:sz w:val="24"/>
+          <w:szCs w:val="24"/>
+        </w:rPr>
+      </w:pPr>
+    </w:p>
+    <w:p>
+      <w:pPr>
+        <w:jc w:val="both"/>
+        <w:rPr>
+          <w:rFonts w:ascii="Arial" w:hAnsi="Arial" w:cs="Arial"/>
+          <w:sz w:val="24"/>
+          <w:szCs w:val="24"/>
+        </w:rPr>
+      </w:pPr>
+    </w:p>
+    <w:p>
+      <w:pPr>
+        <w:jc w:val="both"/>
+        <w:rPr>
+          <w:rFonts w:ascii="Arial" w:hAnsi="Arial" w:cs="Arial"/>
+          <w:sz w:val="24"/>
+          <w:szCs w:val="24"/>
+        </w:rPr>
+      </w:pPr>
+    </w:p>
+    <w:p>
+      <w:pPr>
+        <w:jc w:val="both"/>
+        <w:rPr>
+          <w:rFonts w:ascii="Arial" w:hAnsi="Arial" w:cs="Arial"/>
+          <w:b/>
+          <w:bCs/>
+          <w:sz w:val="24"/>
+          <w:szCs w:val="24"/>
+        </w:rPr>
+      </w:pPr>
+      <w:r>
+        <w:rPr>
+          <w:rFonts w:ascii="Arial" w:hAnsi="Arial" w:cs="Arial"/>
+          <w:b/>
+          <w:bCs/>
+          <w:sz w:val="24"/>
+          <w:szCs w:val="24"/>
+        </w:rPr>
+        <w:lastRenderedPageBreak/>
+        <w:t>Verificación de espacio liberado</w:t>
+      </w:r>
+    </w:p>
+    <w:p>
+      <w:pPr>
+        <w:jc w:val="both"/>
+        <w:rPr>
+          <w:rFonts w:ascii="Arial" w:hAnsi="Arial" w:cs="Arial"/>
+          <w:sz w:val="24"/>
+          <w:szCs w:val="24"/>
+        </w:rPr>
+      </w:pPr>
+      <w:r>
+        <w:rPr>
+          <w:rFonts w:ascii="Arial" w:hAnsi="Arial" w:cs="Arial"/>
+          <w:sz w:val="24"/>
+          <w:szCs w:val="24"/>
+        </w:rPr>
+        <w:t>Se realizó una petición GET al endpoint /api/espacios/disponibles después de finalizar el ticket 5. La API respondió con el código HTTP 200 OK y mostró nuevamente los 10 espacios disponibles, incluyendo el espacio A-03, cuyo atributo ocupado tiene el valor false. Esto comprueba que el sistema libera correctamente el espacio al finalizar un servicio.</w:t>
+      </w:r>
+    </w:p>
+    <w:p>
+      <w:pPr>
+        <w:jc w:val="both"/>
+        <w:rPr>
+          <w:rFonts w:ascii="Arial" w:hAnsi="Arial" w:cs="Arial"/>
+          <w:sz w:val="24"/>
+          <w:szCs w:val="24"/>
+        </w:rPr>
+      </w:pPr>
+      <w:r>
+        <w:rPr>
+          <w:rFonts w:ascii="Arial" w:hAnsi="Arial" w:cs="Arial"/>
+          <w:sz w:val="24"/>
+          <w:szCs w:val="24"/>
+        </w:rPr>
+        <w:drawing>
+          <wp:inline distT="0" distB="0" distL="0" distR="0" wp14:anchorId="6925C755" wp14:editId="324A2184">
+            <wp:extent cx="5612130" cy="4238625"/>
+            <wp:effectExtent l="0" t="0" r="7620" b="9525"/>
+            <wp:docPr id="476180503" name="Imagen 1"/>
+            <wp:cNvGraphicFramePr>
+              <a:graphicFrameLocks xmlns:a="http://schemas.openxmlformats.org/drawingml/2006/main" noChangeAspect="1"/>
+            </wp:cNvGraphicFramePr>
+            <a:graphic xmlns:a="http://schemas.openxmlformats.org/drawingml/2006/main">
+              <a:graphicData uri="http://schemas.openxmlformats.org/drawingml/2006/picture">
+                <pic:pic xmlns:pic="http://schemas.openxmlformats.org/drawingml/2006/picture">
+                  <pic:nvPicPr>
+                    <pic:cNvPr id="476180503" name=""/>
+                    <pic:cNvPicPr/>
+                  </pic:nvPicPr>
+                  <pic:blipFill>
+                    <a:blip r:embed="rId31"/>
+                    <a:stretch>
+                      <a:fillRect/>
+                    </a:stretch>
+                  </pic:blipFill>
+                  <pic:spPr>
+                    <a:xfrm>
+                      <a:off x="0" y="0"/>
+                      <a:ext cx="5612130" cy="4238625"/>
+                    </a:xfrm>
+                    <a:prstGeom prst="rect">
+                      <a:avLst/>
+                    </a:prstGeom>
+                  </pic:spPr>
+                </pic:pic>
+              </a:graphicData>
+            </a:graphic>
+          </wp:inline>
+        </w:drawing>
+      </w:r>
+    </w:p>
+    <w:p>
+      <w:pPr>
+        <w:jc w:val="both"/>
+        <w:rPr>
+          <w:rFonts w:ascii="Arial" w:hAnsi="Arial" w:cs="Arial"/>
+          <w:b/>
+          <w:bCs/>
+          <w:sz w:val="24"/>
+          <w:szCs w:val="24"/>
+        </w:rPr>
+      </w:pPr>
+    </w:p>
+    <w:p>
+      <w:pPr>
+        <w:jc w:val="both"/>
+        <w:rPr>
+          <w:rFonts w:ascii="Arial" w:hAnsi="Arial" w:cs="Arial"/>
+          <w:b/>
+          <w:bCs/>
+          <w:sz w:val="24"/>
+          <w:szCs w:val="24"/>
+        </w:rPr>
+      </w:pPr>
+    </w:p>
+    <w:p>
+      <w:pPr>
+        <w:jc w:val="both"/>
+        <w:rPr>
+          <w:rFonts w:ascii="Arial" w:hAnsi="Arial" w:cs="Arial"/>
+          <w:b/>
+          <w:bCs/>
+          <w:sz w:val="24"/>
+          <w:szCs w:val="24"/>
+        </w:rPr>
+      </w:pPr>
+    </w:p>
+    <w:p>
+      <w:pPr>
+        <w:jc w:val="both"/>
+        <w:rPr>
+          <w:rFonts w:ascii="Arial" w:hAnsi="Arial" w:cs="Arial"/>
+          <w:b/>
+          <w:bCs/>
+          <w:sz w:val="24"/>
+          <w:szCs w:val="24"/>
+        </w:rPr>
+      </w:pPr>
+    </w:p>
+    <w:p>
+      <w:pPr>
+        <w:jc w:val="both"/>
+        <w:rPr>
+          <w:rFonts w:ascii="Arial" w:hAnsi="Arial" w:cs="Arial"/>
+          <w:b/>
+          <w:bCs/>
+          <w:sz w:val="24"/>
+          <w:szCs w:val="24"/>
+        </w:rPr>
+      </w:pPr>
+    </w:p>
+    <w:p>
+      <w:pPr>
+        <w:jc w:val="both"/>
+        <w:rPr>
+          <w:rFonts w:ascii="Arial" w:hAnsi="Arial" w:cs="Arial"/>
+          <w:b/>
+          <w:bCs/>
+          <w:sz w:val="24"/>
+          <w:szCs w:val="24"/>
+        </w:rPr>
+      </w:pPr>
+    </w:p>
+    <w:p>
+      <w:pPr>
+        <w:jc w:val="both"/>
+        <w:rPr>
+          <w:rFonts w:ascii="Arial" w:hAnsi="Arial" w:cs="Arial"/>
+          <w:b/>
+          <w:bCs/>
+          <w:sz w:val="24"/>
+          <w:szCs w:val="24"/>
+        </w:rPr>
+      </w:pPr>
+    </w:p>
+    <w:p>
+      <w:pPr>
+        <w:jc w:val="both"/>
+        <w:rPr>
+          <w:rFonts w:ascii="Arial" w:hAnsi="Arial" w:cs="Arial"/>
+          <w:b/>
+          <w:bCs/>
+          <w:sz w:val="24"/>
+          <w:szCs w:val="24"/>
+        </w:rPr>
+      </w:pPr>
+    </w:p>
+    <w:p>
+      <w:pPr>
+        <w:jc w:val="both"/>
+        <w:rPr>
+          <w:rFonts w:ascii="Arial" w:hAnsi="Arial" w:cs="Arial"/>
+          <w:b/>
+          <w:bCs/>
+          <w:sz w:val="24"/>
+          <w:szCs w:val="24"/>
+        </w:rPr>
+      </w:pPr>
+    </w:p>
+    <w:p>
+      <w:pPr>
+        <w:jc w:val="both"/>
+        <w:rPr>
+          <w:rFonts w:ascii="Arial" w:hAnsi="Arial" w:cs="Arial"/>
+          <w:b/>
+          <w:bCs/>
+          <w:sz w:val="24"/>
+          <w:szCs w:val="24"/>
+        </w:rPr>
+      </w:pPr>
+    </w:p>
+    <w:p>
+      <w:pPr>
+        <w:jc w:val="both"/>
+        <w:rPr>
+          <w:rFonts w:ascii="Arial" w:hAnsi="Arial" w:cs="Arial"/>
+          <w:b/>
+          <w:bCs/>
+          <w:sz w:val="24"/>
+          <w:szCs w:val="24"/>
+        </w:rPr>
+      </w:pPr>
+    </w:p>
+    <w:p>
+      <w:pPr>
+        <w:jc w:val="both"/>
+        <w:rPr>
+          <w:rFonts w:ascii="Arial" w:hAnsi="Arial" w:cs="Arial"/>
+          <w:b/>
+          <w:bCs/>
+          <w:sz w:val="24"/>
+          <w:szCs w:val="24"/>
+        </w:rPr>
+      </w:pPr>
+      <w:r>
+        <w:rPr>
+          <w:rFonts w:ascii="Arial" w:hAnsi="Arial" w:cs="Arial"/>
+          <w:b/>
+          <w:bCs/>
+          <w:sz w:val="24"/>
+          <w:szCs w:val="24"/>
+        </w:rPr>
+        <w:lastRenderedPageBreak/>
+        <w:t>Verificación de ticket eliminado</w:t>
+      </w:r>
+    </w:p>
+    <w:p>
+      <w:pPr>
+        <w:jc w:val="both"/>
+        <w:rPr>
+          <w:rFonts w:ascii="Arial" w:hAnsi="Arial" w:cs="Arial"/>
+          <w:sz w:val="24"/>
+          <w:szCs w:val="24"/>
+        </w:rPr>
+      </w:pPr>
+      <w:r>
+        <w:rPr>
+          <w:rFonts w:ascii="Arial" w:hAnsi="Arial" w:cs="Arial"/>
+          <w:sz w:val="24"/>
+          <w:szCs w:val="24"/>
+        </w:rPr>
+        <w:t xml:space="preserve">Se realizó una petición GET al endpoint /api/tickets/5 después de aplicar la eliminación lógica del registro. La API respondió con el código HTTP 404 Not Found y el mensaje </w:t>
+      </w:r>
+      <w:r>
+        <w:rPr>
+          <w:rFonts w:ascii="Arial" w:hAnsi="Arial" w:cs="Arial"/>
+          <w:sz w:val="24"/>
+          <w:szCs w:val="24"/>
+        </w:rPr>
+        <w:t>“</w:t>
+      </w:r>
+      <w:r>
+        <w:rPr>
+          <w:rFonts w:ascii="Arial" w:hAnsi="Arial" w:cs="Arial"/>
+          <w:sz w:val="24"/>
+          <w:szCs w:val="24"/>
+        </w:rPr>
+        <w:t>No existe un ticket con el ID 5</w:t>
+      </w:r>
+      <w:r>
+        <w:rPr>
+          <w:rFonts w:ascii="Arial" w:hAnsi="Arial" w:cs="Arial"/>
+          <w:sz w:val="24"/>
+          <w:szCs w:val="24"/>
+        </w:rPr>
+        <w:t>”</w:t>
+      </w:r>
+      <w:r>
+        <w:rPr>
+          <w:rFonts w:ascii="Arial" w:hAnsi="Arial" w:cs="Arial"/>
+          <w:sz w:val="24"/>
+          <w:szCs w:val="24"/>
+        </w:rPr>
+        <w:t>. Esto demuestra que el sistema impide consultar tickets que han sido eliminados lógicamente.</w:t>
+      </w:r>
+    </w:p>
+    <w:p>
+      <w:pPr>
+        <w:jc w:val="both"/>
+        <w:rPr>
+          <w:rFonts w:ascii="Arial" w:hAnsi="Arial" w:cs="Arial"/>
+          <w:sz w:val="24"/>
+          <w:szCs w:val="24"/>
+        </w:rPr>
+      </w:pPr>
+      <w:r>
+        <w:rPr>
+          <w:rFonts w:ascii="Arial" w:hAnsi="Arial" w:cs="Arial"/>
+          <w:sz w:val="24"/>
+          <w:szCs w:val="24"/>
+        </w:rPr>
+        <w:drawing>
+          <wp:inline distT="0" distB="0" distL="0" distR="0" wp14:anchorId="1EB77064" wp14:editId="1008DF44">
+            <wp:extent cx="5612130" cy="2811145"/>
+            <wp:effectExtent l="0" t="0" r="7620" b="8255"/>
+            <wp:docPr id="1066094736" name="Imagen 1"/>
+            <wp:cNvGraphicFramePr>
+              <a:graphicFrameLocks xmlns:a="http://schemas.openxmlformats.org/drawingml/2006/main" noChangeAspect="1"/>
+            </wp:cNvGraphicFramePr>
+            <a:graphic xmlns:a="http://schemas.openxmlformats.org/drawingml/2006/main">
+              <a:graphicData uri="http://schemas.openxmlformats.org/drawingml/2006/picture">
+                <pic:pic xmlns:pic="http://schemas.openxmlformats.org/drawingml/2006/picture">
+                  <pic:nvPicPr>
+                    <pic:cNvPr id="1066094736" name=""/>
+                    <pic:cNvPicPr/>
+                  </pic:nvPicPr>
+                  <pic:blipFill>
+                    <a:blip r:embed="rId32"/>
+                    <a:stretch>
+                      <a:fillRect/>
+                    </a:stretch>
+                  </pic:blipFill>
+                  <pic:spPr>
+                    <a:xfrm>
+                      <a:off x="0" y="0"/>
+                      <a:ext cx="5612130" cy="2811145"/>
+                    </a:xfrm>
+                    <a:prstGeom prst="rect">
+                      <a:avLst/>
+                    </a:prstGeom>
+                  </pic:spPr>
+                </pic:pic>
+              </a:graphicData>
+            </a:graphic>
+          </wp:inline>
+        </w:drawing>
+      </w:r>
+    </w:p>
+    <w:p>
+      <w:pPr>
+        <w:jc w:val="both"/>
+        <w:rPr>
+          <w:rFonts w:ascii="Arial" w:hAnsi="Arial" w:cs="Arial"/>
+          <w:b/>
+          <w:bCs/>
+          <w:sz w:val="24"/>
+          <w:szCs w:val="24"/>
+        </w:rPr>
+      </w:pPr>
+      <w:r>
+        <w:rPr>
+          <w:rFonts w:ascii="Arial" w:hAnsi="Arial" w:cs="Arial"/>
+          <w:b/>
+          <w:bCs/>
+          <w:sz w:val="24"/>
+          <w:szCs w:val="24"/>
+        </w:rPr>
+        <w:t>Validación de modificación de ticket finalizado</w:t>
+      </w:r>
+    </w:p>
+    <w:p>
+      <w:pPr>
+        <w:jc w:val="both"/>
+        <w:rPr>
+          <w:rFonts w:ascii="Arial" w:hAnsi="Arial" w:cs="Arial"/>
+          <w:sz w:val="24"/>
+          <w:szCs w:val="24"/>
+        </w:rPr>
+      </w:pPr>
+      <w:r>
+        <w:rPr>
+          <w:rFonts w:ascii="Arial" w:hAnsi="Arial" w:cs="Arial"/>
+          <w:sz w:val="24"/>
+          <w:szCs w:val="24"/>
+        </w:rPr>
+        <w:t xml:space="preserve">Se realizó una petición PUT al endpoint /api/tickets/5 intentando modificar un ticket que ya se encontraba finalizado. La API respondió con el código HTTP 409 Conflict y el mensaje </w:t>
+      </w:r>
+      <w:r>
+        <w:rPr>
+          <w:rFonts w:ascii="Arial" w:hAnsi="Arial" w:cs="Arial"/>
+          <w:sz w:val="24"/>
+          <w:szCs w:val="24"/>
+        </w:rPr>
+        <w:t>“</w:t>
+      </w:r>
+      <w:r>
+        <w:rPr>
+          <w:rFonts w:ascii="Arial" w:hAnsi="Arial" w:cs="Arial"/>
+          <w:sz w:val="24"/>
+          <w:szCs w:val="24"/>
+        </w:rPr>
+        <w:t>No se puede modificar un ticket finalizado</w:t>
+      </w:r>
+      <w:r>
+        <w:rPr>
+          <w:rFonts w:ascii="Arial" w:hAnsi="Arial" w:cs="Arial"/>
+          <w:sz w:val="24"/>
+          <w:szCs w:val="24"/>
+        </w:rPr>
+        <w:t>”</w:t>
+      </w:r>
+      <w:r>
+        <w:rPr>
+          <w:rFonts w:ascii="Arial" w:hAnsi="Arial" w:cs="Arial"/>
+          <w:sz w:val="24"/>
+          <w:szCs w:val="24"/>
+        </w:rPr>
+        <w:t>. Esto demuestra que el sistema protege los registros finalizados y evita modificaciones posteriores.</w:t>
+      </w:r>
+    </w:p>
+    <w:p>
+      <w:pPr>
+        <w:jc w:val="both"/>
+        <w:rPr>
+          <w:rFonts w:ascii="Arial" w:hAnsi="Arial" w:cs="Arial"/>
+          <w:sz w:val="24"/>
+          <w:szCs w:val="24"/>
+        </w:rPr>
+      </w:pPr>
+      <w:r>
+        <w:rPr>
+          <w:rFonts w:ascii="Arial" w:hAnsi="Arial" w:cs="Arial"/>
+          <w:sz w:val="24"/>
+          <w:szCs w:val="24"/>
+        </w:rPr>
+        <w:drawing>
+          <wp:inline distT="0" distB="0" distL="0" distR="0" wp14:anchorId="1A18522A" wp14:editId="74D23265">
+            <wp:extent cx="5612130" cy="2780030"/>
+            <wp:effectExtent l="0" t="0" r="7620" b="1270"/>
+            <wp:docPr id="524424243" name="Imagen 1"/>
+            <wp:cNvGraphicFramePr>
+              <a:graphicFrameLocks xmlns:a="http://schemas.openxmlformats.org/drawingml/2006/main" noChangeAspect="1"/>
+            </wp:cNvGraphicFramePr>
+            <a:graphic xmlns:a="http://schemas.openxmlformats.org/drawingml/2006/main">
+              <a:graphicData uri="http://schemas.openxmlformats.org/drawingml/2006/picture">
+                <pic:pic xmlns:pic="http://schemas.openxmlformats.org/drawingml/2006/picture">
+                  <pic:nvPicPr>
+                    <pic:cNvPr id="524424243" name=""/>
+                    <pic:cNvPicPr/>
+                  </pic:nvPicPr>
+                  <pic:blipFill>
+                    <a:blip r:embed="rId33"/>
+                    <a:stretch>
+                      <a:fillRect/>
+                    </a:stretch>
+                  </pic:blipFill>
+                  <pic:spPr>
+                    <a:xfrm>
+                      <a:off x="0" y="0"/>
+                      <a:ext cx="5612130" cy="2780030"/>
+                    </a:xfrm>
+                    <a:prstGeom prst="rect">
+                      <a:avLst/>
+                    </a:prstGeom>
+                  </pic:spPr>
+                </pic:pic>
+              </a:graphicData>
+            </a:graphic>
+          </wp:inline>
+        </w:drawing>
+      </w:r>
+    </w:p>
+    <w:p>
+      <w:pPr>
+        <w:jc w:val="both"/>
+        <w:rPr>
+          <w:rFonts w:ascii="Arial" w:hAnsi="Arial" w:cs="Arial"/>
+          <w:sz w:val="24"/>
+          <w:szCs w:val="24"/>
+        </w:rPr>
+      </w:pPr>
+    </w:p>
+    <w:p>
+      <w:pPr>
+        <w:jc w:val="both"/>
+        <w:rPr>
+          <w:rFonts w:ascii="Arial" w:hAnsi="Arial" w:cs="Arial"/>
+          <w:sz w:val="24"/>
+          <w:szCs w:val="24"/>
+        </w:rPr>
+      </w:pPr>
+    </w:p>
+    <w:p>
+      <w:pPr>
+        <w:jc w:val="both"/>
+        <w:rPr>
+          <w:rFonts w:ascii="Arial" w:hAnsi="Arial" w:cs="Arial"/>
+          <w:b/>
+          <w:bCs/>
+          <w:sz w:val="24"/>
+          <w:szCs w:val="24"/>
+        </w:rPr>
+      </w:pPr>
+      <w:r>
+        <w:rPr>
+          <w:rFonts w:ascii="Arial" w:hAnsi="Arial" w:cs="Arial"/>
+          <w:b/>
+          <w:bCs/>
+          <w:sz w:val="24"/>
+          <w:szCs w:val="24"/>
+        </w:rPr>
+        <w:lastRenderedPageBreak/>
+        <w:t>Eliminación lógica de ticket finalizado</w:t>
+      </w:r>
+    </w:p>
+    <w:p>
+      <w:pPr>
+        <w:jc w:val="both"/>
+        <w:rPr>
+          <w:rFonts w:ascii="Arial" w:hAnsi="Arial" w:cs="Arial"/>
+          <w:sz w:val="24"/>
+          <w:szCs w:val="24"/>
+        </w:rPr>
+      </w:pPr>
+      <w:r>
+        <w:rPr>
+          <w:rFonts w:ascii="Arial" w:hAnsi="Arial" w:cs="Arial"/>
+          <w:sz w:val="24"/>
+          <w:szCs w:val="24"/>
+        </w:rPr>
+        <w:t>Se realizó una petición DELETE al endpoint /api/tickets/5 para eliminar un ticket que se encontraba en estado FINALIZADO. La API respondió con el código HTTP 204 No Content, indicando que la operación se completó correctamente. El sistema aplicó una eliminación lógica, conservando el registro en la base de datos y marcándolo como eliminado.</w:t>
+      </w:r>
+    </w:p>
+    <w:p>
+      <w:pPr>
+        <w:jc w:val="both"/>
+        <w:rPr>
+          <w:rFonts w:ascii="Arial" w:hAnsi="Arial" w:cs="Arial"/>
+          <w:sz w:val="24"/>
+          <w:szCs w:val="24"/>
+        </w:rPr>
+      </w:pPr>
+      <w:r>
+        <w:rPr>
+          <w:rFonts w:ascii="Arial" w:hAnsi="Arial" w:cs="Arial"/>
+          <w:sz w:val="24"/>
+          <w:szCs w:val="24"/>
+        </w:rPr>
+        <w:drawing>
+          <wp:inline distT="0" distB="0" distL="0" distR="0" wp14:anchorId="10054EA9" wp14:editId="1CBB54E3">
+            <wp:extent cx="5612130" cy="2451100"/>
+            <wp:effectExtent l="0" t="0" r="7620" b="6350"/>
+            <wp:docPr id="749175256" name="Imagen 1"/>
+            <wp:cNvGraphicFramePr>
+              <a:graphicFrameLocks xmlns:a="http://schemas.openxmlformats.org/drawingml/2006/main" noChangeAspect="1"/>
+            </wp:cNvGraphicFramePr>
+            <a:graphic xmlns:a="http://schemas.openxmlformats.org/drawingml/2006/main">
+              <a:graphicData uri="http://schemas.openxmlformats.org/drawingml/2006/picture">
+                <pic:pic xmlns:pic="http://schemas.openxmlformats.org/drawingml/2006/picture">
+                  <pic:nvPicPr>
+                    <pic:cNvPr id="749175256" name=""/>
+                    <pic:cNvPicPr/>
+                  </pic:nvPicPr>
+                  <pic:blipFill>
+                    <a:blip r:embed="rId34"/>
+                    <a:stretch>
+                      <a:fillRect/>
+                    </a:stretch>
+                  </pic:blipFill>
+                  <pic:spPr>
+                    <a:xfrm>
+                      <a:off x="0" y="0"/>
+                      <a:ext cx="5612130" cy="2451100"/>
+                    </a:xfrm>
+                    <a:prstGeom prst="rect">
+                      <a:avLst/>
+                    </a:prstGeom>
+                  </pic:spPr>
+                </pic:pic>
+              </a:graphicData>
+            </a:graphic>
+          </wp:inline>
+        </w:drawing>
+      </w:r>
+    </w:p>
+    <w:p>
+      <w:pPr>
+        <w:jc w:val="both"/>
+        <w:rPr>
+          <w:rFonts w:ascii="Arial" w:hAnsi="Arial" w:cs="Arial"/>
+          <w:b/>
+          <w:bCs/>
+          <w:sz w:val="24"/>
+          <w:szCs w:val="24"/>
+        </w:rPr>
+      </w:pPr>
+      <w:r>
+        <w:rPr>
+          <w:rFonts w:ascii="Arial" w:hAnsi="Arial" w:cs="Arial"/>
+          <w:b/>
+          <w:bCs/>
+          <w:sz w:val="24"/>
+          <w:szCs w:val="24"/>
+        </w:rPr>
+        <w:t>Verificación de espacios almacenados en PostgreSQL</w:t>
+      </w:r>
+    </w:p>
+    <w:p>
+      <w:pPr>
+        <w:jc w:val="both"/>
+        <w:rPr>
+          <w:rFonts w:ascii="Arial" w:hAnsi="Arial" w:cs="Arial"/>
+          <w:sz w:val="24"/>
+          <w:szCs w:val="24"/>
+        </w:rPr>
+      </w:pPr>
+      <w:r>
+        <w:rPr>
+          <w:rFonts w:ascii="Arial" w:hAnsi="Arial" w:cs="Arial"/>
+          <w:sz w:val="24"/>
+          <w:szCs w:val="24"/>
+        </w:rPr>
+        <w:t xml:space="preserve">Se ejecutó una consulta SQL sobre la tabla </w:t>
+      </w:r>
+      <w:r>
+        <w:rPr>
+          <w:rFonts w:ascii="Arial" w:hAnsi="Arial" w:cs="Arial"/>
+          <w:b/>
+          <w:bCs/>
+          <w:sz w:val="24"/>
+          <w:szCs w:val="24"/>
+        </w:rPr>
+        <w:t>espacio</w:t>
+      </w:r>
+      <w:r>
+        <w:rPr>
+          <w:rFonts w:ascii="Arial" w:hAnsi="Arial" w:cs="Arial"/>
+          <w:sz w:val="24"/>
+          <w:szCs w:val="24"/>
+        </w:rPr>
+        <w:t xml:space="preserve"> para verificar los registros almacenados en PostgreSQL. Se encontraron 11 espacios, de los cuales uno se encuentra ocupado y diez disponibles. También se comprobó que el espacio A-01 permanece ocupado y que A-03 fue liberado después de finalizar el ticket 5.</w:t>
+      </w:r>
+    </w:p>
+    <w:p>
+      <w:pPr>
+        <w:jc w:val="both"/>
+        <w:rPr>
+          <w:rFonts w:ascii="Arial" w:hAnsi="Arial" w:cs="Arial"/>
+          <w:sz w:val="24"/>
+          <w:szCs w:val="24"/>
+        </w:rPr>
+      </w:pPr>
+      <w:r>
+        <w:rPr>
+          <w:rFonts w:ascii="Arial" w:hAnsi="Arial" w:cs="Arial"/>
+          <w:sz w:val="24"/>
+          <w:szCs w:val="24"/>
+        </w:rPr>
+        <w:drawing>
+          <wp:inline distT="0" distB="0" distL="0" distR="0" wp14:anchorId="1B30FF48" wp14:editId="25468EB6">
+            <wp:extent cx="5612130" cy="3202305"/>
+            <wp:effectExtent l="0" t="0" r="7620" b="0"/>
+            <wp:docPr id="47066225" name="Imagen 1"/>
+            <wp:cNvGraphicFramePr>
+              <a:graphicFrameLocks xmlns:a="http://schemas.openxmlformats.org/drawingml/2006/main" noChangeAspect="1"/>
+            </wp:cNvGraphicFramePr>
+            <a:graphic xmlns:a="http://schemas.openxmlformats.org/drawingml/2006/main">
+              <a:graphicData uri="http://schemas.openxmlformats.org/drawingml/2006/picture">
+                <pic:pic xmlns:pic="http://schemas.openxmlformats.org/drawingml/2006/picture">
+                  <pic:nvPicPr>
+                    <pic:cNvPr id="47066225" name=""/>
+                    <pic:cNvPicPr/>
+                  </pic:nvPicPr>
+                  <pic:blipFill>
+                    <a:blip r:embed="rId35"/>
+                    <a:stretch>
+                      <a:fillRect/>
+                    </a:stretch>
+                  </pic:blipFill>
+                  <pic:spPr>
+                    <a:xfrm>
+                      <a:off x="0" y="0"/>
+                      <a:ext cx="5612130" cy="3202305"/>
+                    </a:xfrm>
+                    <a:prstGeom prst="rect">
+                      <a:avLst/>
+                    </a:prstGeom>
+                  </pic:spPr>
+                </pic:pic>
+              </a:graphicData>
+            </a:graphic>
+          </wp:inline>
+        </w:drawing>
+      </w:r>
+    </w:p>
+    <w:p>
+      <w:pPr>
+        <w:jc w:val="both"/>
+        <w:rPr>
+          <w:rFonts w:ascii="Arial" w:hAnsi="Arial" w:cs="Arial"/>
+          <w:sz w:val="24"/>
+          <w:szCs w:val="24"/>
+        </w:rPr>
+      </w:pPr>
+    </w:p>
+    <w:p>
+      <w:pPr>
+        <w:jc w:val="both"/>
+        <w:rPr>
+          <w:rFonts w:ascii="Arial" w:hAnsi="Arial" w:cs="Arial"/>
+          <w:b/>
+          <w:bCs/>
+          <w:sz w:val="24"/>
+          <w:szCs w:val="24"/>
+        </w:rPr>
+      </w:pPr>
+      <w:r>
+        <w:rPr>
+          <w:rFonts w:ascii="Arial" w:hAnsi="Arial" w:cs="Arial"/>
+          <w:b/>
+          <w:bCs/>
+          <w:sz w:val="24"/>
+          <w:szCs w:val="24"/>
+        </w:rPr>
+        <w:lastRenderedPageBreak/>
+        <w:t>Verificación de tickets almacenados y eliminación lógica en PostgreSQL</w:t>
+      </w:r>
+    </w:p>
+    <w:p>
+      <w:pPr>
+        <w:jc w:val="both"/>
+        <w:rPr>
+          <w:rFonts w:ascii="Arial" w:hAnsi="Arial" w:cs="Arial"/>
+          <w:sz w:val="24"/>
+          <w:szCs w:val="24"/>
+        </w:rPr>
+      </w:pPr>
+      <w:r>
+        <w:rPr>
+          <w:rFonts w:ascii="Arial" w:hAnsi="Arial" w:cs="Arial"/>
+          <w:sz w:val="24"/>
+          <w:szCs w:val="24"/>
+        </w:rPr>
+        <w:t xml:space="preserve">Se ejecutó una consulta SQL sobre la tabla </w:t>
+      </w:r>
+      <w:r>
+        <w:rPr>
+          <w:rFonts w:ascii="Arial" w:hAnsi="Arial" w:cs="Arial"/>
+          <w:b/>
+          <w:bCs/>
+          <w:sz w:val="24"/>
+          <w:szCs w:val="24"/>
+        </w:rPr>
+        <w:t>ticket</w:t>
+      </w:r>
+      <w:r>
+        <w:rPr>
+          <w:rFonts w:ascii="Arial" w:hAnsi="Arial" w:cs="Arial"/>
+          <w:sz w:val="24"/>
+          <w:szCs w:val="24"/>
+        </w:rPr>
+        <w:t xml:space="preserve"> para verificar los registros almacenados en PostgreSQL. Se encontraron cinco tickets, incluyendo registros activos, finalizados y eliminados lógicamente. Se comprobó que los tickets 3 y 5 conservan su información en la base de datos, pero tienen el campo eliminado en true. Esto demuestra que el sistema implementa correctamente la eliminación lógica de tickets.</w:t>
+      </w:r>
+    </w:p>
+    <w:p>
+      <w:pPr>
+        <w:jc w:val="both"/>
+        <w:rPr>
+          <w:rFonts w:ascii="Arial" w:hAnsi="Arial" w:cs="Arial"/>
+          <w:sz w:val="24"/>
+          <w:szCs w:val="24"/>
+        </w:rPr>
+      </w:pPr>
+      <w:r>
+        <w:rPr>
+          <w:rFonts w:ascii="Arial" w:hAnsi="Arial" w:cs="Arial"/>
+          <w:sz w:val="24"/>
+          <w:szCs w:val="24"/>
+        </w:rPr>
+        <w:drawing>
+          <wp:inline distT="0" distB="0" distL="0" distR="0" wp14:anchorId="59F25EC4" wp14:editId="4710BE1C">
+            <wp:extent cx="5612130" cy="1451610"/>
+            <wp:effectExtent l="0" t="0" r="7620" b="0"/>
+            <wp:docPr id="553307091" name="Imagen 1"/>
+            <wp:cNvGraphicFramePr>
+              <a:graphicFrameLocks xmlns:a="http://schemas.openxmlformats.org/drawingml/2006/main" noChangeAspect="1"/>
+            </wp:cNvGraphicFramePr>
+            <a:graphic xmlns:a="http://schemas.openxmlformats.org/drawingml/2006/main">
+              <a:graphicData uri="http://schemas.openxmlformats.org/drawingml/2006/picture">
+                <pic:pic xmlns:pic="http://schemas.openxmlformats.org/drawingml/2006/picture">
+                  <pic:nvPicPr>
+                    <pic:cNvPr id="553307091" name=""/>
+                    <pic:cNvPicPr/>
+                  </pic:nvPicPr>
+                  <pic:blipFill>
+                    <a:blip r:embed="rId36"/>
+                    <a:stretch>
+                      <a:fillRect/>
+                    </a:stretch>
+                  </pic:blipFill>
+                  <pic:spPr>
+                    <a:xfrm>
+                      <a:off x="0" y="0"/>
+                      <a:ext cx="5612130" cy="1451610"/>
+                    </a:xfrm>
+                    <a:prstGeom prst="rect">
+                      <a:avLst/>
+                    </a:prstGeom>
+                  </pic:spPr>
+                </pic:pic>
+              </a:graphicData>
+            </a:graphic>
+          </wp:inline>
+        </w:drawing>
+      </w:r>
+    </w:p>
+    <w:p>
+      <w:pPr>
+        <w:jc w:val="both"/>
+        <w:rPr>
+          <w:rFonts w:ascii="Arial" w:hAnsi="Arial" w:cs="Arial"/>
+          <w:sz w:val="24"/>
+          <w:szCs w:val="24"/>
+        </w:rPr>
+      </w:pPr>
+    </w:p>
+    <w:p>
+      <w:pPr>
+        <w:spacing w:after="0" w:line="240" w:lineRule="auto"/>
+        <w:jc w:val="both"/>
+        <w:rPr>
+          <w:rFonts w:ascii="Arial" w:hAnsi="Arial" w:cs="Arial"/>
+          <w:b/>
+          <w:bCs/>
+          <w:sz w:val="24"/>
+          <w:szCs w:val="24"/>
+        </w:rPr>
+      </w:pPr>
+      <w:r>
+        <w:rPr>
+          <w:rFonts w:ascii="Arial" w:hAnsi="Arial" w:cs="Arial"/>
+          <w:b/>
+          <w:bCs/>
+          <w:sz w:val="24"/>
+          <w:szCs w:val="24"/>
+        </w:rPr>
+        <w:t>Resultados del desarrollo del segundo avance</w:t>
+      </w:r>
+    </w:p>
+    <w:p>
+      <w:pPr>
+        <w:spacing w:after="0" w:line="240" w:lineRule="auto"/>
+        <w:jc w:val="both"/>
+        <w:rPr>
+          <w:rFonts w:ascii="Arial" w:hAnsi="Arial" w:cs="Arial"/>
+          <w:sz w:val="24"/>
+          <w:szCs w:val="24"/>
+        </w:rPr>
+      </w:pPr>
+    </w:p>
+    <w:p>
+      <w:pPr>
+        <w:spacing w:after="0" w:line="240" w:lineRule="auto"/>
+        <w:jc w:val="both"/>
+        <w:rPr>
+          <w:rFonts w:ascii="Arial" w:hAnsi="Arial" w:cs="Arial"/>
+          <w:sz w:val="24"/>
+          <w:szCs w:val="24"/>
+        </w:rPr>
+      </w:pPr>
+      <w:r>
+        <w:rPr>
+          <w:rFonts w:ascii="Arial" w:hAnsi="Arial" w:cs="Arial"/>
+          <w:sz w:val="24"/>
+          <w:szCs w:val="24"/>
+        </w:rPr>
+        <w:t>Durante el segundo avance se fortaleció el backend del sistema de control de estacionamiento mediante la implementación de una arquitectura organizada por capas, utilizando Spring Boot, Spring Data JPA y PostgreSQL.</w:t>
+      </w:r>
+    </w:p>
+    <w:p>
+      <w:pPr>
+        <w:spacing w:after="0" w:line="240" w:lineRule="auto"/>
+        <w:jc w:val="both"/>
+        <w:rPr>
+          <w:rFonts w:ascii="Arial" w:hAnsi="Arial" w:cs="Arial"/>
+          <w:sz w:val="24"/>
+          <w:szCs w:val="24"/>
+        </w:rPr>
+      </w:pPr>
+    </w:p>
+    <w:p>
+      <w:pPr>
+        <w:spacing w:after="0" w:line="240" w:lineRule="auto"/>
+        <w:jc w:val="both"/>
+        <w:rPr>
+          <w:rFonts w:ascii="Arial" w:hAnsi="Arial" w:cs="Arial"/>
+          <w:sz w:val="24"/>
+          <w:szCs w:val="24"/>
+        </w:rPr>
+      </w:pPr>
+      <w:r>
+        <w:rPr>
+          <w:rFonts w:ascii="Arial" w:hAnsi="Arial" w:cs="Arial"/>
+          <w:sz w:val="24"/>
+          <w:szCs w:val="24"/>
+        </w:rPr>
+        <w:t>Se desarrollaron las operaciones principales para registrar, consultar, actualizar, finalizar y eliminar tickets. También se implementaron las operaciones para registrar y consultar espacios de estacionamiento.</w:t>
+      </w:r>
+    </w:p>
+    <w:p>
+      <w:pPr>
+        <w:spacing w:after="0" w:line="240" w:lineRule="auto"/>
+        <w:jc w:val="both"/>
+        <w:rPr>
+          <w:rFonts w:ascii="Arial" w:hAnsi="Arial" w:cs="Arial"/>
+          <w:sz w:val="24"/>
+          <w:szCs w:val="24"/>
+        </w:rPr>
+      </w:pPr>
+    </w:p>
+    <w:p>
+      <w:pPr>
+        <w:spacing w:after="0" w:line="240" w:lineRule="auto"/>
+        <w:jc w:val="both"/>
+        <w:rPr>
+          <w:rFonts w:ascii="Arial" w:hAnsi="Arial" w:cs="Arial"/>
+          <w:sz w:val="24"/>
+          <w:szCs w:val="24"/>
+        </w:rPr>
+      </w:pPr>
+      <w:r>
+        <w:rPr>
+          <w:rFonts w:ascii="Arial" w:hAnsi="Arial" w:cs="Arial"/>
+          <w:sz w:val="24"/>
+          <w:szCs w:val="24"/>
+        </w:rPr>
+        <w:t>Se estableció la relación entre las entidades Espacio y Ticket mediante una relación de muchos a uno (ManyToOne), permitiendo asociar cada ticket con un espacio determinado.</w:t>
+      </w:r>
+    </w:p>
+    <w:p>
+      <w:pPr>
+        <w:spacing w:after="0" w:line="240" w:lineRule="auto"/>
+        <w:jc w:val="both"/>
+        <w:rPr>
+          <w:rFonts w:ascii="Arial" w:hAnsi="Arial" w:cs="Arial"/>
+          <w:sz w:val="24"/>
+          <w:szCs w:val="24"/>
+        </w:rPr>
+      </w:pPr>
+    </w:p>
+    <w:p>
+      <w:pPr>
+        <w:spacing w:after="0" w:line="240" w:lineRule="auto"/>
+        <w:jc w:val="both"/>
+        <w:rPr>
+          <w:rFonts w:ascii="Arial" w:hAnsi="Arial" w:cs="Arial"/>
+          <w:sz w:val="24"/>
+          <w:szCs w:val="24"/>
+        </w:rPr>
+      </w:pPr>
+      <w:r>
+        <w:rPr>
+          <w:rFonts w:ascii="Arial" w:hAnsi="Arial" w:cs="Arial"/>
+          <w:sz w:val="24"/>
+          <w:szCs w:val="24"/>
+        </w:rPr>
+        <w:t>Se incorporaron objetos DTO y validaciones para controlar los datos recibidos, evitando registros con información incompleta o incorrecta.</w:t>
+      </w:r>
+    </w:p>
+    <w:p>
+      <w:pPr>
+        <w:spacing w:after="0" w:line="240" w:lineRule="auto"/>
+        <w:jc w:val="both"/>
+        <w:rPr>
+          <w:rFonts w:ascii="Arial" w:hAnsi="Arial" w:cs="Arial"/>
+          <w:sz w:val="24"/>
+          <w:szCs w:val="24"/>
+        </w:rPr>
+      </w:pPr>
+    </w:p>
+    <w:p>
+      <w:pPr>
+        <w:spacing w:after="0" w:line="240" w:lineRule="auto"/>
+        <w:jc w:val="both"/>
+        <w:rPr>
+          <w:rFonts w:ascii="Arial" w:hAnsi="Arial" w:cs="Arial"/>
+          <w:sz w:val="24"/>
+          <w:szCs w:val="24"/>
+        </w:rPr>
+      </w:pPr>
+      <w:r>
+        <w:rPr>
+          <w:rFonts w:ascii="Arial" w:hAnsi="Arial" w:cs="Arial"/>
+          <w:sz w:val="24"/>
+          <w:szCs w:val="24"/>
+        </w:rPr>
+        <w:t>Asimismo, se desarrollaron reglas de negocio para impedir la asignación de espacios ocupados, comprobar la compatibilidad entre el tipo de vehículo y el espacio, calcular el importe del estacionamiento y liberar el espacio al finalizar un ticket.</w:t>
+      </w:r>
+    </w:p>
+    <w:p>
+      <w:pPr>
+        <w:spacing w:after="0" w:line="240" w:lineRule="auto"/>
+        <w:jc w:val="both"/>
+        <w:rPr>
+          <w:rFonts w:ascii="Arial" w:hAnsi="Arial" w:cs="Arial"/>
+          <w:sz w:val="24"/>
+          <w:szCs w:val="24"/>
+        </w:rPr>
+      </w:pPr>
+    </w:p>
+    <w:p>
+      <w:pPr>
+        <w:spacing w:after="0" w:line="240" w:lineRule="auto"/>
+        <w:jc w:val="both"/>
+        <w:rPr>
+          <w:rFonts w:ascii="Arial" w:hAnsi="Arial" w:cs="Arial"/>
+          <w:sz w:val="24"/>
+          <w:szCs w:val="24"/>
+        </w:rPr>
+      </w:pPr>
+      <w:r>
+        <w:rPr>
+          <w:rFonts w:ascii="Arial" w:hAnsi="Arial" w:cs="Arial"/>
+          <w:sz w:val="24"/>
+          <w:szCs w:val="24"/>
+        </w:rPr>
+        <w:t>Finalmente, se implementaron consultas específicas para conocer los espacios disponibles, los tickets activos y finalizados, así como la recaudación del día. Estas funcionalidades fueron verificadas mediante pruebas en Postman y consultas directas en PostgreSQL.</w:t>
+      </w:r>
+    </w:p>
+    <w:p>
+      <w:pPr>
+        <w:spacing w:after="0" w:line="240" w:lineRule="auto"/>
+        <w:jc w:val="both"/>
+        <w:rPr>
+          <w:rFonts w:ascii="Arial" w:hAnsi="Arial" w:cs="Arial"/>
+          <w:sz w:val="24"/>
+          <w:szCs w:val="24"/>
+        </w:rPr>
+      </w:pPr>
+    </w:p>
+    <w:p>
+      <w:pPr>
+        <w:spacing w:after="0" w:line="240" w:lineRule="auto"/>
+        <w:jc w:val="both"/>
+        <w:rPr>
+          <w:rFonts w:ascii="Arial" w:hAnsi="Arial" w:cs="Arial"/>
+          <w:sz w:val="24"/>
+          <w:szCs w:val="24"/>
+        </w:rPr>
+      </w:pPr>
+      <w:r>
+        <w:rPr>
+          <w:rFonts w:ascii="Arial" w:hAnsi="Arial" w:cs="Arial"/>
+          <w:sz w:val="24"/>
+          <w:szCs w:val="24"/>
+        </w:rPr>
+        <w:t>Como resultado, se cuenta con un backend funcional que cumple con los componentes principales para el segundo avance y proporciona la base para continuar con las funcionalidades restantes del proyecto.</w:t>
+      </w:r>
+    </w:p>
     <w:sectPr>
       <w:pgSz w:w="12240" w:h="15840"/>
       <w:pgMar w:top="1417" w:right="1701" w:bottom="568" w:left="1701" w:header="708" w:footer="708" w:gutter="0"/>
@@ -1757,8 +5691,124 @@
       </w:rPr>
     </w:lvl>
   </w:abstractNum>
+  <w:abstractNum w:abstractNumId="1" w15:restartNumberingAfterBreak="0">
+    <w:nsid w:val="693F6283"/>
+    <w:multiLevelType w:val="hybridMultilevel"/>
+    <w:tmpl w:val="FEEA0D36"/>
+    <w:lvl w:ilvl="0" w:tplc="100A000D">
+      <w:start w:val="1"/>
+      <w:numFmt w:val="bullet"/>
+      <w:lvlText w:val=""/>
+      <w:lvlJc w:val="left"/>
+      <w:pPr>
+        <w:ind w:left="720" w:hanging="360"/>
+      </w:pPr>
+      <w:rPr>
+        <w:rFonts w:ascii="Wingdings" w:hAnsi="Wingdings" w:hint="default"/>
+      </w:rPr>
+    </w:lvl>
+    <w:lvl w:ilvl="1" w:tplc="100A0003" w:tentative="1">
+      <w:start w:val="1"/>
+      <w:numFmt w:val="bullet"/>
+      <w:lvlText w:val="o"/>
+      <w:lvlJc w:val="left"/>
+      <w:pPr>
+        <w:ind w:left="1440" w:hanging="360"/>
+      </w:pPr>
+      <w:rPr>
+        <w:rFonts w:ascii="Courier New" w:hAnsi="Courier New" w:cs="Courier New" w:hint="default"/>
+      </w:rPr>
+    </w:lvl>
+    <w:lvl w:ilvl="2" w:tplc="100A0005" w:tentative="1">
+      <w:start w:val="1"/>
+      <w:numFmt w:val="bullet"/>
+      <w:lvlText w:val=""/>
+      <w:lvlJc w:val="left"/>
+      <w:pPr>
+        <w:ind w:left="2160" w:hanging="360"/>
+      </w:pPr>
+      <w:rPr>
+        <w:rFonts w:ascii="Wingdings" w:hAnsi="Wingdings" w:hint="default"/>
+      </w:rPr>
+    </w:lvl>
+    <w:lvl w:ilvl="3" w:tplc="100A0001" w:tentative="1">
+      <w:start w:val="1"/>
+      <w:numFmt w:val="bullet"/>
+      <w:lvlText w:val=""/>
+      <w:lvlJc w:val="left"/>
+      <w:pPr>
+        <w:ind w:left="2880" w:hanging="360"/>
+      </w:pPr>
+      <w:rPr>
+        <w:rFonts w:ascii="Symbol" w:hAnsi="Symbol" w:hint="default"/>
+      </w:rPr>
+    </w:lvl>
+    <w:lvl w:ilvl="4" w:tplc="100A0003" w:tentative="1">
+      <w:start w:val="1"/>
+      <w:numFmt w:val="bullet"/>
+      <w:lvlText w:val="o"/>
+      <w:lvlJc w:val="left"/>
+      <w:pPr>
+        <w:ind w:left="3600" w:hanging="360"/>
+      </w:pPr>
+      <w:rPr>
+        <w:rFonts w:ascii="Courier New" w:hAnsi="Courier New" w:cs="Courier New" w:hint="default"/>
+      </w:rPr>
+    </w:lvl>
+    <w:lvl w:ilvl="5" w:tplc="100A0005" w:tentative="1">
+      <w:start w:val="1"/>
+      <w:numFmt w:val="bullet"/>
+      <w:lvlText w:val=""/>
+      <w:lvlJc w:val="left"/>
+      <w:pPr>
+        <w:ind w:left="4320" w:hanging="360"/>
+      </w:pPr>
+      <w:rPr>
+        <w:rFonts w:ascii="Wingdings" w:hAnsi="Wingdings" w:hint="default"/>
+      </w:rPr>
+    </w:lvl>
+    <w:lvl w:ilvl="6" w:tplc="100A0001" w:tentative="1">
+      <w:start w:val="1"/>
+      <w:numFmt w:val="bullet"/>
+      <w:lvlText w:val=""/>
+      <w:lvlJc w:val="left"/>
+      <w:pPr>
+        <w:ind w:left="5040" w:hanging="360"/>
+      </w:pPr>
+      <w:rPr>
+        <w:rFonts w:ascii="Symbol" w:hAnsi="Symbol" w:hint="default"/>
+      </w:rPr>
+    </w:lvl>
+    <w:lvl w:ilvl="7" w:tplc="100A0003" w:tentative="1">
+      <w:start w:val="1"/>
+      <w:numFmt w:val="bullet"/>
+      <w:lvlText w:val="o"/>
+      <w:lvlJc w:val="left"/>
+      <w:pPr>
+        <w:ind w:left="5760" w:hanging="360"/>
+      </w:pPr>
+      <w:rPr>
+        <w:rFonts w:ascii="Courier New" w:hAnsi="Courier New" w:cs="Courier New" w:hint="default"/>
+      </w:rPr>
+    </w:lvl>
+    <w:lvl w:ilvl="8" w:tplc="100A0005" w:tentative="1">
+      <w:start w:val="1"/>
+      <w:numFmt w:val="bullet"/>
+      <w:lvlText w:val=""/>
+      <w:lvlJc w:val="left"/>
+      <w:pPr>
+        <w:ind w:left="6480" w:hanging="360"/>
+      </w:pPr>
+      <w:rPr>
+        <w:rFonts w:ascii="Wingdings" w:hAnsi="Wingdings" w:hint="default"/>
+      </w:rPr>
+    </w:lvl>
+  </w:abstractNum>
   <w:num w:numId="1" w16cid:durableId="2139949709">
     <w:abstractNumId w:val="0"/>
+  </w:num>
+  <w:num w:numId="2" w16cid:durableId="342324624">
+    <w:abstractNumId w:val="1"/>
   </w:num>
 </w:numbering>
 </file>
@@ -2366,7 +6416,6 @@
   <w:style w:type="character" w:default="1" w:styleId="Fuentedeprrafopredeter">
     <w:name w:val="Default Paragraph Font"/>
     <w:uiPriority w:val="1"/>
-    <w:semiHidden/>
     <w:unhideWhenUsed/>
   </w:style>
   <w:style w:type="table" w:default="1" w:styleId="Tablanormal">

</xml_diff>

<commit_message>
Completar evidencias y ajustes finales del proyecto
</commit_message>
<xml_diff>
--- a/evidencias/Evidencias.docx
+++ b/evidencias/Evidencias.docx
@@ -948,168 +948,114 @@
           <w:bCs/>
           <w:sz w:val="24"/>
           <w:szCs w:val="24"/>
-          <w:lang w:val="en-US"/>
-        </w:rPr>
-      </w:pPr>
-    </w:p>
-    <w:p>
-      <w:pPr>
-        <w:jc w:val="both"/>
-        <w:rPr>
-          <w:rFonts w:ascii="Arial" w:hAnsi="Arial" w:cs="Arial"/>
-          <w:b/>
-          <w:bCs/>
-          <w:sz w:val="24"/>
-          <w:szCs w:val="24"/>
-          <w:lang w:val="en-US"/>
-        </w:rPr>
-      </w:pPr>
-    </w:p>
-    <w:p>
-      <w:pPr>
-        <w:jc w:val="both"/>
-        <w:rPr>
-          <w:rFonts w:ascii="Arial" w:hAnsi="Arial" w:cs="Arial"/>
-          <w:b/>
-          <w:bCs/>
-          <w:sz w:val="24"/>
-          <w:szCs w:val="24"/>
-          <w:lang w:val="en-US"/>
-        </w:rPr>
-      </w:pPr>
-    </w:p>
-    <w:p>
-      <w:pPr>
-        <w:jc w:val="both"/>
-        <w:rPr>
-          <w:rFonts w:ascii="Arial" w:hAnsi="Arial" w:cs="Arial"/>
-          <w:b/>
-          <w:bCs/>
-          <w:sz w:val="24"/>
-          <w:szCs w:val="24"/>
-          <w:lang w:val="en-US"/>
-        </w:rPr>
-      </w:pPr>
-    </w:p>
-    <w:p>
-      <w:pPr>
-        <w:jc w:val="both"/>
-        <w:rPr>
-          <w:rFonts w:ascii="Arial" w:hAnsi="Arial" w:cs="Arial"/>
-          <w:b/>
-          <w:bCs/>
-          <w:sz w:val="24"/>
-          <w:szCs w:val="24"/>
-          <w:lang w:val="en-US"/>
-        </w:rPr>
-      </w:pPr>
-    </w:p>
-    <w:p>
-      <w:pPr>
-        <w:jc w:val="both"/>
-        <w:rPr>
-          <w:rFonts w:ascii="Arial" w:hAnsi="Arial" w:cs="Arial"/>
-          <w:b/>
-          <w:bCs/>
-          <w:sz w:val="24"/>
-          <w:szCs w:val="24"/>
-          <w:lang w:val="en-US"/>
-        </w:rPr>
-      </w:pPr>
-    </w:p>
-    <w:p>
-      <w:pPr>
-        <w:jc w:val="both"/>
-        <w:rPr>
-          <w:rFonts w:ascii="Arial" w:hAnsi="Arial" w:cs="Arial"/>
-          <w:b/>
-          <w:bCs/>
-          <w:sz w:val="24"/>
-          <w:szCs w:val="24"/>
-          <w:lang w:val="en-US"/>
-        </w:rPr>
-      </w:pPr>
-    </w:p>
-    <w:p>
-      <w:pPr>
-        <w:jc w:val="both"/>
-        <w:rPr>
-          <w:rFonts w:ascii="Arial" w:hAnsi="Arial" w:cs="Arial"/>
-          <w:b/>
-          <w:bCs/>
-          <w:sz w:val="24"/>
-          <w:szCs w:val="24"/>
-          <w:lang w:val="en-US"/>
-        </w:rPr>
-      </w:pPr>
-    </w:p>
-    <w:p>
-      <w:pPr>
-        <w:jc w:val="both"/>
-        <w:rPr>
-          <w:rFonts w:ascii="Arial" w:hAnsi="Arial" w:cs="Arial"/>
-          <w:b/>
-          <w:bCs/>
-          <w:sz w:val="24"/>
-          <w:szCs w:val="24"/>
-          <w:lang w:val="en-US"/>
-        </w:rPr>
-      </w:pPr>
-      <w:r>
-        <w:rPr>
-          <w:rFonts w:ascii="Arial" w:hAnsi="Arial" w:cs="Arial"/>
-          <w:b/>
-          <w:bCs/>
-          <w:sz w:val="24"/>
-          <w:szCs w:val="24"/>
-          <w:lang w:val="en-US"/>
+        </w:rPr>
+      </w:pPr>
+    </w:p>
+    <w:p>
+      <w:pPr>
+        <w:jc w:val="both"/>
+        <w:rPr>
+          <w:rFonts w:ascii="Arial" w:hAnsi="Arial" w:cs="Arial"/>
+          <w:b/>
+          <w:bCs/>
+          <w:sz w:val="24"/>
+          <w:szCs w:val="24"/>
+        </w:rPr>
+      </w:pPr>
+    </w:p>
+    <w:p>
+      <w:pPr>
+        <w:jc w:val="both"/>
+        <w:rPr>
+          <w:rFonts w:ascii="Arial" w:hAnsi="Arial" w:cs="Arial"/>
+          <w:b/>
+          <w:bCs/>
+          <w:sz w:val="24"/>
+          <w:szCs w:val="24"/>
+        </w:rPr>
+      </w:pPr>
+    </w:p>
+    <w:p>
+      <w:pPr>
+        <w:jc w:val="both"/>
+        <w:rPr>
+          <w:rFonts w:ascii="Arial" w:hAnsi="Arial" w:cs="Arial"/>
+          <w:b/>
+          <w:bCs/>
+          <w:sz w:val="24"/>
+          <w:szCs w:val="24"/>
+        </w:rPr>
+      </w:pPr>
+    </w:p>
+    <w:p>
+      <w:pPr>
+        <w:jc w:val="both"/>
+        <w:rPr>
+          <w:rFonts w:ascii="Arial" w:hAnsi="Arial" w:cs="Arial"/>
+          <w:b/>
+          <w:bCs/>
+          <w:sz w:val="24"/>
+          <w:szCs w:val="24"/>
+        </w:rPr>
+      </w:pPr>
+    </w:p>
+    <w:p>
+      <w:pPr>
+        <w:jc w:val="both"/>
+        <w:rPr>
+          <w:rFonts w:ascii="Arial" w:hAnsi="Arial" w:cs="Arial"/>
+          <w:b/>
+          <w:bCs/>
+          <w:sz w:val="24"/>
+          <w:szCs w:val="24"/>
+        </w:rPr>
+      </w:pPr>
+    </w:p>
+    <w:p>
+      <w:pPr>
+        <w:jc w:val="both"/>
+        <w:rPr>
+          <w:rFonts w:ascii="Arial" w:hAnsi="Arial" w:cs="Arial"/>
+          <w:b/>
+          <w:bCs/>
+          <w:sz w:val="24"/>
+          <w:szCs w:val="24"/>
+        </w:rPr>
+      </w:pPr>
+    </w:p>
+    <w:p>
+      <w:pPr>
+        <w:jc w:val="both"/>
+        <w:rPr>
+          <w:rFonts w:ascii="Arial" w:hAnsi="Arial" w:cs="Arial"/>
+          <w:b/>
+          <w:bCs/>
+          <w:sz w:val="24"/>
+          <w:szCs w:val="24"/>
+        </w:rPr>
+      </w:pPr>
+    </w:p>
+    <w:p>
+      <w:pPr>
+        <w:jc w:val="both"/>
+        <w:rPr>
+          <w:rFonts w:ascii="Arial" w:hAnsi="Arial" w:cs="Arial"/>
+          <w:b/>
+          <w:bCs/>
+          <w:sz w:val="24"/>
+          <w:szCs w:val="24"/>
+        </w:rPr>
+      </w:pPr>
+      <w:r>
+        <w:rPr>
+          <w:rFonts w:ascii="Arial" w:hAnsi="Arial" w:cs="Arial"/>
+          <w:b/>
+          <w:bCs/>
+          <w:sz w:val="24"/>
+          <w:szCs w:val="24"/>
         </w:rPr>
         <w:lastRenderedPageBreak/>
-        <w:t xml:space="preserve">Segundo avance </w:t>
-      </w:r>
-      <w:r>
-        <w:rPr>
-          <w:rFonts w:ascii="Arial" w:hAnsi="Arial" w:cs="Arial"/>
-          <w:b/>
-          <w:bCs/>
-          <w:sz w:val="24"/>
-          <w:szCs w:val="24"/>
-          <w:lang w:val="en-US"/>
-        </w:rPr>
-        <w:t xml:space="preserve">25 a </w:t>
-      </w:r>
-      <w:r>
-        <w:rPr>
-          <w:rFonts w:ascii="Arial" w:hAnsi="Arial" w:cs="Arial"/>
-          <w:b/>
-          <w:bCs/>
-          <w:sz w:val="24"/>
-          <w:szCs w:val="24"/>
-          <w:lang w:val="en-US"/>
-        </w:rPr>
-        <w:t>3</w:t>
-      </w:r>
-      <w:r>
-        <w:rPr>
-          <w:rFonts w:ascii="Arial" w:hAnsi="Arial" w:cs="Arial"/>
-          <w:b/>
-          <w:bCs/>
-          <w:sz w:val="24"/>
-          <w:szCs w:val="24"/>
-          <w:lang w:val="en-US"/>
-        </w:rPr>
-        <w:t>1</w:t>
-      </w:r>
-      <w:r>
-        <w:rPr>
-          <w:rFonts w:ascii="Arial" w:hAnsi="Arial" w:cs="Arial"/>
-          <w:b/>
-          <w:bCs/>
-          <w:sz w:val="24"/>
-          <w:szCs w:val="24"/>
-          <w:lang w:val="en-US"/>
-        </w:rPr>
-        <w:t>-10-2026</w:t>
+        <w:t>Segundo avance 25 a 31-10-2026</w:t>
       </w:r>
     </w:p>
     <w:p>
@@ -2384,6 +2330,7 @@
           <w:rFonts w:ascii="Arial" w:hAnsi="Arial" w:cs="Arial"/>
           <w:b/>
           <w:bCs/>
+          <w:noProof/>
           <w:sz w:val="24"/>
           <w:szCs w:val="24"/>
         </w:rPr>
@@ -2553,6 +2500,7 @@
           <w:rFonts w:ascii="Arial" w:hAnsi="Arial" w:cs="Arial"/>
           <w:b/>
           <w:bCs/>
+          <w:noProof/>
           <w:sz w:val="24"/>
           <w:szCs w:val="24"/>
         </w:rPr>
@@ -2645,6 +2593,7 @@
       <w:r>
         <w:rPr>
           <w:rFonts w:ascii="Arial" w:hAnsi="Arial" w:cs="Arial"/>
+          <w:noProof/>
           <w:sz w:val="24"/>
           <w:szCs w:val="24"/>
         </w:rPr>
@@ -2736,6 +2685,7 @@
       <w:r>
         <w:rPr>
           <w:rFonts w:ascii="Arial" w:hAnsi="Arial" w:cs="Arial"/>
+          <w:noProof/>
           <w:sz w:val="24"/>
           <w:szCs w:val="24"/>
         </w:rPr>
@@ -2836,6 +2786,7 @@
       <w:r>
         <w:rPr>
           <w:rFonts w:ascii="Arial" w:hAnsi="Arial" w:cs="Arial"/>
+          <w:noProof/>
           <w:sz w:val="24"/>
           <w:szCs w:val="24"/>
         </w:rPr>
@@ -2959,6 +2910,7 @@
       <w:r>
         <w:rPr>
           <w:rFonts w:ascii="Arial" w:hAnsi="Arial" w:cs="Arial"/>
+          <w:noProof/>
           <w:sz w:val="24"/>
           <w:szCs w:val="24"/>
         </w:rPr>
@@ -3071,6 +3023,7 @@
       <w:r>
         <w:rPr>
           <w:rFonts w:ascii="Arial" w:hAnsi="Arial" w:cs="Arial"/>
+          <w:noProof/>
           <w:sz w:val="24"/>
           <w:szCs w:val="24"/>
         </w:rPr>
@@ -3280,6 +3233,7 @@
       <w:r>
         <w:rPr>
           <w:rFonts w:ascii="Arial" w:hAnsi="Arial" w:cs="Arial"/>
+          <w:noProof/>
           <w:sz w:val="24"/>
           <w:szCs w:val="24"/>
         </w:rPr>
@@ -3372,6 +3326,7 @@
       <w:r>
         <w:rPr>
           <w:rFonts w:ascii="Arial" w:hAnsi="Arial" w:cs="Arial"/>
+          <w:noProof/>
           <w:sz w:val="24"/>
           <w:szCs w:val="24"/>
         </w:rPr>
@@ -3465,6 +3420,7 @@
       <w:r>
         <w:rPr>
           <w:rFonts w:ascii="Arial" w:hAnsi="Arial" w:cs="Arial"/>
+          <w:noProof/>
           <w:sz w:val="24"/>
           <w:szCs w:val="24"/>
         </w:rPr>
@@ -3557,6 +3513,7 @@
       <w:r>
         <w:rPr>
           <w:rFonts w:ascii="Arial" w:hAnsi="Arial" w:cs="Arial"/>
+          <w:noProof/>
           <w:sz w:val="24"/>
           <w:szCs w:val="24"/>
         </w:rPr>
@@ -3660,6 +3617,7 @@
       <w:r>
         <w:rPr>
           <w:rFonts w:ascii="Arial" w:hAnsi="Arial" w:cs="Arial"/>
+          <w:noProof/>
           <w:sz w:val="24"/>
           <w:szCs w:val="24"/>
         </w:rPr>
@@ -3784,6 +3742,7 @@
       <w:r>
         <w:rPr>
           <w:rFonts w:ascii="Arial" w:hAnsi="Arial" w:cs="Arial"/>
+          <w:noProof/>
           <w:sz w:val="24"/>
           <w:szCs w:val="24"/>
         </w:rPr>
@@ -3929,6 +3888,7 @@
       <w:r>
         <w:rPr>
           <w:rFonts w:ascii="Arial" w:hAnsi="Arial" w:cs="Arial"/>
+          <w:noProof/>
           <w:sz w:val="24"/>
           <w:szCs w:val="24"/>
         </w:rPr>
@@ -4053,6 +4013,7 @@
       <w:r>
         <w:rPr>
           <w:rFonts w:ascii="Arial" w:hAnsi="Arial" w:cs="Arial"/>
+          <w:noProof/>
           <w:sz w:val="24"/>
           <w:szCs w:val="24"/>
         </w:rPr>
@@ -4156,6 +4117,7 @@
       <w:r>
         <w:rPr>
           <w:rFonts w:ascii="Arial" w:hAnsi="Arial" w:cs="Arial"/>
+          <w:noProof/>
           <w:sz w:val="24"/>
           <w:szCs w:val="24"/>
         </w:rPr>
@@ -4339,6 +4301,7 @@
       <w:r>
         <w:rPr>
           <w:rFonts w:ascii="Arial" w:hAnsi="Arial" w:cs="Arial"/>
+          <w:noProof/>
           <w:sz w:val="24"/>
           <w:szCs w:val="24"/>
         </w:rPr>
@@ -4522,6 +4485,7 @@
       <w:r>
         <w:rPr>
           <w:rFonts w:ascii="Arial" w:hAnsi="Arial" w:cs="Arial"/>
+          <w:noProof/>
           <w:sz w:val="24"/>
           <w:szCs w:val="24"/>
         </w:rPr>
@@ -4779,6 +4743,7 @@
       <w:r>
         <w:rPr>
           <w:rFonts w:ascii="Arial" w:hAnsi="Arial" w:cs="Arial"/>
+          <w:noProof/>
           <w:sz w:val="24"/>
           <w:szCs w:val="24"/>
         </w:rPr>
@@ -4903,6 +4868,7 @@
       <w:r>
         <w:rPr>
           <w:rFonts w:ascii="Arial" w:hAnsi="Arial" w:cs="Arial"/>
+          <w:noProof/>
           <w:sz w:val="24"/>
           <w:szCs w:val="24"/>
         </w:rPr>
@@ -5016,6 +4982,7 @@
       <w:r>
         <w:rPr>
           <w:rFonts w:ascii="Arial" w:hAnsi="Arial" w:cs="Arial"/>
+          <w:noProof/>
           <w:sz w:val="24"/>
           <w:szCs w:val="24"/>
         </w:rPr>
@@ -5126,6 +5093,7 @@
       <w:r>
         <w:rPr>
           <w:rFonts w:ascii="Arial" w:hAnsi="Arial" w:cs="Arial"/>
+          <w:noProof/>
           <w:sz w:val="24"/>
           <w:szCs w:val="24"/>
         </w:rPr>
@@ -5247,6 +5215,7 @@
       <w:r>
         <w:rPr>
           <w:rFonts w:ascii="Arial" w:hAnsi="Arial" w:cs="Arial"/>
+          <w:noProof/>
           <w:sz w:val="24"/>
           <w:szCs w:val="24"/>
         </w:rPr>
@@ -5528,6 +5497,627 @@
           <w:szCs w:val="24"/>
         </w:rPr>
         <w:t>Como resultado, se cuenta con un backend funcional que cumple con los componentes principales para el segundo avance y proporciona la base para continuar con las funcionalidades restantes del proyecto.</w:t>
+      </w:r>
+    </w:p>
+    <w:p>
+      <w:pPr>
+        <w:spacing w:after="0" w:line="240" w:lineRule="auto"/>
+        <w:jc w:val="center"/>
+        <w:rPr>
+          <w:rFonts w:ascii="Arial" w:hAnsi="Arial" w:cs="Arial"/>
+          <w:b/>
+          <w:bCs/>
+          <w:sz w:val="24"/>
+          <w:szCs w:val="24"/>
+        </w:rPr>
+      </w:pPr>
+      <w:r>
+        <w:rPr>
+          <w:rFonts w:ascii="Arial" w:hAnsi="Arial" w:cs="Arial"/>
+          <w:b/>
+          <w:bCs/>
+          <w:sz w:val="24"/>
+          <w:szCs w:val="24"/>
+        </w:rPr>
+        <w:lastRenderedPageBreak/>
+        <w:t>Capturas para entrega final del Proyecto</w:t>
+      </w:r>
+    </w:p>
+    <w:p>
+      <w:pPr>
+        <w:spacing w:after="0" w:line="240" w:lineRule="auto"/>
+        <w:jc w:val="both"/>
+        <w:rPr>
+          <w:rFonts w:ascii="Arial" w:hAnsi="Arial" w:cs="Arial"/>
+          <w:b/>
+          <w:bCs/>
+          <w:sz w:val="24"/>
+          <w:szCs w:val="24"/>
+        </w:rPr>
+      </w:pPr>
+    </w:p>
+    <w:p>
+      <w:pPr>
+        <w:spacing w:after="0" w:line="240" w:lineRule="auto"/>
+        <w:jc w:val="both"/>
+        <w:rPr>
+          <w:rFonts w:ascii="Arial" w:hAnsi="Arial" w:cs="Arial"/>
+          <w:b/>
+          <w:bCs/>
+          <w:sz w:val="24"/>
+          <w:szCs w:val="24"/>
+        </w:rPr>
+      </w:pPr>
+      <w:r>
+        <w:rPr>
+          <w:rFonts w:ascii="Arial" w:hAnsi="Arial" w:cs="Arial"/>
+          <w:b/>
+          <w:bCs/>
+          <w:sz w:val="24"/>
+          <w:szCs w:val="24"/>
+        </w:rPr>
+        <w:t>Evidencia de los indicadores del panel principal</w:t>
+      </w:r>
+    </w:p>
+    <w:p>
+      <w:pPr>
+        <w:spacing w:after="0" w:line="240" w:lineRule="auto"/>
+        <w:jc w:val="both"/>
+        <w:rPr>
+          <w:rFonts w:ascii="Arial" w:hAnsi="Arial" w:cs="Arial"/>
+          <w:b/>
+          <w:bCs/>
+          <w:sz w:val="24"/>
+          <w:szCs w:val="24"/>
+        </w:rPr>
+      </w:pPr>
+    </w:p>
+    <w:p>
+      <w:pPr>
+        <w:spacing w:after="0" w:line="240" w:lineRule="auto"/>
+        <w:jc w:val="both"/>
+        <w:rPr>
+          <w:rFonts w:ascii="Arial" w:hAnsi="Arial" w:cs="Arial"/>
+          <w:b/>
+          <w:bCs/>
+          <w:sz w:val="24"/>
+          <w:szCs w:val="24"/>
+        </w:rPr>
+      </w:pPr>
+      <w:r>
+        <w:rPr>
+          <w:rFonts w:ascii="Arial" w:hAnsi="Arial" w:cs="Arial"/>
+          <w:b/>
+          <w:bCs/>
+          <w:sz w:val="24"/>
+          <w:szCs w:val="24"/>
+        </w:rPr>
+        <w:drawing>
+          <wp:inline distT="0" distB="0" distL="0" distR="0" wp14:anchorId="1FA45DE6" wp14:editId="449B70E8">
+            <wp:extent cx="5612130" cy="1253490"/>
+            <wp:effectExtent l="0" t="0" r="7620" b="3810"/>
+            <wp:docPr id="1515105480" name="Imagen 1"/>
+            <wp:cNvGraphicFramePr>
+              <a:graphicFrameLocks xmlns:a="http://schemas.openxmlformats.org/drawingml/2006/main" noChangeAspect="1"/>
+            </wp:cNvGraphicFramePr>
+            <a:graphic xmlns:a="http://schemas.openxmlformats.org/drawingml/2006/main">
+              <a:graphicData uri="http://schemas.openxmlformats.org/drawingml/2006/picture">
+                <pic:pic xmlns:pic="http://schemas.openxmlformats.org/drawingml/2006/picture">
+                  <pic:nvPicPr>
+                    <pic:cNvPr id="1515105480" name=""/>
+                    <pic:cNvPicPr/>
+                  </pic:nvPicPr>
+                  <pic:blipFill>
+                    <a:blip r:embed="rId37"/>
+                    <a:stretch>
+                      <a:fillRect/>
+                    </a:stretch>
+                  </pic:blipFill>
+                  <pic:spPr>
+                    <a:xfrm>
+                      <a:off x="0" y="0"/>
+                      <a:ext cx="5612130" cy="1253490"/>
+                    </a:xfrm>
+                    <a:prstGeom prst="rect">
+                      <a:avLst/>
+                    </a:prstGeom>
+                  </pic:spPr>
+                </pic:pic>
+              </a:graphicData>
+            </a:graphic>
+          </wp:inline>
+        </w:drawing>
+      </w:r>
+    </w:p>
+    <w:p>
+      <w:pPr>
+        <w:spacing w:after="0" w:line="240" w:lineRule="auto"/>
+        <w:jc w:val="both"/>
+        <w:rPr>
+          <w:rFonts w:ascii="Arial" w:hAnsi="Arial" w:cs="Arial"/>
+          <w:b/>
+          <w:bCs/>
+          <w:sz w:val="24"/>
+          <w:szCs w:val="24"/>
+        </w:rPr>
+      </w:pPr>
+    </w:p>
+    <w:p>
+      <w:pPr>
+        <w:spacing w:after="0" w:line="240" w:lineRule="auto"/>
+        <w:jc w:val="both"/>
+        <w:rPr>
+          <w:rFonts w:ascii="Arial" w:hAnsi="Arial" w:cs="Arial"/>
+          <w:b/>
+          <w:bCs/>
+          <w:sz w:val="24"/>
+          <w:szCs w:val="24"/>
+        </w:rPr>
+      </w:pPr>
+    </w:p>
+    <w:p>
+      <w:pPr>
+        <w:spacing w:after="0" w:line="240" w:lineRule="auto"/>
+        <w:jc w:val="both"/>
+        <w:rPr>
+          <w:rFonts w:ascii="Arial" w:hAnsi="Arial" w:cs="Arial"/>
+          <w:b/>
+          <w:bCs/>
+          <w:sz w:val="24"/>
+          <w:szCs w:val="24"/>
+        </w:rPr>
+      </w:pPr>
+      <w:r>
+        <w:rPr>
+          <w:rFonts w:ascii="Arial" w:hAnsi="Arial" w:cs="Arial"/>
+          <w:b/>
+          <w:bCs/>
+          <w:sz w:val="24"/>
+          <w:szCs w:val="24"/>
+        </w:rPr>
+        <w:t>E</w:t>
+      </w:r>
+      <w:r>
+        <w:rPr>
+          <w:rFonts w:ascii="Arial" w:hAnsi="Arial" w:cs="Arial"/>
+          <w:b/>
+          <w:bCs/>
+          <w:sz w:val="24"/>
+          <w:szCs w:val="24"/>
+        </w:rPr>
+        <w:t>videncia del registro de vehículos desde la interfaz web</w:t>
+      </w:r>
+    </w:p>
+    <w:p>
+      <w:pPr>
+        <w:spacing w:after="0" w:line="240" w:lineRule="auto"/>
+        <w:jc w:val="both"/>
+        <w:rPr>
+          <w:rFonts w:ascii="Arial" w:hAnsi="Arial" w:cs="Arial"/>
+          <w:b/>
+          <w:bCs/>
+          <w:sz w:val="24"/>
+          <w:szCs w:val="24"/>
+        </w:rPr>
+      </w:pPr>
+    </w:p>
+    <w:p>
+      <w:pPr>
+        <w:spacing w:after="0" w:line="240" w:lineRule="auto"/>
+        <w:jc w:val="both"/>
+        <w:rPr>
+          <w:rFonts w:ascii="Arial" w:hAnsi="Arial" w:cs="Arial"/>
+          <w:b/>
+          <w:bCs/>
+          <w:sz w:val="24"/>
+          <w:szCs w:val="24"/>
+        </w:rPr>
+      </w:pPr>
+      <w:r>
+        <w:rPr>
+          <w:rFonts w:ascii="Arial" w:hAnsi="Arial" w:cs="Arial"/>
+          <w:b/>
+          <w:bCs/>
+          <w:sz w:val="24"/>
+          <w:szCs w:val="24"/>
+        </w:rPr>
+        <w:t>Antes</w:t>
+      </w:r>
+    </w:p>
+    <w:p>
+      <w:pPr>
+        <w:spacing w:after="0" w:line="240" w:lineRule="auto"/>
+        <w:jc w:val="both"/>
+        <w:rPr>
+          <w:rFonts w:ascii="Arial" w:hAnsi="Arial" w:cs="Arial"/>
+          <w:b/>
+          <w:bCs/>
+          <w:sz w:val="24"/>
+          <w:szCs w:val="24"/>
+        </w:rPr>
+      </w:pPr>
+    </w:p>
+    <w:p>
+      <w:pPr>
+        <w:spacing w:after="0" w:line="240" w:lineRule="auto"/>
+        <w:jc w:val="both"/>
+        <w:rPr>
+          <w:rFonts w:ascii="Arial" w:hAnsi="Arial" w:cs="Arial"/>
+          <w:b/>
+          <w:bCs/>
+          <w:sz w:val="24"/>
+          <w:szCs w:val="24"/>
+        </w:rPr>
+      </w:pPr>
+      <w:r>
+        <w:rPr>
+          <w:rFonts w:ascii="Arial" w:hAnsi="Arial" w:cs="Arial"/>
+          <w:b/>
+          <w:bCs/>
+          <w:sz w:val="24"/>
+          <w:szCs w:val="24"/>
+        </w:rPr>
+        <w:drawing>
+          <wp:inline distT="0" distB="0" distL="0" distR="0" wp14:anchorId="3D010A00" wp14:editId="1F80417E">
+            <wp:extent cx="4793616" cy="5777504"/>
+            <wp:effectExtent l="0" t="0" r="6985" b="0"/>
+            <wp:docPr id="585908482" name="Imagen 1"/>
+            <wp:cNvGraphicFramePr>
+              <a:graphicFrameLocks xmlns:a="http://schemas.openxmlformats.org/drawingml/2006/main" noChangeAspect="1"/>
+            </wp:cNvGraphicFramePr>
+            <a:graphic xmlns:a="http://schemas.openxmlformats.org/drawingml/2006/main">
+              <a:graphicData uri="http://schemas.openxmlformats.org/drawingml/2006/picture">
+                <pic:pic xmlns:pic="http://schemas.openxmlformats.org/drawingml/2006/picture">
+                  <pic:nvPicPr>
+                    <pic:cNvPr id="585908482" name=""/>
+                    <pic:cNvPicPr/>
+                  </pic:nvPicPr>
+                  <pic:blipFill>
+                    <a:blip r:embed="rId38"/>
+                    <a:stretch>
+                      <a:fillRect/>
+                    </a:stretch>
+                  </pic:blipFill>
+                  <pic:spPr>
+                    <a:xfrm>
+                      <a:off x="0" y="0"/>
+                      <a:ext cx="4793843" cy="5777778"/>
+                    </a:xfrm>
+                    <a:prstGeom prst="rect">
+                      <a:avLst/>
+                    </a:prstGeom>
+                  </pic:spPr>
+                </pic:pic>
+              </a:graphicData>
+            </a:graphic>
+          </wp:inline>
+        </w:drawing>
+      </w:r>
+    </w:p>
+    <w:p>
+      <w:pPr>
+        <w:spacing w:after="0" w:line="240" w:lineRule="auto"/>
+        <w:jc w:val="both"/>
+        <w:rPr>
+          <w:rFonts w:ascii="Arial" w:hAnsi="Arial" w:cs="Arial"/>
+          <w:b/>
+          <w:bCs/>
+          <w:sz w:val="24"/>
+          <w:szCs w:val="24"/>
+        </w:rPr>
+      </w:pPr>
+      <w:r>
+        <w:rPr>
+          <w:rFonts w:ascii="Arial" w:hAnsi="Arial" w:cs="Arial"/>
+          <w:b/>
+          <w:bCs/>
+          <w:sz w:val="24"/>
+          <w:szCs w:val="24"/>
+        </w:rPr>
+        <w:lastRenderedPageBreak/>
+        <w:t>Después</w:t>
+      </w:r>
+    </w:p>
+    <w:p>
+      <w:pPr>
+        <w:spacing w:after="0" w:line="240" w:lineRule="auto"/>
+        <w:jc w:val="both"/>
+        <w:rPr>
+          <w:rFonts w:ascii="Arial" w:hAnsi="Arial" w:cs="Arial"/>
+          <w:b/>
+          <w:bCs/>
+          <w:sz w:val="24"/>
+          <w:szCs w:val="24"/>
+        </w:rPr>
+      </w:pPr>
+      <w:r>
+        <w:rPr>
+          <w:rFonts w:ascii="Arial" w:hAnsi="Arial" w:cs="Arial"/>
+          <w:b/>
+          <w:bCs/>
+          <w:sz w:val="24"/>
+          <w:szCs w:val="24"/>
+        </w:rPr>
+        <w:drawing>
+          <wp:inline distT="0" distB="0" distL="0" distR="0" wp14:anchorId="05F5C444" wp14:editId="6C42E341">
+            <wp:extent cx="5612130" cy="6817360"/>
+            <wp:effectExtent l="0" t="0" r="7620" b="2540"/>
+            <wp:docPr id="2131528538" name="Imagen 1"/>
+            <wp:cNvGraphicFramePr>
+              <a:graphicFrameLocks xmlns:a="http://schemas.openxmlformats.org/drawingml/2006/main" noChangeAspect="1"/>
+            </wp:cNvGraphicFramePr>
+            <a:graphic xmlns:a="http://schemas.openxmlformats.org/drawingml/2006/main">
+              <a:graphicData uri="http://schemas.openxmlformats.org/drawingml/2006/picture">
+                <pic:pic xmlns:pic="http://schemas.openxmlformats.org/drawingml/2006/picture">
+                  <pic:nvPicPr>
+                    <pic:cNvPr id="2131528538" name=""/>
+                    <pic:cNvPicPr/>
+                  </pic:nvPicPr>
+                  <pic:blipFill>
+                    <a:blip r:embed="rId39"/>
+                    <a:stretch>
+                      <a:fillRect/>
+                    </a:stretch>
+                  </pic:blipFill>
+                  <pic:spPr>
+                    <a:xfrm>
+                      <a:off x="0" y="0"/>
+                      <a:ext cx="5612130" cy="6817360"/>
+                    </a:xfrm>
+                    <a:prstGeom prst="rect">
+                      <a:avLst/>
+                    </a:prstGeom>
+                  </pic:spPr>
+                </pic:pic>
+              </a:graphicData>
+            </a:graphic>
+          </wp:inline>
+        </w:drawing>
+      </w:r>
+    </w:p>
+    <w:p>
+      <w:pPr>
+        <w:spacing w:after="0" w:line="240" w:lineRule="auto"/>
+        <w:jc w:val="both"/>
+        <w:rPr>
+          <w:rFonts w:ascii="Arial" w:hAnsi="Arial" w:cs="Arial"/>
+          <w:b/>
+          <w:bCs/>
+          <w:sz w:val="24"/>
+          <w:szCs w:val="24"/>
+        </w:rPr>
+      </w:pPr>
+    </w:p>
+    <w:p>
+      <w:pPr>
+        <w:spacing w:after="0" w:line="240" w:lineRule="auto"/>
+        <w:jc w:val="both"/>
+        <w:rPr>
+          <w:rFonts w:ascii="Arial" w:hAnsi="Arial" w:cs="Arial"/>
+          <w:b/>
+          <w:bCs/>
+          <w:sz w:val="24"/>
+          <w:szCs w:val="24"/>
+        </w:rPr>
+      </w:pPr>
+    </w:p>
+    <w:p>
+      <w:pPr>
+        <w:spacing w:after="0" w:line="240" w:lineRule="auto"/>
+        <w:jc w:val="both"/>
+        <w:rPr>
+          <w:rFonts w:ascii="Arial" w:hAnsi="Arial" w:cs="Arial"/>
+          <w:b/>
+          <w:bCs/>
+          <w:sz w:val="24"/>
+          <w:szCs w:val="24"/>
+        </w:rPr>
+      </w:pPr>
+    </w:p>
+    <w:p>
+      <w:pPr>
+        <w:spacing w:after="0" w:line="240" w:lineRule="auto"/>
+        <w:jc w:val="both"/>
+        <w:rPr>
+          <w:rFonts w:ascii="Arial" w:hAnsi="Arial" w:cs="Arial"/>
+          <w:b/>
+          <w:bCs/>
+          <w:sz w:val="24"/>
+          <w:szCs w:val="24"/>
+        </w:rPr>
+      </w:pPr>
+    </w:p>
+    <w:p>
+      <w:pPr>
+        <w:spacing w:after="0" w:line="240" w:lineRule="auto"/>
+        <w:jc w:val="both"/>
+        <w:rPr>
+          <w:rFonts w:ascii="Arial" w:hAnsi="Arial" w:cs="Arial"/>
+          <w:b/>
+          <w:bCs/>
+          <w:sz w:val="24"/>
+          <w:szCs w:val="24"/>
+        </w:rPr>
+      </w:pPr>
+    </w:p>
+    <w:p>
+      <w:pPr>
+        <w:spacing w:after="0" w:line="240" w:lineRule="auto"/>
+        <w:jc w:val="both"/>
+        <w:rPr>
+          <w:rFonts w:ascii="Arial" w:hAnsi="Arial" w:cs="Arial"/>
+          <w:b/>
+          <w:bCs/>
+          <w:sz w:val="24"/>
+          <w:szCs w:val="24"/>
+        </w:rPr>
+      </w:pPr>
+    </w:p>
+    <w:p>
+      <w:pPr>
+        <w:spacing w:after="0" w:line="240" w:lineRule="auto"/>
+        <w:jc w:val="both"/>
+        <w:rPr>
+          <w:rFonts w:ascii="Arial" w:hAnsi="Arial" w:cs="Arial"/>
+          <w:b/>
+          <w:bCs/>
+          <w:sz w:val="24"/>
+          <w:szCs w:val="24"/>
+        </w:rPr>
+      </w:pPr>
+    </w:p>
+    <w:p>
+      <w:pPr>
+        <w:spacing w:after="0" w:line="240" w:lineRule="auto"/>
+        <w:jc w:val="both"/>
+        <w:rPr>
+          <w:rFonts w:ascii="Arial" w:hAnsi="Arial" w:cs="Arial"/>
+          <w:b/>
+          <w:bCs/>
+          <w:sz w:val="24"/>
+          <w:szCs w:val="24"/>
+        </w:rPr>
+      </w:pPr>
+    </w:p>
+    <w:p>
+      <w:pPr>
+        <w:spacing w:after="0" w:line="240" w:lineRule="auto"/>
+        <w:jc w:val="both"/>
+        <w:rPr>
+          <w:rFonts w:ascii="Arial" w:hAnsi="Arial" w:cs="Arial"/>
+          <w:b/>
+          <w:bCs/>
+          <w:sz w:val="24"/>
+          <w:szCs w:val="24"/>
+        </w:rPr>
+      </w:pPr>
+    </w:p>
+    <w:p>
+      <w:pPr>
+        <w:spacing w:after="0" w:line="240" w:lineRule="auto"/>
+        <w:jc w:val="both"/>
+        <w:rPr>
+          <w:rFonts w:ascii="Arial" w:hAnsi="Arial" w:cs="Arial"/>
+          <w:b/>
+          <w:bCs/>
+          <w:sz w:val="24"/>
+          <w:szCs w:val="24"/>
+        </w:rPr>
+      </w:pPr>
+    </w:p>
+    <w:p>
+      <w:pPr>
+        <w:spacing w:after="0" w:line="240" w:lineRule="auto"/>
+        <w:jc w:val="both"/>
+        <w:rPr>
+          <w:rFonts w:ascii="Arial" w:hAnsi="Arial" w:cs="Arial"/>
+          <w:b/>
+          <w:bCs/>
+          <w:sz w:val="24"/>
+          <w:szCs w:val="24"/>
+        </w:rPr>
+      </w:pPr>
+      <w:r>
+        <w:rPr>
+          <w:rFonts w:ascii="Arial" w:hAnsi="Arial" w:cs="Arial"/>
+          <w:b/>
+          <w:bCs/>
+          <w:sz w:val="24"/>
+          <w:szCs w:val="24"/>
+        </w:rPr>
+        <w:lastRenderedPageBreak/>
+        <w:t>Evidencia de finalización de tickets y liberación de espacios</w:t>
+      </w:r>
+    </w:p>
+    <w:p>
+      <w:pPr>
+        <w:spacing w:after="0" w:line="240" w:lineRule="auto"/>
+        <w:jc w:val="both"/>
+        <w:rPr>
+          <w:rFonts w:ascii="Arial" w:hAnsi="Arial" w:cs="Arial"/>
+          <w:sz w:val="24"/>
+          <w:szCs w:val="24"/>
+        </w:rPr>
+      </w:pPr>
+      <w:r>
+        <w:rPr>
+          <w:rFonts w:ascii="Arial" w:hAnsi="Arial" w:cs="Arial"/>
+          <w:sz w:val="24"/>
+          <w:szCs w:val="24"/>
+        </w:rPr>
+        <w:t>(Para el ejemplo se toma el mismo que se acaba de agregar</w:t>
+      </w:r>
+      <w:r>
+        <w:rPr>
+          <w:rFonts w:ascii="Arial" w:hAnsi="Arial" w:cs="Arial"/>
+          <w:sz w:val="24"/>
+          <w:szCs w:val="24"/>
+        </w:rPr>
+        <w:t xml:space="preserve"> en el ejemplo anterior)</w:t>
+      </w:r>
+    </w:p>
+    <w:p>
+      <w:pPr>
+        <w:spacing w:after="0" w:line="240" w:lineRule="auto"/>
+        <w:jc w:val="both"/>
+        <w:rPr>
+          <w:rFonts w:ascii="Arial" w:hAnsi="Arial" w:cs="Arial"/>
+          <w:sz w:val="24"/>
+          <w:szCs w:val="24"/>
+        </w:rPr>
+      </w:pPr>
+    </w:p>
+    <w:p>
+      <w:pPr>
+        <w:spacing w:after="0" w:line="240" w:lineRule="auto"/>
+        <w:jc w:val="both"/>
+        <w:rPr>
+          <w:rFonts w:ascii="Arial" w:hAnsi="Arial" w:cs="Arial"/>
+          <w:sz w:val="24"/>
+          <w:szCs w:val="24"/>
+        </w:rPr>
+      </w:pPr>
+      <w:r>
+        <w:rPr>
+          <w:rFonts w:ascii="Arial" w:hAnsi="Arial" w:cs="Arial"/>
+          <w:sz w:val="24"/>
+          <w:szCs w:val="24"/>
+        </w:rPr>
+        <w:drawing>
+          <wp:inline distT="0" distB="0" distL="0" distR="0" wp14:anchorId="6E9E96A1" wp14:editId="2B66A24A">
+            <wp:extent cx="5612130" cy="7031355"/>
+            <wp:effectExtent l="0" t="0" r="7620" b="0"/>
+            <wp:docPr id="824115534" name="Imagen 1"/>
+            <wp:cNvGraphicFramePr>
+              <a:graphicFrameLocks xmlns:a="http://schemas.openxmlformats.org/drawingml/2006/main" noChangeAspect="1"/>
+            </wp:cNvGraphicFramePr>
+            <a:graphic xmlns:a="http://schemas.openxmlformats.org/drawingml/2006/main">
+              <a:graphicData uri="http://schemas.openxmlformats.org/drawingml/2006/picture">
+                <pic:pic xmlns:pic="http://schemas.openxmlformats.org/drawingml/2006/picture">
+                  <pic:nvPicPr>
+                    <pic:cNvPr id="824115534" name=""/>
+                    <pic:cNvPicPr/>
+                  </pic:nvPicPr>
+                  <pic:blipFill>
+                    <a:blip r:embed="rId40"/>
+                    <a:stretch>
+                      <a:fillRect/>
+                    </a:stretch>
+                  </pic:blipFill>
+                  <pic:spPr>
+                    <a:xfrm>
+                      <a:off x="0" y="0"/>
+                      <a:ext cx="5612130" cy="7031355"/>
+                    </a:xfrm>
+                    <a:prstGeom prst="rect">
+                      <a:avLst/>
+                    </a:prstGeom>
+                  </pic:spPr>
+                </pic:pic>
+              </a:graphicData>
+            </a:graphic>
+          </wp:inline>
+        </w:drawing>
       </w:r>
     </w:p>
     <w:sectPr>

</xml_diff>

<commit_message>
Actualizar colección Postman con CRUD de espacios
</commit_message>
<xml_diff>
--- a/evidencias/Evidencias.docx
+++ b/evidencias/Evidencias.docx
@@ -6118,6 +6118,453 @@
             </a:graphic>
           </wp:inline>
         </w:drawing>
+      </w:r>
+    </w:p>
+    <w:p>
+      <w:pPr>
+        <w:spacing w:after="0" w:line="240" w:lineRule="auto"/>
+        <w:jc w:val="both"/>
+        <w:rPr>
+          <w:rFonts w:ascii="Arial" w:hAnsi="Arial" w:cs="Arial"/>
+          <w:sz w:val="24"/>
+          <w:szCs w:val="24"/>
+        </w:rPr>
+      </w:pPr>
+    </w:p>
+    <w:p>
+      <w:pPr>
+        <w:spacing w:after="0" w:line="240" w:lineRule="auto"/>
+        <w:jc w:val="both"/>
+        <w:rPr>
+          <w:rFonts w:ascii="Arial" w:hAnsi="Arial" w:cs="Arial"/>
+          <w:sz w:val="24"/>
+          <w:szCs w:val="24"/>
+        </w:rPr>
+      </w:pPr>
+    </w:p>
+    <w:p>
+      <w:pPr>
+        <w:spacing w:after="0" w:line="240" w:lineRule="auto"/>
+        <w:jc w:val="both"/>
+        <w:rPr>
+          <w:rFonts w:ascii="Arial" w:hAnsi="Arial" w:cs="Arial"/>
+          <w:sz w:val="24"/>
+          <w:szCs w:val="24"/>
+        </w:rPr>
+      </w:pPr>
+    </w:p>
+    <w:p>
+      <w:pPr>
+        <w:spacing w:after="0" w:line="240" w:lineRule="auto"/>
+        <w:jc w:val="both"/>
+        <w:rPr>
+          <w:rFonts w:ascii="Arial" w:hAnsi="Arial" w:cs="Arial"/>
+          <w:sz w:val="24"/>
+          <w:szCs w:val="24"/>
+        </w:rPr>
+      </w:pPr>
+    </w:p>
+    <w:p>
+      <w:pPr>
+        <w:spacing w:after="0" w:line="240" w:lineRule="auto"/>
+        <w:jc w:val="both"/>
+        <w:rPr>
+          <w:rFonts w:ascii="Arial" w:hAnsi="Arial" w:cs="Arial"/>
+          <w:sz w:val="24"/>
+          <w:szCs w:val="24"/>
+        </w:rPr>
+      </w:pPr>
+    </w:p>
+    <w:p>
+      <w:pPr>
+        <w:spacing w:after="0" w:line="240" w:lineRule="auto"/>
+        <w:jc w:val="both"/>
+        <w:rPr>
+          <w:rFonts w:ascii="Arial" w:hAnsi="Arial" w:cs="Arial"/>
+          <w:sz w:val="24"/>
+          <w:szCs w:val="24"/>
+        </w:rPr>
+      </w:pPr>
+    </w:p>
+    <w:p>
+      <w:pPr>
+        <w:spacing w:after="0" w:line="240" w:lineRule="auto"/>
+        <w:jc w:val="both"/>
+        <w:rPr>
+          <w:rFonts w:ascii="Arial" w:hAnsi="Arial" w:cs="Arial"/>
+          <w:sz w:val="24"/>
+          <w:szCs w:val="24"/>
+        </w:rPr>
+      </w:pPr>
+    </w:p>
+    <w:p>
+      <w:pPr>
+        <w:spacing w:after="0" w:line="240" w:lineRule="auto"/>
+        <w:jc w:val="both"/>
+        <w:rPr>
+          <w:rFonts w:ascii="Arial" w:hAnsi="Arial" w:cs="Arial"/>
+          <w:b/>
+          <w:bCs/>
+          <w:sz w:val="24"/>
+          <w:szCs w:val="24"/>
+        </w:rPr>
+      </w:pPr>
+      <w:r>
+        <w:rPr>
+          <w:rFonts w:ascii="Arial" w:hAnsi="Arial" w:cs="Arial"/>
+          <w:b/>
+          <w:bCs/>
+          <w:sz w:val="24"/>
+          <w:szCs w:val="24"/>
+        </w:rPr>
+        <w:lastRenderedPageBreak/>
+        <w:t>Verificación de la cantidad mínima de registros en PostgreSQL</w:t>
+      </w:r>
+    </w:p>
+    <w:p>
+      <w:pPr>
+        <w:spacing w:after="0" w:line="240" w:lineRule="auto"/>
+        <w:jc w:val="both"/>
+        <w:rPr>
+          <w:rFonts w:ascii="Arial" w:hAnsi="Arial" w:cs="Arial"/>
+          <w:b/>
+          <w:bCs/>
+          <w:sz w:val="24"/>
+          <w:szCs w:val="24"/>
+        </w:rPr>
+      </w:pPr>
+    </w:p>
+    <w:p>
+      <w:pPr>
+        <w:spacing w:after="0" w:line="240" w:lineRule="auto"/>
+        <w:jc w:val="both"/>
+        <w:rPr>
+          <w:rFonts w:ascii="Arial" w:hAnsi="Arial" w:cs="Arial"/>
+          <w:b/>
+          <w:bCs/>
+          <w:sz w:val="24"/>
+          <w:szCs w:val="24"/>
+        </w:rPr>
+      </w:pPr>
+      <w:r>
+        <w:rPr>
+          <w:rFonts w:ascii="Arial" w:hAnsi="Arial" w:cs="Arial"/>
+          <w:b/>
+          <w:bCs/>
+          <w:sz w:val="24"/>
+          <w:szCs w:val="24"/>
+        </w:rPr>
+        <w:drawing>
+          <wp:inline distT="0" distB="0" distL="0" distR="0" wp14:anchorId="216F7F68" wp14:editId="6FCF70BA">
+            <wp:extent cx="5612130" cy="2087245"/>
+            <wp:effectExtent l="0" t="0" r="7620" b="8255"/>
+            <wp:docPr id="1531628739" name="Imagen 1"/>
+            <wp:cNvGraphicFramePr>
+              <a:graphicFrameLocks xmlns:a="http://schemas.openxmlformats.org/drawingml/2006/main" noChangeAspect="1"/>
+            </wp:cNvGraphicFramePr>
+            <a:graphic xmlns:a="http://schemas.openxmlformats.org/drawingml/2006/main">
+              <a:graphicData uri="http://schemas.openxmlformats.org/drawingml/2006/picture">
+                <pic:pic xmlns:pic="http://schemas.openxmlformats.org/drawingml/2006/picture">
+                  <pic:nvPicPr>
+                    <pic:cNvPr id="1531628739" name=""/>
+                    <pic:cNvPicPr/>
+                  </pic:nvPicPr>
+                  <pic:blipFill>
+                    <a:blip r:embed="rId41"/>
+                    <a:stretch>
+                      <a:fillRect/>
+                    </a:stretch>
+                  </pic:blipFill>
+                  <pic:spPr>
+                    <a:xfrm>
+                      <a:off x="0" y="0"/>
+                      <a:ext cx="5612130" cy="2087245"/>
+                    </a:xfrm>
+                    <a:prstGeom prst="rect">
+                      <a:avLst/>
+                    </a:prstGeom>
+                  </pic:spPr>
+                </pic:pic>
+              </a:graphicData>
+            </a:graphic>
+          </wp:inline>
+        </w:drawing>
+      </w:r>
+    </w:p>
+    <w:p>
+      <w:pPr>
+        <w:spacing w:after="0" w:line="240" w:lineRule="auto"/>
+        <w:jc w:val="both"/>
+        <w:rPr>
+          <w:rFonts w:ascii="Arial" w:hAnsi="Arial" w:cs="Arial"/>
+          <w:sz w:val="24"/>
+          <w:szCs w:val="24"/>
+        </w:rPr>
+      </w:pPr>
+    </w:p>
+    <w:p>
+      <w:pPr>
+        <w:spacing w:after="0" w:line="240" w:lineRule="auto"/>
+        <w:jc w:val="both"/>
+        <w:rPr>
+          <w:rFonts w:ascii="Arial" w:hAnsi="Arial" w:cs="Arial"/>
+          <w:sz w:val="24"/>
+          <w:szCs w:val="24"/>
+        </w:rPr>
+      </w:pPr>
+    </w:p>
+    <w:p>
+      <w:pPr>
+        <w:spacing w:after="0" w:line="240" w:lineRule="auto"/>
+        <w:jc w:val="both"/>
+        <w:rPr>
+          <w:rFonts w:ascii="Arial" w:hAnsi="Arial" w:cs="Arial"/>
+          <w:sz w:val="24"/>
+          <w:szCs w:val="24"/>
+        </w:rPr>
+      </w:pPr>
+    </w:p>
+    <w:p>
+      <w:pPr>
+        <w:spacing w:after="0" w:line="240" w:lineRule="auto"/>
+        <w:jc w:val="both"/>
+        <w:rPr>
+          <w:rFonts w:ascii="Arial" w:hAnsi="Arial" w:cs="Arial"/>
+          <w:b/>
+          <w:bCs/>
+          <w:sz w:val="24"/>
+          <w:szCs w:val="24"/>
+        </w:rPr>
+      </w:pPr>
+      <w:r>
+        <w:rPr>
+          <w:rFonts w:ascii="Arial" w:hAnsi="Arial" w:cs="Arial"/>
+          <w:b/>
+          <w:bCs/>
+          <w:sz w:val="24"/>
+          <w:szCs w:val="24"/>
+        </w:rPr>
+        <w:t>Reflexión final</w:t>
+      </w:r>
+    </w:p>
+    <w:p>
+      <w:pPr>
+        <w:spacing w:after="0" w:line="240" w:lineRule="auto"/>
+        <w:jc w:val="both"/>
+        <w:rPr>
+          <w:rFonts w:ascii="Arial" w:hAnsi="Arial" w:cs="Arial"/>
+          <w:sz w:val="24"/>
+          <w:szCs w:val="24"/>
+        </w:rPr>
+      </w:pPr>
+    </w:p>
+    <w:p>
+      <w:pPr>
+        <w:spacing w:after="0" w:line="240" w:lineRule="auto"/>
+        <w:jc w:val="both"/>
+        <w:rPr>
+          <w:rFonts w:ascii="Arial" w:hAnsi="Arial" w:cs="Arial"/>
+          <w:sz w:val="24"/>
+          <w:szCs w:val="24"/>
+        </w:rPr>
+      </w:pPr>
+      <w:r>
+        <w:rPr>
+          <w:rFonts w:ascii="Arial" w:hAnsi="Arial" w:cs="Arial"/>
+          <w:sz w:val="24"/>
+          <w:szCs w:val="24"/>
+        </w:rPr>
+        <w:t xml:space="preserve">El desarrollo del proyecto </w:t>
+      </w:r>
+      <w:r>
+        <w:rPr>
+          <w:rFonts w:ascii="Arial" w:hAnsi="Arial" w:cs="Arial"/>
+          <w:b/>
+          <w:bCs/>
+          <w:sz w:val="24"/>
+          <w:szCs w:val="24"/>
+        </w:rPr>
+        <w:t>PF-07</w:t>
+      </w:r>
+      <w:r>
+        <w:rPr>
+          <w:rFonts w:ascii="Arial" w:hAnsi="Arial" w:cs="Arial"/>
+          <w:b/>
+          <w:bCs/>
+          <w:sz w:val="24"/>
+          <w:szCs w:val="24"/>
+        </w:rPr>
+        <w:t xml:space="preserve"> - </w:t>
+      </w:r>
+      <w:r>
+        <w:rPr>
+          <w:rFonts w:ascii="Arial" w:hAnsi="Arial" w:cs="Arial"/>
+          <w:b/>
+          <w:bCs/>
+          <w:sz w:val="24"/>
+          <w:szCs w:val="24"/>
+        </w:rPr>
+        <w:t>Control de Estacionamiento</w:t>
+      </w:r>
+      <w:r>
+        <w:rPr>
+          <w:rFonts w:ascii="Arial" w:hAnsi="Arial" w:cs="Arial"/>
+          <w:sz w:val="24"/>
+          <w:szCs w:val="24"/>
+        </w:rPr>
+        <w:t>, me permitió poner en práctica los conocimientos adquiridos durante el curso de Programación II. A lo largo del proceso aprendí a desarrollar una aplicación utilizando Java y Spring Boot, organizar el código mediante una arquitectura por capas y conectar el sistema con una base de datos PostgreSQL.</w:t>
+      </w:r>
+    </w:p>
+    <w:p>
+      <w:pPr>
+        <w:spacing w:after="0" w:line="240" w:lineRule="auto"/>
+        <w:jc w:val="both"/>
+        <w:rPr>
+          <w:rFonts w:ascii="Arial" w:hAnsi="Arial" w:cs="Arial"/>
+          <w:sz w:val="24"/>
+          <w:szCs w:val="24"/>
+        </w:rPr>
+      </w:pPr>
+    </w:p>
+    <w:p>
+      <w:pPr>
+        <w:spacing w:after="0" w:line="240" w:lineRule="auto"/>
+        <w:jc w:val="both"/>
+        <w:rPr>
+          <w:rFonts w:ascii="Arial" w:hAnsi="Arial" w:cs="Arial"/>
+          <w:sz w:val="24"/>
+          <w:szCs w:val="24"/>
+        </w:rPr>
+      </w:pPr>
+      <w:r>
+        <w:rPr>
+          <w:rFonts w:ascii="Arial" w:hAnsi="Arial" w:cs="Arial"/>
+          <w:sz w:val="24"/>
+          <w:szCs w:val="24"/>
+        </w:rPr>
+        <w:t>Uno de los aprendizajes más importantes fue comprender cómo se relacionan las entidades Espacio y Ticket, y cómo esa relación permite controlar el ingreso y salida de vehículos. También pude reforzar el uso de DTO, las validaciones, las excepciones personalizadas y el manejo de respuestas HTTP para controlar los errores y las operaciones del sistema.</w:t>
+      </w:r>
+    </w:p>
+    <w:p>
+      <w:pPr>
+        <w:spacing w:after="0" w:line="240" w:lineRule="auto"/>
+        <w:jc w:val="both"/>
+        <w:rPr>
+          <w:rFonts w:ascii="Arial" w:hAnsi="Arial" w:cs="Arial"/>
+          <w:sz w:val="24"/>
+          <w:szCs w:val="24"/>
+        </w:rPr>
+      </w:pPr>
+    </w:p>
+    <w:p>
+      <w:pPr>
+        <w:spacing w:after="0" w:line="240" w:lineRule="auto"/>
+        <w:jc w:val="both"/>
+        <w:rPr>
+          <w:rFonts w:ascii="Arial" w:hAnsi="Arial" w:cs="Arial"/>
+          <w:sz w:val="24"/>
+          <w:szCs w:val="24"/>
+        </w:rPr>
+      </w:pPr>
+      <w:r>
+        <w:rPr>
+          <w:rFonts w:ascii="Arial" w:hAnsi="Arial" w:cs="Arial"/>
+          <w:sz w:val="24"/>
+          <w:szCs w:val="24"/>
+        </w:rPr>
+        <w:t>La integración del frontend con el backend fue otro reto</w:t>
+      </w:r>
+      <w:r>
+        <w:rPr>
+          <w:rFonts w:ascii="Arial" w:hAnsi="Arial" w:cs="Arial"/>
+          <w:sz w:val="24"/>
+          <w:szCs w:val="24"/>
+        </w:rPr>
+        <w:t xml:space="preserve"> muy</w:t>
+      </w:r>
+      <w:r>
+        <w:rPr>
+          <w:rFonts w:ascii="Arial" w:hAnsi="Arial" w:cs="Arial"/>
+          <w:sz w:val="24"/>
+          <w:szCs w:val="24"/>
+        </w:rPr>
+        <w:t xml:space="preserve"> importante, ya que me permitió comprobar cómo una interfaz HTML, CSS y JavaScript puede comunicarse con los servicios REST para registrar vehículos, finalizar tickets, actualizar los espacios disponibles y mostrar los indicadores del estacionamiento.</w:t>
+      </w:r>
+    </w:p>
+    <w:p>
+      <w:pPr>
+        <w:spacing w:after="0" w:line="240" w:lineRule="auto"/>
+        <w:jc w:val="both"/>
+        <w:rPr>
+          <w:rFonts w:ascii="Arial" w:hAnsi="Arial" w:cs="Arial"/>
+          <w:sz w:val="24"/>
+          <w:szCs w:val="24"/>
+        </w:rPr>
+      </w:pPr>
+    </w:p>
+    <w:p>
+      <w:pPr>
+        <w:spacing w:after="0" w:line="240" w:lineRule="auto"/>
+        <w:jc w:val="both"/>
+        <w:rPr>
+          <w:rFonts w:ascii="Arial" w:hAnsi="Arial" w:cs="Arial"/>
+          <w:sz w:val="24"/>
+          <w:szCs w:val="24"/>
+        </w:rPr>
+      </w:pPr>
+      <w:r>
+        <w:rPr>
+          <w:rFonts w:ascii="Arial" w:hAnsi="Arial" w:cs="Arial"/>
+          <w:sz w:val="24"/>
+          <w:szCs w:val="24"/>
+        </w:rPr>
+        <w:t>Durante el desarrollo también enfrenté errores que tuve que analizar y corregir, lo que me ayudó a comprender mejor el funcionamiento del código y la importancia de realizar pruebas con Postman y verificar los resultados en la base de datos.</w:t>
+      </w:r>
+    </w:p>
+    <w:p>
+      <w:pPr>
+        <w:spacing w:after="0" w:line="240" w:lineRule="auto"/>
+        <w:jc w:val="both"/>
+        <w:rPr>
+          <w:rFonts w:ascii="Arial" w:hAnsi="Arial" w:cs="Arial"/>
+          <w:sz w:val="24"/>
+          <w:szCs w:val="24"/>
+        </w:rPr>
+      </w:pPr>
+    </w:p>
+    <w:p>
+      <w:pPr>
+        <w:spacing w:after="0" w:line="240" w:lineRule="auto"/>
+        <w:jc w:val="both"/>
+        <w:rPr>
+          <w:rFonts w:ascii="Arial" w:hAnsi="Arial" w:cs="Arial"/>
+          <w:sz w:val="24"/>
+          <w:szCs w:val="24"/>
+        </w:rPr>
+      </w:pPr>
+      <w:r>
+        <w:rPr>
+          <w:rFonts w:ascii="Arial" w:hAnsi="Arial" w:cs="Arial"/>
+          <w:sz w:val="24"/>
+          <w:szCs w:val="24"/>
+        </w:rPr>
+        <w:t>Finalmente, considero que este proyecto fue una experiencia de aprendizaje importante porque me permitió integrar diferentes herramientas y conocimientos en una aplicación funcional. Reconozco que todavía tengo aspectos por</w:t>
+      </w:r>
+      <w:r>
+        <w:rPr>
+          <w:rFonts w:ascii="Arial" w:hAnsi="Arial" w:cs="Arial"/>
+          <w:sz w:val="24"/>
+          <w:szCs w:val="24"/>
+        </w:rPr>
+        <w:t xml:space="preserve"> aprender y</w:t>
+      </w:r>
+      <w:r>
+        <w:rPr>
+          <w:rFonts w:ascii="Arial" w:hAnsi="Arial" w:cs="Arial"/>
+          <w:sz w:val="24"/>
+          <w:szCs w:val="24"/>
+        </w:rPr>
+        <w:t xml:space="preserve"> mejorar, pero ahora comprendo mejor cómo se estructura y desarrolla un proyecto de software desde el backend hasta la interfaz que utiliza el usuario.</w:t>
       </w:r>
     </w:p>
     <w:sectPr>

</xml_diff>